<commit_message>
logboek h en onderzoek h aan gewerkt
</commit_message>
<xml_diff>
--- a/Documentatie/Verslagen/onderzoek hannah.docx
+++ b/Documentatie/Verslagen/onderzoek hannah.docx
@@ -170,11 +170,12 @@
                               <w:txbxContent>
                                 <w:p>
                                   <w:pPr>
-                                    <w:pStyle w:val="Geenafstand"/>
+                                    <w:pStyle w:val="NoSpacing"/>
                                     <w:rPr>
                                       <w:color w:val="FFFFFF" w:themeColor="background1"/>
                                       <w:sz w:val="96"/>
                                       <w:szCs w:val="96"/>
+                                      <w:lang w:val="en-GB"/>
                                     </w:rPr>
                                   </w:pPr>
                                   <w:r>
@@ -182,6 +183,7 @@
                                       <w:color w:val="FFFFFF" w:themeColor="background1"/>
                                       <w:sz w:val="96"/>
                                       <w:szCs w:val="96"/>
+                                      <w:lang w:val="en-GB"/>
                                     </w:rPr>
                                     <w:t>Project 7/8</w:t>
                                   </w:r>
@@ -241,7 +243,7 @@
                               <w:txbxContent>
                                 <w:p>
                                   <w:pPr>
-                                    <w:pStyle w:val="Geenafstand"/>
+                                    <w:pStyle w:val="NoSpacing"/>
                                     <w:spacing w:line="276" w:lineRule="auto"/>
                                     <w:rPr>
                                       <w:b/>
@@ -249,6 +251,7 @@
                                       <w:color w:val="FFFFFF" w:themeColor="background1"/>
                                       <w:sz w:val="24"/>
                                       <w:szCs w:val="24"/>
+                                      <w:lang w:val="en-GB"/>
                                     </w:rPr>
                                   </w:pPr>
                                   <w:r>
@@ -258,13 +261,25 @@
                                       <w:color w:val="FFFFFF" w:themeColor="background1"/>
                                       <w:sz w:val="24"/>
                                       <w:szCs w:val="24"/>
+                                      <w:lang w:val="en-GB"/>
                                     </w:rPr>
-                                    <w:t>Merel van der Leeden (1103194)</w:t>
+                                    <w:t>Hannah Saunders</w:t>
+                                  </w:r>
+                                  <w:r>
+                                    <w:rPr>
+                                      <w:b/>
+                                      <w:bCs/>
+                                      <w:color w:val="FFFFFF" w:themeColor="background1"/>
+                                      <w:sz w:val="24"/>
+                                      <w:szCs w:val="24"/>
+                                      <w:lang w:val="en-GB"/>
+                                    </w:rPr>
+                                    <w:t xml:space="preserve"> (1093894)</w:t>
                                   </w:r>
                                 </w:p>
                                 <w:p>
                                   <w:pPr>
-                                    <w:pStyle w:val="Geenafstand"/>
+                                    <w:pStyle w:val="NoSpacing"/>
                                     <w:spacing w:line="276" w:lineRule="auto"/>
                                     <w:rPr>
                                       <w:b/>
@@ -272,6 +287,7 @@
                                       <w:color w:val="FFFFFF" w:themeColor="background1"/>
                                       <w:sz w:val="24"/>
                                       <w:szCs w:val="24"/>
+                                      <w:lang w:val="en-GB"/>
                                     </w:rPr>
                                   </w:pPr>
                                   <w:r>
@@ -281,8 +297,31 @@
                                       <w:color w:val="FFFFFF" w:themeColor="background1"/>
                                       <w:sz w:val="24"/>
                                       <w:szCs w:val="24"/>
+                                      <w:lang w:val="en-GB"/>
                                     </w:rPr>
-                                    <w:t xml:space="preserve">Hannah </w:t>
+                                    <w:t xml:space="preserve">RDW </w:t>
+                                  </w:r>
+                                  <w:r>
+                                    <w:rPr>
+                                      <w:b/>
+                                      <w:bCs/>
+                                      <w:color w:val="FFFFFF" w:themeColor="background1"/>
+                                      <w:sz w:val="24"/>
+                                      <w:szCs w:val="24"/>
+                                      <w:lang w:val="en-GB"/>
+                                    </w:rPr>
+                                    <w:t>test centrum</w:t>
+                                  </w:r>
+                                  <w:r>
+                                    <w:rPr>
+                                      <w:b/>
+                                      <w:bCs/>
+                                      <w:color w:val="FFFFFF" w:themeColor="background1"/>
+                                      <w:sz w:val="24"/>
+                                      <w:szCs w:val="24"/>
+                                      <w:lang w:val="en-GB"/>
+                                    </w:rPr>
+                                    <w:t xml:space="preserve"> </w:t>
                                   </w:r>
                                   <w:proofErr w:type="spellStart"/>
                                   <w:r>
@@ -292,14 +331,37 @@
                                       <w:color w:val="FFFFFF" w:themeColor="background1"/>
                                       <w:sz w:val="24"/>
                                       <w:szCs w:val="24"/>
+                                      <w:lang w:val="en-GB"/>
                                     </w:rPr>
-                                    <w:t>Saunders</w:t>
+                                    <w:t>Lelys</w:t>
+                                  </w:r>
+                                  <w:r>
+                                    <w:rPr>
+                                      <w:b/>
+                                      <w:bCs/>
+                                      <w:color w:val="FFFFFF" w:themeColor="background1"/>
+                                      <w:sz w:val="24"/>
+                                      <w:szCs w:val="24"/>
+                                      <w:lang w:val="en-GB"/>
+                                    </w:rPr>
+                                    <w:t>t</w:t>
+                                  </w:r>
+                                  <w:r>
+                                    <w:rPr>
+                                      <w:b/>
+                                      <w:bCs/>
+                                      <w:color w:val="FFFFFF" w:themeColor="background1"/>
+                                      <w:sz w:val="24"/>
+                                      <w:szCs w:val="24"/>
+                                      <w:lang w:val="en-GB"/>
+                                    </w:rPr>
+                                    <w:t>ad</w:t>
                                   </w:r>
                                   <w:proofErr w:type="spellEnd"/>
                                 </w:p>
                                 <w:p>
                                   <w:pPr>
-                                    <w:pStyle w:val="Geenafstand"/>
+                                    <w:pStyle w:val="NoSpacing"/>
                                     <w:spacing w:line="276" w:lineRule="auto"/>
                                     <w:rPr>
                                       <w:b/>
@@ -307,6 +369,7 @@
                                       <w:color w:val="FFFFFF" w:themeColor="background1"/>
                                       <w:sz w:val="24"/>
                                       <w:szCs w:val="24"/>
+                                      <w:lang w:val="en-GB"/>
                                     </w:rPr>
                                   </w:pPr>
                                   <w:r>
@@ -316,13 +379,51 @@
                                       <w:color w:val="FFFFFF" w:themeColor="background1"/>
                                       <w:sz w:val="24"/>
                                       <w:szCs w:val="24"/>
+                                      <w:lang w:val="en-GB"/>
                                     </w:rPr>
-                                    <w:t>Corné Noorlander</w:t>
+                                    <w:t xml:space="preserve">Sandra </w:t>
                                   </w:r>
+                                  <w:proofErr w:type="spellStart"/>
+                                  <w:r>
+                                    <w:rPr>
+                                      <w:b/>
+                                      <w:bCs/>
+                                      <w:color w:val="FFFFFF" w:themeColor="background1"/>
+                                      <w:sz w:val="24"/>
+                                      <w:szCs w:val="24"/>
+                                      <w:lang w:val="en-GB"/>
+                                    </w:rPr>
+                                    <w:t>Hekkelman</w:t>
+                                  </w:r>
+                                  <w:proofErr w:type="spellEnd"/>
+                                  <w:r>
+                                    <w:rPr>
+                                      <w:b/>
+                                      <w:bCs/>
+                                      <w:color w:val="FFFFFF" w:themeColor="background1"/>
+                                      <w:sz w:val="24"/>
+                                      <w:szCs w:val="24"/>
+                                      <w:lang w:val="en-GB"/>
+                                    </w:rPr>
+                                    <w:t xml:space="preserve"> &amp; Wouter </w:t>
+                                  </w:r>
+                                  <w:proofErr w:type="spellStart"/>
+                                  <w:r>
+                                    <w:rPr>
+                                      <w:b/>
+                                      <w:bCs/>
+                                      <w:color w:val="FFFFFF" w:themeColor="background1"/>
+                                      <w:sz w:val="24"/>
+                                      <w:szCs w:val="24"/>
+                                      <w:lang w:val="en-GB"/>
+                                    </w:rPr>
+                                    <w:t>Volders</w:t>
+                                  </w:r>
+                                  <w:proofErr w:type="spellEnd"/>
                                 </w:p>
                                 <w:p>
                                   <w:pPr>
-                                    <w:pStyle w:val="Geenafstand"/>
+                                    <w:pStyle w:val="NoSpacing"/>
                                     <w:spacing w:line="276" w:lineRule="auto"/>
                                     <w:rPr>
                                       <w:b/>
@@ -330,6 +431,7 @@
                                       <w:color w:val="FFFFFF" w:themeColor="background1"/>
                                       <w:sz w:val="24"/>
                                       <w:szCs w:val="24"/>
+                                      <w:lang w:val="en-GB"/>
                                     </w:rPr>
                                   </w:pPr>
                                   <w:r>
@@ -339,13 +441,47 @@
                                       <w:color w:val="FFFFFF" w:themeColor="background1"/>
                                       <w:sz w:val="24"/>
                                       <w:szCs w:val="24"/>
+                                      <w:lang w:val="en-GB"/>
                                     </w:rPr>
-                                    <w:t>Fabio Wolthuis</w:t>
+                                    <w:t>08</w:t>
+                                  </w:r>
+                                  <w:r>
+                                    <w:rPr>
+                                      <w:b/>
+                                      <w:bCs/>
+                                      <w:color w:val="FFFFFF" w:themeColor="background1"/>
+                                      <w:sz w:val="24"/>
+                                      <w:szCs w:val="24"/>
+                                      <w:lang w:val="en-GB"/>
+                                    </w:rPr>
+                                    <w:t>/0</w:t>
+                                  </w:r>
+                                  <w:r>
+                                    <w:rPr>
+                                      <w:b/>
+                                      <w:bCs/>
+                                      <w:color w:val="FFFFFF" w:themeColor="background1"/>
+                                      <w:sz w:val="24"/>
+                                      <w:szCs w:val="24"/>
+                                      <w:lang w:val="en-GB"/>
+                                    </w:rPr>
+                                    <w:t>6</w:t>
+                                  </w:r>
+                                  <w:r>
+                                    <w:rPr>
+                                      <w:b/>
+                                      <w:bCs/>
+                                      <w:color w:val="FFFFFF" w:themeColor="background1"/>
+                                      <w:sz w:val="24"/>
+                                      <w:szCs w:val="24"/>
+                                      <w:lang w:val="en-GB"/>
+                                    </w:rPr>
+                                    <w:t>/2026</w:t>
                                   </w:r>
                                 </w:p>
                                 <w:p>
                                   <w:pPr>
-                                    <w:pStyle w:val="Geenafstand"/>
+                                    <w:pStyle w:val="NoSpacing"/>
                                     <w:spacing w:line="276" w:lineRule="auto"/>
                                     <w:rPr>
                                       <w:b/>
@@ -353,8 +489,10 @@
                                       <w:color w:val="FFFFFF" w:themeColor="background1"/>
                                       <w:sz w:val="24"/>
                                       <w:szCs w:val="24"/>
+                                      <w:lang w:val="en-GB"/>
                                     </w:rPr>
                                   </w:pPr>
+                                  <w:proofErr w:type="spellStart"/>
                                   <w:r>
                                     <w:rPr>
                                       <w:b/>
@@ -362,22 +500,11 @@
                                       <w:color w:val="FFFFFF" w:themeColor="background1"/>
                                       <w:sz w:val="24"/>
                                       <w:szCs w:val="24"/>
+                                      <w:lang w:val="en-GB"/>
                                     </w:rPr>
-                                    <w:t>Tom Heijmans</w:t>
+                                    <w:t>Eerste</w:t>
                                   </w:r>
-                                </w:p>
-                                <w:p>
-                                  <w:pPr>
-                                    <w:pStyle w:val="Geenafstand"/>
-                                    <w:spacing w:line="276" w:lineRule="auto"/>
-                                    <w:rPr>
-                                      <w:b/>
-                                      <w:bCs/>
-                                      <w:color w:val="FFFFFF" w:themeColor="background1"/>
-                                      <w:sz w:val="24"/>
-                                      <w:szCs w:val="24"/>
-                                    </w:rPr>
-                                  </w:pPr>
+                                  <w:proofErr w:type="spellEnd"/>
                                   <w:r>
                                     <w:rPr>
                                       <w:b/>
@@ -385,22 +512,11 @@
                                       <w:color w:val="FFFFFF" w:themeColor="background1"/>
                                       <w:sz w:val="24"/>
                                       <w:szCs w:val="24"/>
+                                      <w:lang w:val="en-GB"/>
                                     </w:rPr>
-                                    <w:t>RDW test centrum Lelystand</w:t>
+                                    <w:t xml:space="preserve"> </w:t>
                                   </w:r>
-                                </w:p>
-                                <w:p>
-                                  <w:pPr>
-                                    <w:pStyle w:val="Geenafstand"/>
-                                    <w:spacing w:line="276" w:lineRule="auto"/>
-                                    <w:rPr>
-                                      <w:b/>
-                                      <w:bCs/>
-                                      <w:color w:val="FFFFFF" w:themeColor="background1"/>
-                                      <w:sz w:val="24"/>
-                                      <w:szCs w:val="24"/>
-                                    </w:rPr>
-                                  </w:pPr>
+                                  <w:proofErr w:type="spellStart"/>
                                   <w:r>
                                     <w:rPr>
                                       <w:b/>
@@ -408,9 +524,11 @@
                                       <w:color w:val="FFFFFF" w:themeColor="background1"/>
                                       <w:sz w:val="24"/>
                                       <w:szCs w:val="24"/>
+                                      <w:lang w:val="en-GB"/>
                                     </w:rPr>
-                                    <w:t>13/02/2026</w:t>
+                                    <w:t>gelegenheid</w:t>
                                   </w:r>
+                                  <w:proofErr w:type="spellEnd"/>
                                 </w:p>
                               </w:txbxContent>
                             </wps:txbx>
@@ -444,11 +562,12 @@
                         <w:txbxContent>
                           <w:p>
                             <w:pPr>
-                              <w:pStyle w:val="Geenafstand"/>
+                              <w:pStyle w:val="NoSpacing"/>
                               <w:rPr>
                                 <w:color w:val="FFFFFF" w:themeColor="background1"/>
                                 <w:sz w:val="96"/>
                                 <w:szCs w:val="96"/>
+                                <w:lang w:val="en-GB"/>
                               </w:rPr>
                             </w:pPr>
                             <w:r>
@@ -456,6 +575,7 @@
                                 <w:color w:val="FFFFFF" w:themeColor="background1"/>
                                 <w:sz w:val="96"/>
                                 <w:szCs w:val="96"/>
+                                <w:lang w:val="en-GB"/>
                               </w:rPr>
                               <w:t>Project 7/8</w:t>
                             </w:r>
@@ -470,7 +590,7 @@
                         <w:txbxContent>
                           <w:p>
                             <w:pPr>
-                              <w:pStyle w:val="Geenafstand"/>
+                              <w:pStyle w:val="NoSpacing"/>
                               <w:spacing w:line="276" w:lineRule="auto"/>
                               <w:rPr>
                                 <w:b/>
@@ -478,6 +598,7 @@
                                 <w:color w:val="FFFFFF" w:themeColor="background1"/>
                                 <w:sz w:val="24"/>
                                 <w:szCs w:val="24"/>
+                                <w:lang w:val="en-GB"/>
                               </w:rPr>
                             </w:pPr>
                             <w:r>
@@ -487,13 +608,25 @@
                                 <w:color w:val="FFFFFF" w:themeColor="background1"/>
                                 <w:sz w:val="24"/>
                                 <w:szCs w:val="24"/>
+                                <w:lang w:val="en-GB"/>
                               </w:rPr>
-                              <w:t>Merel van der Leeden (1103194)</w:t>
+                              <w:t>Hannah Saunders</w:t>
+                            </w:r>
+                            <w:r>
+                              <w:rPr>
+                                <w:b/>
+                                <w:bCs/>
+                                <w:color w:val="FFFFFF" w:themeColor="background1"/>
+                                <w:sz w:val="24"/>
+                                <w:szCs w:val="24"/>
+                                <w:lang w:val="en-GB"/>
+                              </w:rPr>
+                              <w:t xml:space="preserve"> (1093894)</w:t>
                             </w:r>
                           </w:p>
                           <w:p>
                             <w:pPr>
-                              <w:pStyle w:val="Geenafstand"/>
+                              <w:pStyle w:val="NoSpacing"/>
                               <w:spacing w:line="276" w:lineRule="auto"/>
                               <w:rPr>
                                 <w:b/>
@@ -501,6 +634,7 @@
                                 <w:color w:val="FFFFFF" w:themeColor="background1"/>
                                 <w:sz w:val="24"/>
                                 <w:szCs w:val="24"/>
+                                <w:lang w:val="en-GB"/>
                               </w:rPr>
                             </w:pPr>
                             <w:r>
@@ -510,8 +644,31 @@
                                 <w:color w:val="FFFFFF" w:themeColor="background1"/>
                                 <w:sz w:val="24"/>
                                 <w:szCs w:val="24"/>
+                                <w:lang w:val="en-GB"/>
                               </w:rPr>
-                              <w:t xml:space="preserve">Hannah </w:t>
+                              <w:t xml:space="preserve">RDW </w:t>
+                            </w:r>
+                            <w:r>
+                              <w:rPr>
+                                <w:b/>
+                                <w:bCs/>
+                                <w:color w:val="FFFFFF" w:themeColor="background1"/>
+                                <w:sz w:val="24"/>
+                                <w:szCs w:val="24"/>
+                                <w:lang w:val="en-GB"/>
+                              </w:rPr>
+                              <w:t>test centrum</w:t>
+                            </w:r>
+                            <w:r>
+                              <w:rPr>
+                                <w:b/>
+                                <w:bCs/>
+                                <w:color w:val="FFFFFF" w:themeColor="background1"/>
+                                <w:sz w:val="24"/>
+                                <w:szCs w:val="24"/>
+                                <w:lang w:val="en-GB"/>
+                              </w:rPr>
+                              <w:t xml:space="preserve"> </w:t>
                             </w:r>
                             <w:proofErr w:type="spellStart"/>
                             <w:r>
@@ -521,14 +678,37 @@
                                 <w:color w:val="FFFFFF" w:themeColor="background1"/>
                                 <w:sz w:val="24"/>
                                 <w:szCs w:val="24"/>
+                                <w:lang w:val="en-GB"/>
                               </w:rPr>
-                              <w:t>Saunders</w:t>
+                              <w:t>Lelys</w:t>
+                            </w:r>
+                            <w:r>
+                              <w:rPr>
+                                <w:b/>
+                                <w:bCs/>
+                                <w:color w:val="FFFFFF" w:themeColor="background1"/>
+                                <w:sz w:val="24"/>
+                                <w:szCs w:val="24"/>
+                                <w:lang w:val="en-GB"/>
+                              </w:rPr>
+                              <w:t>t</w:t>
+                            </w:r>
+                            <w:r>
+                              <w:rPr>
+                                <w:b/>
+                                <w:bCs/>
+                                <w:color w:val="FFFFFF" w:themeColor="background1"/>
+                                <w:sz w:val="24"/>
+                                <w:szCs w:val="24"/>
+                                <w:lang w:val="en-GB"/>
+                              </w:rPr>
+                              <w:t>ad</w:t>
                             </w:r>
                             <w:proofErr w:type="spellEnd"/>
                           </w:p>
                           <w:p>
                             <w:pPr>
-                              <w:pStyle w:val="Geenafstand"/>
+                              <w:pStyle w:val="NoSpacing"/>
                               <w:spacing w:line="276" w:lineRule="auto"/>
                               <w:rPr>
                                 <w:b/>
@@ -536,6 +716,7 @@
                                 <w:color w:val="FFFFFF" w:themeColor="background1"/>
                                 <w:sz w:val="24"/>
                                 <w:szCs w:val="24"/>
+                                <w:lang w:val="en-GB"/>
                               </w:rPr>
                             </w:pPr>
                             <w:r>
@@ -545,13 +726,51 @@
                                 <w:color w:val="FFFFFF" w:themeColor="background1"/>
                                 <w:sz w:val="24"/>
                                 <w:szCs w:val="24"/>
+                                <w:lang w:val="en-GB"/>
                               </w:rPr>
-                              <w:t>Corné Noorlander</w:t>
+                              <w:t xml:space="preserve">Sandra </w:t>
                             </w:r>
+                            <w:proofErr w:type="spellStart"/>
+                            <w:r>
+                              <w:rPr>
+                                <w:b/>
+                                <w:bCs/>
+                                <w:color w:val="FFFFFF" w:themeColor="background1"/>
+                                <w:sz w:val="24"/>
+                                <w:szCs w:val="24"/>
+                                <w:lang w:val="en-GB"/>
+                              </w:rPr>
+                              <w:t>Hekkelman</w:t>
+                            </w:r>
+                            <w:proofErr w:type="spellEnd"/>
+                            <w:r>
+                              <w:rPr>
+                                <w:b/>
+                                <w:bCs/>
+                                <w:color w:val="FFFFFF" w:themeColor="background1"/>
+                                <w:sz w:val="24"/>
+                                <w:szCs w:val="24"/>
+                                <w:lang w:val="en-GB"/>
+                              </w:rPr>
+                              <w:t xml:space="preserve"> &amp; Wouter </w:t>
+                            </w:r>
+                            <w:proofErr w:type="spellStart"/>
+                            <w:r>
+                              <w:rPr>
+                                <w:b/>
+                                <w:bCs/>
+                                <w:color w:val="FFFFFF" w:themeColor="background1"/>
+                                <w:sz w:val="24"/>
+                                <w:szCs w:val="24"/>
+                                <w:lang w:val="en-GB"/>
+                              </w:rPr>
+                              <w:t>Volders</w:t>
+                            </w:r>
+                            <w:proofErr w:type="spellEnd"/>
                           </w:p>
                           <w:p>
                             <w:pPr>
-                              <w:pStyle w:val="Geenafstand"/>
+                              <w:pStyle w:val="NoSpacing"/>
                               <w:spacing w:line="276" w:lineRule="auto"/>
                               <w:rPr>
                                 <w:b/>
@@ -559,6 +778,7 @@
                                 <w:color w:val="FFFFFF" w:themeColor="background1"/>
                                 <w:sz w:val="24"/>
                                 <w:szCs w:val="24"/>
+                                <w:lang w:val="en-GB"/>
                               </w:rPr>
                             </w:pPr>
                             <w:r>
@@ -568,13 +788,47 @@
                                 <w:color w:val="FFFFFF" w:themeColor="background1"/>
                                 <w:sz w:val="24"/>
                                 <w:szCs w:val="24"/>
+                                <w:lang w:val="en-GB"/>
                               </w:rPr>
-                              <w:t>Fabio Wolthuis</w:t>
+                              <w:t>08</w:t>
+                            </w:r>
+                            <w:r>
+                              <w:rPr>
+                                <w:b/>
+                                <w:bCs/>
+                                <w:color w:val="FFFFFF" w:themeColor="background1"/>
+                                <w:sz w:val="24"/>
+                                <w:szCs w:val="24"/>
+                                <w:lang w:val="en-GB"/>
+                              </w:rPr>
+                              <w:t>/0</w:t>
+                            </w:r>
+                            <w:r>
+                              <w:rPr>
+                                <w:b/>
+                                <w:bCs/>
+                                <w:color w:val="FFFFFF" w:themeColor="background1"/>
+                                <w:sz w:val="24"/>
+                                <w:szCs w:val="24"/>
+                                <w:lang w:val="en-GB"/>
+                              </w:rPr>
+                              <w:t>6</w:t>
+                            </w:r>
+                            <w:r>
+                              <w:rPr>
+                                <w:b/>
+                                <w:bCs/>
+                                <w:color w:val="FFFFFF" w:themeColor="background1"/>
+                                <w:sz w:val="24"/>
+                                <w:szCs w:val="24"/>
+                                <w:lang w:val="en-GB"/>
+                              </w:rPr>
+                              <w:t>/2026</w:t>
                             </w:r>
                           </w:p>
                           <w:p>
                             <w:pPr>
-                              <w:pStyle w:val="Geenafstand"/>
+                              <w:pStyle w:val="NoSpacing"/>
                               <w:spacing w:line="276" w:lineRule="auto"/>
                               <w:rPr>
                                 <w:b/>
@@ -582,8 +836,10 @@
                                 <w:color w:val="FFFFFF" w:themeColor="background1"/>
                                 <w:sz w:val="24"/>
                                 <w:szCs w:val="24"/>
+                                <w:lang w:val="en-GB"/>
                               </w:rPr>
                             </w:pPr>
+                            <w:proofErr w:type="spellStart"/>
                             <w:r>
                               <w:rPr>
                                 <w:b/>
@@ -591,22 +847,11 @@
                                 <w:color w:val="FFFFFF" w:themeColor="background1"/>
                                 <w:sz w:val="24"/>
                                 <w:szCs w:val="24"/>
+                                <w:lang w:val="en-GB"/>
                               </w:rPr>
-                              <w:t>Tom Heijmans</w:t>
+                              <w:t>Eerste</w:t>
                             </w:r>
-                          </w:p>
-                          <w:p>
-                            <w:pPr>
-                              <w:pStyle w:val="Geenafstand"/>
-                              <w:spacing w:line="276" w:lineRule="auto"/>
-                              <w:rPr>
-                                <w:b/>
-                                <w:bCs/>
-                                <w:color w:val="FFFFFF" w:themeColor="background1"/>
-                                <w:sz w:val="24"/>
-                                <w:szCs w:val="24"/>
-                              </w:rPr>
-                            </w:pPr>
+                            <w:proofErr w:type="spellEnd"/>
                             <w:r>
                               <w:rPr>
                                 <w:b/>
@@ -614,22 +859,11 @@
                                 <w:color w:val="FFFFFF" w:themeColor="background1"/>
                                 <w:sz w:val="24"/>
                                 <w:szCs w:val="24"/>
+                                <w:lang w:val="en-GB"/>
                               </w:rPr>
-                              <w:t>RDW test centrum Lelystand</w:t>
+                              <w:t xml:space="preserve"> </w:t>
                             </w:r>
-                          </w:p>
-                          <w:p>
-                            <w:pPr>
-                              <w:pStyle w:val="Geenafstand"/>
-                              <w:spacing w:line="276" w:lineRule="auto"/>
-                              <w:rPr>
-                                <w:b/>
-                                <w:bCs/>
-                                <w:color w:val="FFFFFF" w:themeColor="background1"/>
-                                <w:sz w:val="24"/>
-                                <w:szCs w:val="24"/>
-                              </w:rPr>
-                            </w:pPr>
+                            <w:proofErr w:type="spellStart"/>
                             <w:r>
                               <w:rPr>
                                 <w:b/>
@@ -637,9 +871,11 @@
                                 <w:color w:val="FFFFFF" w:themeColor="background1"/>
                                 <w:sz w:val="24"/>
                                 <w:szCs w:val="24"/>
+                                <w:lang w:val="en-GB"/>
                               </w:rPr>
-                              <w:t>13/02/2026</w:t>
+                              <w:t>gelegenheid</w:t>
                             </w:r>
+                            <w:proofErr w:type="spellEnd"/>
                           </w:p>
                         </w:txbxContent>
                       </v:textbox>
@@ -704,12 +940,13 @@
                             <w:txbxContent>
                               <w:p>
                                 <w:pPr>
-                                  <w:pStyle w:val="Geenafstand"/>
+                                  <w:pStyle w:val="NoSpacing"/>
                                   <w:jc w:val="right"/>
                                   <w:rPr>
                                     <w:color w:val="FFFFFF" w:themeColor="background1"/>
                                     <w:sz w:val="72"/>
                                     <w:szCs w:val="72"/>
+                                    <w:lang w:val="en-GB"/>
                                   </w:rPr>
                                 </w:pPr>
                                 <w:r>
@@ -717,6 +954,7 @@
                                     <w:color w:val="FFFFFF" w:themeColor="background1"/>
                                     <w:sz w:val="72"/>
                                     <w:szCs w:val="72"/>
+                                    <w:lang w:val="en-GB"/>
                                   </w:rPr>
                                   <w:t>-</w:t>
                                 </w:r>
@@ -745,12 +983,13 @@
                       <w:txbxContent>
                         <w:p>
                           <w:pPr>
-                            <w:pStyle w:val="Geenafstand"/>
+                            <w:pStyle w:val="NoSpacing"/>
                             <w:jc w:val="right"/>
                             <w:rPr>
                               <w:color w:val="FFFFFF" w:themeColor="background1"/>
                               <w:sz w:val="72"/>
                               <w:szCs w:val="72"/>
+                              <w:lang w:val="en-GB"/>
                             </w:rPr>
                           </w:pPr>
                           <w:r>
@@ -758,6 +997,7 @@
                               <w:color w:val="FFFFFF" w:themeColor="background1"/>
                               <w:sz w:val="72"/>
                               <w:szCs w:val="72"/>
+                              <w:lang w:val="en-GB"/>
                             </w:rPr>
                             <w:t>-</w:t>
                           </w:r>
@@ -777,15 +1017,731 @@
       </w:sdtContent>
     </w:sdt>
     <w:bookmarkEnd w:id="0"/>
-    <w:p/>
+    <w:p>
+      <w:pPr>
+        <w:pStyle w:val="Heading1"/>
+        <w:rPr>
+          <w:lang w:val="nl-NL"/>
+        </w:rPr>
+      </w:pPr>
+      <w:proofErr w:type="spellStart"/>
+      <w:r>
+        <w:rPr>
+          <w:lang w:val="nl-NL"/>
+        </w:rPr>
+        <w:lastRenderedPageBreak/>
+        <w:t>Summery</w:t>
+      </w:r>
+      <w:proofErr w:type="spellEnd"/>
+    </w:p>
+    <w:p>
+      <w:r>
+        <w:t xml:space="preserve">• Brief description of the research questions, method and results. </w:t>
+      </w:r>
+    </w:p>
+    <w:p>
+      <w:r>
+        <w:t>• Very briefly state the main conclusion(s) of your report.</w:t>
+      </w:r>
+    </w:p>
+    <w:p>
+      <w:pPr>
+        <w:pStyle w:val="Heading1"/>
+      </w:pPr>
+      <w:r>
+        <w:t>Introduction</w:t>
+      </w:r>
+    </w:p>
+    <w:p>
+      <w:r>
+        <w:t>Introduction</w:t>
+      </w:r>
+      <w:r>
+        <w:br/>
+        <w:t>• Reason for your assignment/research. Also describe the parties involved. Who are the authors of this piece, and what were the motivations for writing it?</w:t>
+      </w:r>
+      <w:r>
+        <w:br/>
+        <w:t>• Problem statement.</w:t>
+      </w:r>
+      <w:r>
+        <w:br/>
+        <w:t>o What exactly does the problem involve? (based on the description of the current situation; causes/consequences)</w:t>
+      </w:r>
+      <w:r>
+        <w:br/>
+        <w:t>• Importance.</w:t>
+      </w:r>
+      <w:r>
+        <w:br/>
+        <w:t>o Who is affected (target group)?</w:t>
+      </w:r>
+      <w:r>
+        <w:br/>
+        <w:t>o How large is the target group?</w:t>
+      </w:r>
+      <w:r>
+        <w:br/>
+        <w:t>o Why does this need to be resolved now?</w:t>
+      </w:r>
+      <w:r>
+        <w:br/>
+        <w:t>o Information on the above points must be explicitly linked to your research</w:t>
+      </w:r>
+      <w:r>
+        <w:br/>
+        <w:t>• Aim of the research.</w:t>
+      </w:r>
+      <w:r>
+        <w:br/>
+        <w:t>o What is the desired situation? (possible solutions, not yet a ready-made product)</w:t>
+      </w:r>
+      <w:r>
+        <w:br/>
+        <w:t>o How can I reach the desired situation?</w:t>
+      </w:r>
+      <w:r>
+        <w:br/>
+        <w:t>• Refined assignment description (research question and sub-questions)</w:t>
+      </w:r>
+      <w:r>
+        <w:br/>
+        <w:t>o Logically follows from the problem statement</w:t>
+      </w:r>
+      <w:r>
+        <w:t>.</w:t>
+      </w:r>
+      <w:r>
+        <w:br/>
+      </w:r>
+      <w:proofErr w:type="spellStart"/>
+      <w:r>
+        <w:t>o</w:t>
+      </w:r>
+      <w:proofErr w:type="spellEnd"/>
+      <w:r>
+        <w:t xml:space="preserve"> Formulate a main question and sub-questions. The sub-questions together form the answer to the main question</w:t>
+      </w:r>
+    </w:p>
+    <w:p>
+      <w:pPr>
+        <w:rPr>
+          <w:rFonts w:asciiTheme="majorHAnsi" w:eastAsiaTheme="majorEastAsia" w:hAnsiTheme="majorHAnsi" w:cstheme="majorBidi"/>
+          <w:color w:val="0F4761" w:themeColor="accent1" w:themeShade="BF"/>
+          <w:sz w:val="40"/>
+          <w:szCs w:val="40"/>
+        </w:rPr>
+      </w:pPr>
+      <w:r>
+        <w:rPr>
+          <w:rFonts w:asciiTheme="majorHAnsi" w:eastAsiaTheme="majorEastAsia" w:hAnsiTheme="majorHAnsi" w:cstheme="majorBidi"/>
+          <w:color w:val="0F4761" w:themeColor="accent1" w:themeShade="BF"/>
+          <w:sz w:val="40"/>
+          <w:szCs w:val="40"/>
+        </w:rPr>
+        <w:t>Theoretical framework</w:t>
+      </w:r>
+      <w:r>
+        <w:rPr>
+          <w:rFonts w:asciiTheme="majorHAnsi" w:eastAsiaTheme="majorEastAsia" w:hAnsiTheme="majorHAnsi" w:cstheme="majorBidi"/>
+          <w:color w:val="0F4761" w:themeColor="accent1" w:themeShade="BF"/>
+          <w:sz w:val="40"/>
+          <w:szCs w:val="40"/>
+        </w:rPr>
+        <w:t xml:space="preserve"> </w:t>
+      </w:r>
+    </w:p>
+    <w:p>
+      <w:r>
+        <w:t>Theoretical framework</w:t>
+      </w:r>
+      <w:r>
+        <w:br/>
+        <w:t>• Is it a new problem or has it existed for a long time?</w:t>
+      </w:r>
+      <w:r>
+        <w:br/>
+        <w:t>• Does the problem occur in other organisations in the sector? Has a solution been found there?</w:t>
+      </w:r>
+      <w:r>
+        <w:br/>
+        <w:t>• What similar problems can you find in the literature and how have they been solved?</w:t>
+      </w:r>
+      <w:r>
+        <w:br/>
+        <w:t>• Which existing solutions are already on the market and why are they not sufficient for this problem?</w:t>
+      </w:r>
+      <w:r>
+        <w:br/>
+        <w:t>• Concept clarification; remove any confusion about terms (for example, who do you mean by ‘elderly’; what do you mean by an ‘aqua drone’)</w:t>
+      </w:r>
+      <w:r>
+        <w:br/>
+        <w:t>Note! If you choose “literature research” as a method, the Theoretical framework may be omitted, as the information will be included under Results.</w:t>
+      </w:r>
+    </w:p>
+    <w:p>
+      <w:pPr>
+        <w:pStyle w:val="Heading1"/>
+      </w:pPr>
+      <w:r>
+        <w:t>Method</w:t>
+      </w:r>
+    </w:p>
+    <w:p>
+      <w:r>
+        <w:t>Method</w:t>
+      </w:r>
+      <w:r>
+        <w:br/>
+        <w:t>• Research method; Indicate how you will answer the sub-questions (Interview, survey, observation, experiment, literature review, etc.)</w:t>
+      </w:r>
+      <w:r>
+        <w:br/>
+        <w:t>• How will you approach the research? (e.g. literature review: what type of sources; survey: which questions in the questionnaire; experiment: experiment protocol)</w:t>
+      </w:r>
+      <w:r>
+        <w:br/>
+        <w:t xml:space="preserve">• If you are going to compare multiple options to make a choice, state the requirements here </w:t>
+      </w:r>
+      <w:r>
+        <w:lastRenderedPageBreak/>
+        <w:t>(e.g. if you are researching options for power supply, indicate the power consumption here, and other requirements such as weight, cost, mobility).</w:t>
+      </w:r>
+      <w:r>
+        <w:br/>
+        <w:t>Note! Do not just name your method but elaborate on how you will approach it.</w:t>
+      </w:r>
+    </w:p>
+    <w:p>
+      <w:pPr>
+        <w:rPr>
+          <w:rFonts w:asciiTheme="majorHAnsi" w:eastAsiaTheme="majorEastAsia" w:hAnsiTheme="majorHAnsi" w:cstheme="majorBidi"/>
+          <w:color w:val="0F4761" w:themeColor="accent1" w:themeShade="BF"/>
+          <w:sz w:val="40"/>
+          <w:szCs w:val="40"/>
+        </w:rPr>
+      </w:pPr>
+      <w:r>
+        <w:rPr>
+          <w:rFonts w:asciiTheme="majorHAnsi" w:eastAsiaTheme="majorEastAsia" w:hAnsiTheme="majorHAnsi" w:cstheme="majorBidi"/>
+          <w:color w:val="0F4761" w:themeColor="accent1" w:themeShade="BF"/>
+          <w:sz w:val="40"/>
+          <w:szCs w:val="40"/>
+        </w:rPr>
+        <w:t>Results</w:t>
+      </w:r>
+      <w:r>
+        <w:rPr>
+          <w:rFonts w:asciiTheme="majorHAnsi" w:eastAsiaTheme="majorEastAsia" w:hAnsiTheme="majorHAnsi" w:cstheme="majorBidi"/>
+          <w:color w:val="0F4761" w:themeColor="accent1" w:themeShade="BF"/>
+          <w:sz w:val="40"/>
+          <w:szCs w:val="40"/>
+        </w:rPr>
+        <w:t xml:space="preserve"> </w:t>
+      </w:r>
+    </w:p>
+    <w:p>
+      <w:r>
+        <w:t>Results</w:t>
+      </w:r>
+      <w:r>
+        <w:br/>
+        <w:t>• What you have done, what came out of it, and describe this. Here you provide the raw outcomes of your research. This means you do not yet make any value judgment about it. This chapter is purely factual and descriptive.</w:t>
+      </w:r>
+      <w:r>
+        <w:br/>
+        <w:t>• Think of measurement data, graphs, survey results, information from datasheets, or other literature. Large files are added as an appendix, and all appendices are referenced in the text.</w:t>
+      </w:r>
+      <w:r>
+        <w:br/>
+        <w:t>• If you have compared multiple options to make a choice, indicate here to what extent the different options meet the requirements, preferably in a clear table or diagram.</w:t>
+      </w:r>
+    </w:p>
+    <w:p>
+      <w:pPr>
+        <w:rPr>
+          <w:rFonts w:asciiTheme="majorHAnsi" w:eastAsiaTheme="majorEastAsia" w:hAnsiTheme="majorHAnsi" w:cstheme="majorBidi"/>
+          <w:color w:val="0F4761" w:themeColor="accent1" w:themeShade="BF"/>
+          <w:sz w:val="40"/>
+          <w:szCs w:val="40"/>
+        </w:rPr>
+      </w:pPr>
+      <w:r>
+        <w:rPr>
+          <w:rFonts w:asciiTheme="majorHAnsi" w:eastAsiaTheme="majorEastAsia" w:hAnsiTheme="majorHAnsi" w:cstheme="majorBidi"/>
+          <w:color w:val="0F4761" w:themeColor="accent1" w:themeShade="BF"/>
+          <w:sz w:val="40"/>
+          <w:szCs w:val="40"/>
+        </w:rPr>
+        <w:t>Conclusion/advice</w:t>
+      </w:r>
+      <w:r>
+        <w:rPr>
+          <w:rFonts w:asciiTheme="majorHAnsi" w:eastAsiaTheme="majorEastAsia" w:hAnsiTheme="majorHAnsi" w:cstheme="majorBidi"/>
+          <w:color w:val="0F4761" w:themeColor="accent1" w:themeShade="BF"/>
+          <w:sz w:val="40"/>
+          <w:szCs w:val="40"/>
+        </w:rPr>
+        <w:t xml:space="preserve"> </w:t>
+      </w:r>
+    </w:p>
+    <w:p>
+      <w:bookmarkStart w:id="1" w:name="_Hlk224037135"/>
+      <w:r>
+        <w:t>Conclusion/advice</w:t>
+      </w:r>
+      <w:bookmarkEnd w:id="1"/>
+      <w:r>
+        <w:br/>
+        <w:t>• Start your conclusion with a brief summary and your research question.</w:t>
+      </w:r>
+      <w:r>
+        <w:br/>
+        <w:t>• Here you interpret the results and reach a judgement. Draw a conclusion for each part and of course an overall conclusion (what is the answer to your research question?)</w:t>
+      </w:r>
+      <w:r>
+        <w:br/>
+        <w:t>• Your conclusions are written in the form of advice.</w:t>
+      </w:r>
+    </w:p>
+    <w:p>
+      <w:pPr>
+        <w:pStyle w:val="Heading1"/>
+      </w:pPr>
+      <w:r>
+        <w:t>References</w:t>
+      </w:r>
+    </w:p>
+    <w:p>
+      <w:r>
+        <w:t>References</w:t>
+      </w:r>
+      <w:r>
+        <w:br/>
+        <w:t>• According to APA or IEEE.</w:t>
+      </w:r>
+      <w:r>
+        <w:br/>
+        <w:t>• Includes all sources you have used and cited in your report.</w:t>
+      </w:r>
+      <w:r>
+        <w:br/>
+        <w:t>• Relevant and reliable sources.</w:t>
+      </w:r>
+    </w:p>
+    <w:p>
+      <w:pPr>
+        <w:pStyle w:val="Heading1"/>
+      </w:pPr>
+      <w:r>
+        <w:t>Glossary of terms</w:t>
+      </w:r>
+      <w:r>
+        <w:t xml:space="preserve">/ </w:t>
+      </w:r>
+      <w:r>
+        <w:t>list of symbols</w:t>
+      </w:r>
+      <w:r>
+        <w:t xml:space="preserve"> (</w:t>
+      </w:r>
+      <w:r>
+        <w:t>only if functional</w:t>
+      </w:r>
+      <w:r>
+        <w:t>)</w:t>
+      </w:r>
+    </w:p>
+    <w:p>
+      <w:r>
+        <w:t xml:space="preserve">Glossary of terms/ list of symbols (only if functional) </w:t>
+      </w:r>
+    </w:p>
+    <w:p>
+      <w:r>
+        <w:t xml:space="preserve">• Specialist terms (in alphabetical order) </w:t>
+      </w:r>
+    </w:p>
+    <w:p>
+      <w:r>
+        <w:t xml:space="preserve">• Symbols if the report contains multiple symbols that are used more than once. </w:t>
+      </w:r>
+    </w:p>
+    <w:p>
+      <w:r>
+        <w:t>Note! Both specialist terms and symbols must be explained the first time they are used in the text.</w:t>
+      </w:r>
+    </w:p>
+    <w:p>
+      <w:pPr>
+        <w:pStyle w:val="Heading1"/>
+        <w:rPr>
+          <w:lang w:val="nl-NL"/>
+        </w:rPr>
+      </w:pPr>
+      <w:proofErr w:type="spellStart"/>
+      <w:r>
+        <w:rPr>
+          <w:lang w:val="nl-NL"/>
+        </w:rPr>
+        <w:t>Attachments</w:t>
+      </w:r>
+      <w:proofErr w:type="spellEnd"/>
+    </w:p>
+    <w:p>
+      <w:r>
+        <w:t xml:space="preserve">Attachments </w:t>
+      </w:r>
+    </w:p>
+    <w:p>
+      <w:r>
+        <w:t xml:space="preserve">• Attachments such as pieces of code, an advisory report, a manual, test results, etc. </w:t>
+      </w:r>
+    </w:p>
+    <w:p>
+      <w:r>
+        <w:t>Note! All attachments are referred to in the text</w:t>
+      </w:r>
+    </w:p>
     <w:sectPr>
+      <w:footerReference w:type="default" r:id="rId8"/>
       <w:pgSz w:w="11906" w:h="16838"/>
       <w:pgMar w:top="1417" w:right="1417" w:bottom="1417" w:left="1417" w:header="708" w:footer="708" w:gutter="0"/>
+      <w:pgNumType w:start="0"/>
       <w:cols w:space="708"/>
       <w:docGrid w:linePitch="360"/>
     </w:sectPr>
   </w:body>
 </w:document>
+</file>
+
+<file path=word/endnotes.xml><?xml version="1.0" encoding="utf-8"?>
+<w:endnotes xmlns:wpc="http://schemas.microsoft.com/office/word/2010/wordprocessingCanvas" xmlns:cx="http://schemas.microsoft.com/office/drawing/2014/chartex" xmlns:cx1="http://schemas.microsoft.com/office/drawing/2015/9/8/chartex" xmlns:cx2="http://schemas.microsoft.com/office/drawing/2015/10/21/chartex" xmlns:cx3="http://schemas.microsoft.com/office/drawing/2016/5/9/chartex" xmlns:cx4="http://schemas.microsoft.com/office/drawing/2016/5/10/chartex" xmlns:cx5="http://schemas.microsoft.com/office/drawing/2016/5/11/chartex" xmlns:cx6="http://schemas.microsoft.com/office/drawing/2016/5/12/chartex" xmlns:cx7="http://schemas.microsoft.com/office/drawing/2016/5/13/chartex" xmlns:cx8="http://schemas.microsoft.com/office/drawing/2016/5/14/chartex" xmlns:mc="http://schemas.openxmlformats.org/markup-compatibility/2006" xmlns:aink="http://schemas.microsoft.com/office/drawing/2016/ink" xmlns:am3d="http://schemas.microsoft.com/office/drawing/2017/model3d" xmlns:o="urn:schemas-microsoft-com:office:office" xmlns:oel="http://schemas.microsoft.com/office/2019/extlst" xmlns:r="http://schemas.openxmlformats.org/officeDocument/2006/relationships" xmlns:m="http://schemas.openxmlformats.org/officeDocument/2006/math" xmlns:v="urn:schemas-microsoft-com:vml" xmlns:wp14="http://schemas.microsoft.com/office/word/2010/wordprocessingDrawing" xmlns:wp="http://schemas.openxmlformats.org/drawingml/2006/wordprocessingDrawing" xmlns:w10="urn:schemas-microsoft-com:office:word" xmlns:w="http://schemas.openxmlformats.org/wordprocessingml/2006/main" xmlns:w14="http://schemas.microsoft.com/office/word/2010/wordml" xmlns:w15="http://schemas.microsoft.com/office/word/2012/wordml" xmlns:w16cex="http://schemas.microsoft.com/office/word/2018/wordml/cex" xmlns:w16cid="http://schemas.microsoft.com/office/word/2016/wordml/cid" xmlns:w16="http://schemas.microsoft.com/office/word/2018/wordml" xmlns:w16du="http://schemas.microsoft.com/office/word/2023/wordml/word16du" xmlns:w16sdtdh="http://schemas.microsoft.com/office/word/2020/wordml/sdtdatahash" xmlns:w16sdtfl="http://schemas.microsoft.com/office/word/2024/wordml/sdtformatlock" xmlns:w16se="http://schemas.microsoft.com/office/word/2015/wordml/symex" xmlns:wpg="http://schemas.microsoft.com/office/word/2010/wordprocessingGroup" xmlns:wpi="http://schemas.microsoft.com/office/word/2010/wordprocessingInk" xmlns:wne="http://schemas.microsoft.com/office/word/2006/wordml" xmlns:wps="http://schemas.microsoft.com/office/word/2010/wordprocessingShape" mc:Ignorable="w14 w15 w16se w16cid w16 w16cex w16sdtdh w16sdtfl w16du wp14">
+  <w:endnote w:type="separator" w:id="-1">
+    <w:p>
+      <w:pPr>
+        <w:spacing w:after="0" w:line="240" w:lineRule="auto"/>
+      </w:pPr>
+      <w:r>
+        <w:separator/>
+      </w:r>
+    </w:p>
+  </w:endnote>
+  <w:endnote w:type="continuationSeparator" w:id="0">
+    <w:p>
+      <w:pPr>
+        <w:spacing w:after="0" w:line="240" w:lineRule="auto"/>
+      </w:pPr>
+      <w:r>
+        <w:continuationSeparator/>
+      </w:r>
+    </w:p>
+  </w:endnote>
+</w:endnotes>
+</file>
+
+<file path=word/footer1.xml><?xml version="1.0" encoding="utf-8"?>
+<w:ftr xmlns:wpc="http://schemas.microsoft.com/office/word/2010/wordprocessingCanvas" xmlns:cx="http://schemas.microsoft.com/office/drawing/2014/chartex" xmlns:cx1="http://schemas.microsoft.com/office/drawing/2015/9/8/chartex" xmlns:cx2="http://schemas.microsoft.com/office/drawing/2015/10/21/chartex" xmlns:cx3="http://schemas.microsoft.com/office/drawing/2016/5/9/chartex" xmlns:cx4="http://schemas.microsoft.com/office/drawing/2016/5/10/chartex" xmlns:cx5="http://schemas.microsoft.com/office/drawing/2016/5/11/chartex" xmlns:cx6="http://schemas.microsoft.com/office/drawing/2016/5/12/chartex" xmlns:cx7="http://schemas.microsoft.com/office/drawing/2016/5/13/chartex" xmlns:cx8="http://schemas.microsoft.com/office/drawing/2016/5/14/chartex" xmlns:mc="http://schemas.openxmlformats.org/markup-compatibility/2006" xmlns:aink="http://schemas.microsoft.com/office/drawing/2016/ink" xmlns:am3d="http://schemas.microsoft.com/office/drawing/2017/model3d" xmlns:o="urn:schemas-microsoft-com:office:office" xmlns:oel="http://schemas.microsoft.com/office/2019/extlst" xmlns:r="http://schemas.openxmlformats.org/officeDocument/2006/relationships" xmlns:m="http://schemas.openxmlformats.org/officeDocument/2006/math" xmlns:v="urn:schemas-microsoft-com:vml" xmlns:wp14="http://schemas.microsoft.com/office/word/2010/wordprocessingDrawing" xmlns:wp="http://schemas.openxmlformats.org/drawingml/2006/wordprocessingDrawing" xmlns:w10="urn:schemas-microsoft-com:office:word" xmlns:w="http://schemas.openxmlformats.org/wordprocessingml/2006/main" xmlns:w14="http://schemas.microsoft.com/office/word/2010/wordml" xmlns:w15="http://schemas.microsoft.com/office/word/2012/wordml" xmlns:w16cex="http://schemas.microsoft.com/office/word/2018/wordml/cex" xmlns:w16cid="http://schemas.microsoft.com/office/word/2016/wordml/cid" xmlns:w16="http://schemas.microsoft.com/office/word/2018/wordml" xmlns:w16du="http://schemas.microsoft.com/office/word/2023/wordml/word16du" xmlns:w16sdtdh="http://schemas.microsoft.com/office/word/2020/wordml/sdtdatahash" xmlns:w16sdtfl="http://schemas.microsoft.com/office/word/2024/wordml/sdtformatlock" xmlns:w16se="http://schemas.microsoft.com/office/word/2015/wordml/symex" xmlns:wpg="http://schemas.microsoft.com/office/word/2010/wordprocessingGroup" xmlns:wpi="http://schemas.microsoft.com/office/word/2010/wordprocessingInk" xmlns:wne="http://schemas.microsoft.com/office/word/2006/wordml" xmlns:wps="http://schemas.microsoft.com/office/word/2010/wordprocessingShape" mc:Ignorable="w14 w15 w16se w16cid w16 w16cex w16sdtdh w16sdtfl w16du wp14">
+  <w:sdt>
+    <w:sdtPr>
+      <w:id w:val="-75205029"/>
+      <w:docPartObj>
+        <w:docPartGallery w:val="Page Numbers (Bottom of Page)"/>
+        <w:docPartUnique/>
+      </w:docPartObj>
+    </w:sdtPr>
+    <w:sdtContent>
+      <w:p>
+        <w:pPr>
+          <w:pStyle w:val="Footer"/>
+          <w:jc w:val="right"/>
+        </w:pPr>
+        <w:r>
+          <w:fldChar w:fldCharType="begin"/>
+        </w:r>
+        <w:r>
+          <w:instrText>PAGE   \* MERGEFORMAT</w:instrText>
+        </w:r>
+        <w:r>
+          <w:fldChar w:fldCharType="separate"/>
+        </w:r>
+        <w:r>
+          <w:t>2</w:t>
+        </w:r>
+        <w:r>
+          <w:fldChar w:fldCharType="end"/>
+        </w:r>
+      </w:p>
+    </w:sdtContent>
+  </w:sdt>
+  <w:p>
+    <w:pPr>
+      <w:pStyle w:val="Footer"/>
+    </w:pPr>
+  </w:p>
+</w:ftr>
+</file>
+
+<file path=word/footnotes.xml><?xml version="1.0" encoding="utf-8"?>
+<w:footnotes xmlns:wpc="http://schemas.microsoft.com/office/word/2010/wordprocessingCanvas" xmlns:cx="http://schemas.microsoft.com/office/drawing/2014/chartex" xmlns:cx1="http://schemas.microsoft.com/office/drawing/2015/9/8/chartex" xmlns:cx2="http://schemas.microsoft.com/office/drawing/2015/10/21/chartex" xmlns:cx3="http://schemas.microsoft.com/office/drawing/2016/5/9/chartex" xmlns:cx4="http://schemas.microsoft.com/office/drawing/2016/5/10/chartex" xmlns:cx5="http://schemas.microsoft.com/office/drawing/2016/5/11/chartex" xmlns:cx6="http://schemas.microsoft.com/office/drawing/2016/5/12/chartex" xmlns:cx7="http://schemas.microsoft.com/office/drawing/2016/5/13/chartex" xmlns:cx8="http://schemas.microsoft.com/office/drawing/2016/5/14/chartex" xmlns:mc="http://schemas.openxmlformats.org/markup-compatibility/2006" xmlns:aink="http://schemas.microsoft.com/office/drawing/2016/ink" xmlns:am3d="http://schemas.microsoft.com/office/drawing/2017/model3d" xmlns:o="urn:schemas-microsoft-com:office:office" xmlns:oel="http://schemas.microsoft.com/office/2019/extlst" xmlns:r="http://schemas.openxmlformats.org/officeDocument/2006/relationships" xmlns:m="http://schemas.openxmlformats.org/officeDocument/2006/math" xmlns:v="urn:schemas-microsoft-com:vml" xmlns:wp14="http://schemas.microsoft.com/office/word/2010/wordprocessingDrawing" xmlns:wp="http://schemas.openxmlformats.org/drawingml/2006/wordprocessingDrawing" xmlns:w10="urn:schemas-microsoft-com:office:word" xmlns:w="http://schemas.openxmlformats.org/wordprocessingml/2006/main" xmlns:w14="http://schemas.microsoft.com/office/word/2010/wordml" xmlns:w15="http://schemas.microsoft.com/office/word/2012/wordml" xmlns:w16cex="http://schemas.microsoft.com/office/word/2018/wordml/cex" xmlns:w16cid="http://schemas.microsoft.com/office/word/2016/wordml/cid" xmlns:w16="http://schemas.microsoft.com/office/word/2018/wordml" xmlns:w16du="http://schemas.microsoft.com/office/word/2023/wordml/word16du" xmlns:w16sdtdh="http://schemas.microsoft.com/office/word/2020/wordml/sdtdatahash" xmlns:w16sdtfl="http://schemas.microsoft.com/office/word/2024/wordml/sdtformatlock" xmlns:w16se="http://schemas.microsoft.com/office/word/2015/wordml/symex" xmlns:wpg="http://schemas.microsoft.com/office/word/2010/wordprocessingGroup" xmlns:wpi="http://schemas.microsoft.com/office/word/2010/wordprocessingInk" xmlns:wne="http://schemas.microsoft.com/office/word/2006/wordml" xmlns:wps="http://schemas.microsoft.com/office/word/2010/wordprocessingShape" mc:Ignorable="w14 w15 w16se w16cid w16 w16cex w16sdtdh w16sdtfl w16du wp14">
+  <w:footnote w:type="separator" w:id="-1">
+    <w:p>
+      <w:pPr>
+        <w:spacing w:after="0" w:line="240" w:lineRule="auto"/>
+      </w:pPr>
+      <w:r>
+        <w:separator/>
+      </w:r>
+    </w:p>
+  </w:footnote>
+  <w:footnote w:type="continuationSeparator" w:id="0">
+    <w:p>
+      <w:pPr>
+        <w:spacing w:after="0" w:line="240" w:lineRule="auto"/>
+      </w:pPr>
+      <w:r>
+        <w:continuationSeparator/>
+      </w:r>
+    </w:p>
+  </w:footnote>
+</w:footnotes>
+</file>
+
+<file path=word/numbering.xml><?xml version="1.0" encoding="utf-8"?>
+<w:numbering xmlns:wpc="http://schemas.microsoft.com/office/word/2010/wordprocessingCanvas" xmlns:cx="http://schemas.microsoft.com/office/drawing/2014/chartex" xmlns:cx1="http://schemas.microsoft.com/office/drawing/2015/9/8/chartex" xmlns:cx2="http://schemas.microsoft.com/office/drawing/2015/10/21/chartex" xmlns:cx3="http://schemas.microsoft.com/office/drawing/2016/5/9/chartex" xmlns:cx4="http://schemas.microsoft.com/office/drawing/2016/5/10/chartex" xmlns:cx5="http://schemas.microsoft.com/office/drawing/2016/5/11/chartex" xmlns:cx6="http://schemas.microsoft.com/office/drawing/2016/5/12/chartex" xmlns:cx7="http://schemas.microsoft.com/office/drawing/2016/5/13/chartex" xmlns:cx8="http://schemas.microsoft.com/office/drawing/2016/5/14/chartex" xmlns:mc="http://schemas.openxmlformats.org/markup-compatibility/2006" xmlns:aink="http://schemas.microsoft.com/office/drawing/2016/ink" xmlns:am3d="http://schemas.microsoft.com/office/drawing/2017/model3d" xmlns:o="urn:schemas-microsoft-com:office:office" xmlns:oel="http://schemas.microsoft.com/office/2019/extlst" xmlns:r="http://schemas.openxmlformats.org/officeDocument/2006/relationships" xmlns:m="http://schemas.openxmlformats.org/officeDocument/2006/math" xmlns:v="urn:schemas-microsoft-com:vml" xmlns:wp14="http://schemas.microsoft.com/office/word/2010/wordprocessingDrawing" xmlns:wp="http://schemas.openxmlformats.org/drawingml/2006/wordprocessingDrawing" xmlns:w10="urn:schemas-microsoft-com:office:word" xmlns:w="http://schemas.openxmlformats.org/wordprocessingml/2006/main" xmlns:w14="http://schemas.microsoft.com/office/word/2010/wordml" xmlns:w15="http://schemas.microsoft.com/office/word/2012/wordml" xmlns:w16cex="http://schemas.microsoft.com/office/word/2018/wordml/cex" xmlns:w16cid="http://schemas.microsoft.com/office/word/2016/wordml/cid" xmlns:w16="http://schemas.microsoft.com/office/word/2018/wordml" xmlns:w16du="http://schemas.microsoft.com/office/word/2023/wordml/word16du" xmlns:w16sdtdh="http://schemas.microsoft.com/office/word/2020/wordml/sdtdatahash" xmlns:w16sdtfl="http://schemas.microsoft.com/office/word/2024/wordml/sdtformatlock" xmlns:w16se="http://schemas.microsoft.com/office/word/2015/wordml/symex" xmlns:wpg="http://schemas.microsoft.com/office/word/2010/wordprocessingGroup" xmlns:wpi="http://schemas.microsoft.com/office/word/2010/wordprocessingInk" xmlns:wne="http://schemas.microsoft.com/office/word/2006/wordml" xmlns:wps="http://schemas.microsoft.com/office/word/2010/wordprocessingShape" mc:Ignorable="w14 w15 w16se w16cid w16 w16cex w16sdtdh w16sdtfl w16du wp14">
+  <w:abstractNum w:abstractNumId="0" w15:restartNumberingAfterBreak="0">
+    <w:nsid w:val="176528B6"/>
+    <w:multiLevelType w:val="hybridMultilevel"/>
+    <w:tmpl w:val="3CECACE2"/>
+    <w:lvl w:ilvl="0" w:tplc="37867648">
+      <w:numFmt w:val="bullet"/>
+      <w:lvlText w:val="•"/>
+      <w:lvlJc w:val="left"/>
+      <w:pPr>
+        <w:ind w:left="720" w:hanging="360"/>
+      </w:pPr>
+      <w:rPr>
+        <w:rFonts w:ascii="Aptos" w:eastAsiaTheme="minorHAnsi" w:hAnsi="Aptos" w:cstheme="minorBidi" w:hint="default"/>
+      </w:rPr>
+    </w:lvl>
+    <w:lvl w:ilvl="1" w:tplc="08090003" w:tentative="1">
+      <w:start w:val="1"/>
+      <w:numFmt w:val="bullet"/>
+      <w:lvlText w:val="o"/>
+      <w:lvlJc w:val="left"/>
+      <w:pPr>
+        <w:ind w:left="1440" w:hanging="360"/>
+      </w:pPr>
+      <w:rPr>
+        <w:rFonts w:ascii="Courier New" w:hAnsi="Courier New" w:cs="Courier New" w:hint="default"/>
+      </w:rPr>
+    </w:lvl>
+    <w:lvl w:ilvl="2" w:tplc="08090005" w:tentative="1">
+      <w:start w:val="1"/>
+      <w:numFmt w:val="bullet"/>
+      <w:lvlText w:val=""/>
+      <w:lvlJc w:val="left"/>
+      <w:pPr>
+        <w:ind w:left="2160" w:hanging="360"/>
+      </w:pPr>
+      <w:rPr>
+        <w:rFonts w:ascii="Wingdings" w:hAnsi="Wingdings" w:hint="default"/>
+      </w:rPr>
+    </w:lvl>
+    <w:lvl w:ilvl="3" w:tplc="08090001" w:tentative="1">
+      <w:start w:val="1"/>
+      <w:numFmt w:val="bullet"/>
+      <w:lvlText w:val=""/>
+      <w:lvlJc w:val="left"/>
+      <w:pPr>
+        <w:ind w:left="2880" w:hanging="360"/>
+      </w:pPr>
+      <w:rPr>
+        <w:rFonts w:ascii="Symbol" w:hAnsi="Symbol" w:hint="default"/>
+      </w:rPr>
+    </w:lvl>
+    <w:lvl w:ilvl="4" w:tplc="08090003" w:tentative="1">
+      <w:start w:val="1"/>
+      <w:numFmt w:val="bullet"/>
+      <w:lvlText w:val="o"/>
+      <w:lvlJc w:val="left"/>
+      <w:pPr>
+        <w:ind w:left="3600" w:hanging="360"/>
+      </w:pPr>
+      <w:rPr>
+        <w:rFonts w:ascii="Courier New" w:hAnsi="Courier New" w:cs="Courier New" w:hint="default"/>
+      </w:rPr>
+    </w:lvl>
+    <w:lvl w:ilvl="5" w:tplc="08090005" w:tentative="1">
+      <w:start w:val="1"/>
+      <w:numFmt w:val="bullet"/>
+      <w:lvlText w:val=""/>
+      <w:lvlJc w:val="left"/>
+      <w:pPr>
+        <w:ind w:left="4320" w:hanging="360"/>
+      </w:pPr>
+      <w:rPr>
+        <w:rFonts w:ascii="Wingdings" w:hAnsi="Wingdings" w:hint="default"/>
+      </w:rPr>
+    </w:lvl>
+    <w:lvl w:ilvl="6" w:tplc="08090001" w:tentative="1">
+      <w:start w:val="1"/>
+      <w:numFmt w:val="bullet"/>
+      <w:lvlText w:val=""/>
+      <w:lvlJc w:val="left"/>
+      <w:pPr>
+        <w:ind w:left="5040" w:hanging="360"/>
+      </w:pPr>
+      <w:rPr>
+        <w:rFonts w:ascii="Symbol" w:hAnsi="Symbol" w:hint="default"/>
+      </w:rPr>
+    </w:lvl>
+    <w:lvl w:ilvl="7" w:tplc="08090003" w:tentative="1">
+      <w:start w:val="1"/>
+      <w:numFmt w:val="bullet"/>
+      <w:lvlText w:val="o"/>
+      <w:lvlJc w:val="left"/>
+      <w:pPr>
+        <w:ind w:left="5760" w:hanging="360"/>
+      </w:pPr>
+      <w:rPr>
+        <w:rFonts w:ascii="Courier New" w:hAnsi="Courier New" w:cs="Courier New" w:hint="default"/>
+      </w:rPr>
+    </w:lvl>
+    <w:lvl w:ilvl="8" w:tplc="08090005" w:tentative="1">
+      <w:start w:val="1"/>
+      <w:numFmt w:val="bullet"/>
+      <w:lvlText w:val=""/>
+      <w:lvlJc w:val="left"/>
+      <w:pPr>
+        <w:ind w:left="6480" w:hanging="360"/>
+      </w:pPr>
+      <w:rPr>
+        <w:rFonts w:ascii="Wingdings" w:hAnsi="Wingdings" w:hint="default"/>
+      </w:rPr>
+    </w:lvl>
+  </w:abstractNum>
+  <w:abstractNum w:abstractNumId="1" w15:restartNumberingAfterBreak="0">
+    <w:nsid w:val="39396E41"/>
+    <w:multiLevelType w:val="hybridMultilevel"/>
+    <w:tmpl w:val="F6CA6BD4"/>
+    <w:lvl w:ilvl="0" w:tplc="08090001">
+      <w:start w:val="1"/>
+      <w:numFmt w:val="bullet"/>
+      <w:lvlText w:val=""/>
+      <w:lvlJc w:val="left"/>
+      <w:pPr>
+        <w:ind w:left="720" w:hanging="360"/>
+      </w:pPr>
+      <w:rPr>
+        <w:rFonts w:ascii="Symbol" w:hAnsi="Symbol" w:hint="default"/>
+      </w:rPr>
+    </w:lvl>
+    <w:lvl w:ilvl="1" w:tplc="08090003" w:tentative="1">
+      <w:start w:val="1"/>
+      <w:numFmt w:val="bullet"/>
+      <w:lvlText w:val="o"/>
+      <w:lvlJc w:val="left"/>
+      <w:pPr>
+        <w:ind w:left="1440" w:hanging="360"/>
+      </w:pPr>
+      <w:rPr>
+        <w:rFonts w:ascii="Courier New" w:hAnsi="Courier New" w:cs="Courier New" w:hint="default"/>
+      </w:rPr>
+    </w:lvl>
+    <w:lvl w:ilvl="2" w:tplc="08090005" w:tentative="1">
+      <w:start w:val="1"/>
+      <w:numFmt w:val="bullet"/>
+      <w:lvlText w:val=""/>
+      <w:lvlJc w:val="left"/>
+      <w:pPr>
+        <w:ind w:left="2160" w:hanging="360"/>
+      </w:pPr>
+      <w:rPr>
+        <w:rFonts w:ascii="Wingdings" w:hAnsi="Wingdings" w:hint="default"/>
+      </w:rPr>
+    </w:lvl>
+    <w:lvl w:ilvl="3" w:tplc="08090001" w:tentative="1">
+      <w:start w:val="1"/>
+      <w:numFmt w:val="bullet"/>
+      <w:lvlText w:val=""/>
+      <w:lvlJc w:val="left"/>
+      <w:pPr>
+        <w:ind w:left="2880" w:hanging="360"/>
+      </w:pPr>
+      <w:rPr>
+        <w:rFonts w:ascii="Symbol" w:hAnsi="Symbol" w:hint="default"/>
+      </w:rPr>
+    </w:lvl>
+    <w:lvl w:ilvl="4" w:tplc="08090003" w:tentative="1">
+      <w:start w:val="1"/>
+      <w:numFmt w:val="bullet"/>
+      <w:lvlText w:val="o"/>
+      <w:lvlJc w:val="left"/>
+      <w:pPr>
+        <w:ind w:left="3600" w:hanging="360"/>
+      </w:pPr>
+      <w:rPr>
+        <w:rFonts w:ascii="Courier New" w:hAnsi="Courier New" w:cs="Courier New" w:hint="default"/>
+      </w:rPr>
+    </w:lvl>
+    <w:lvl w:ilvl="5" w:tplc="08090005" w:tentative="1">
+      <w:start w:val="1"/>
+      <w:numFmt w:val="bullet"/>
+      <w:lvlText w:val=""/>
+      <w:lvlJc w:val="left"/>
+      <w:pPr>
+        <w:ind w:left="4320" w:hanging="360"/>
+      </w:pPr>
+      <w:rPr>
+        <w:rFonts w:ascii="Wingdings" w:hAnsi="Wingdings" w:hint="default"/>
+      </w:rPr>
+    </w:lvl>
+    <w:lvl w:ilvl="6" w:tplc="08090001" w:tentative="1">
+      <w:start w:val="1"/>
+      <w:numFmt w:val="bullet"/>
+      <w:lvlText w:val=""/>
+      <w:lvlJc w:val="left"/>
+      <w:pPr>
+        <w:ind w:left="5040" w:hanging="360"/>
+      </w:pPr>
+      <w:rPr>
+        <w:rFonts w:ascii="Symbol" w:hAnsi="Symbol" w:hint="default"/>
+      </w:rPr>
+    </w:lvl>
+    <w:lvl w:ilvl="7" w:tplc="08090003" w:tentative="1">
+      <w:start w:val="1"/>
+      <w:numFmt w:val="bullet"/>
+      <w:lvlText w:val="o"/>
+      <w:lvlJc w:val="left"/>
+      <w:pPr>
+        <w:ind w:left="5760" w:hanging="360"/>
+      </w:pPr>
+      <w:rPr>
+        <w:rFonts w:ascii="Courier New" w:hAnsi="Courier New" w:cs="Courier New" w:hint="default"/>
+      </w:rPr>
+    </w:lvl>
+    <w:lvl w:ilvl="8" w:tplc="08090005" w:tentative="1">
+      <w:start w:val="1"/>
+      <w:numFmt w:val="bullet"/>
+      <w:lvlText w:val=""/>
+      <w:lvlJc w:val="left"/>
+      <w:pPr>
+        <w:ind w:left="6480" w:hanging="360"/>
+      </w:pPr>
+      <w:rPr>
+        <w:rFonts w:ascii="Wingdings" w:hAnsi="Wingdings" w:hint="default"/>
+      </w:rPr>
+    </w:lvl>
+  </w:abstractNum>
+  <w:num w:numId="1" w16cid:durableId="1457092870">
+    <w:abstractNumId w:val="1"/>
+  </w:num>
+  <w:num w:numId="2" w16cid:durableId="1027096720">
+    <w:abstractNumId w:val="0"/>
+  </w:num>
+</w:numbering>
 </file>
 
 <file path=word/styles.xml><?xml version="1.0" encoding="utf-8"?>
@@ -1185,16 +2141,19 @@
     <w:lsdException w:name="Unresolved Mention" w:semiHidden="1" w:unhideWhenUsed="1"/>
     <w:lsdException w:name="Smart Link" w:semiHidden="1" w:unhideWhenUsed="1"/>
   </w:latentStyles>
-  <w:style w:type="paragraph" w:default="1" w:styleId="Standaard">
+  <w:style w:type="paragraph" w:default="1" w:styleId="Normal">
     <w:name w:val="Normal"/>
     <w:qFormat/>
     <w:rsid w:val="00116783"/>
-  </w:style>
-  <w:style w:type="paragraph" w:styleId="Kop1">
+    <w:rPr>
+      <w:lang w:val="en-GB"/>
+    </w:rPr>
+  </w:style>
+  <w:style w:type="paragraph" w:styleId="Heading1">
     <w:name w:val="heading 1"/>
-    <w:basedOn w:val="Standaard"/>
-    <w:next w:val="Standaard"/>
-    <w:link w:val="Kop1Char"/>
+    <w:basedOn w:val="Normal"/>
+    <w:next w:val="Normal"/>
+    <w:link w:val="Heading1Char"/>
     <w:uiPriority w:val="9"/>
     <w:qFormat/>
     <w:rsid w:val="005D05FF"/>
@@ -1211,11 +2170,11 @@
       <w:szCs w:val="40"/>
     </w:rPr>
   </w:style>
-  <w:style w:type="paragraph" w:styleId="Kop2">
+  <w:style w:type="paragraph" w:styleId="Heading2">
     <w:name w:val="heading 2"/>
-    <w:basedOn w:val="Standaard"/>
-    <w:next w:val="Standaard"/>
-    <w:link w:val="Kop2Char"/>
+    <w:basedOn w:val="Normal"/>
+    <w:next w:val="Normal"/>
+    <w:link w:val="Heading2Char"/>
     <w:uiPriority w:val="9"/>
     <w:semiHidden/>
     <w:unhideWhenUsed/>
@@ -1234,11 +2193,11 @@
       <w:szCs w:val="32"/>
     </w:rPr>
   </w:style>
-  <w:style w:type="paragraph" w:styleId="Kop3">
+  <w:style w:type="paragraph" w:styleId="Heading3">
     <w:name w:val="heading 3"/>
-    <w:basedOn w:val="Standaard"/>
-    <w:next w:val="Standaard"/>
-    <w:link w:val="Kop3Char"/>
+    <w:basedOn w:val="Normal"/>
+    <w:next w:val="Normal"/>
+    <w:link w:val="Heading3Char"/>
     <w:uiPriority w:val="9"/>
     <w:semiHidden/>
     <w:unhideWhenUsed/>
@@ -1257,11 +2216,11 @@
       <w:szCs w:val="28"/>
     </w:rPr>
   </w:style>
-  <w:style w:type="paragraph" w:styleId="Kop4">
+  <w:style w:type="paragraph" w:styleId="Heading4">
     <w:name w:val="heading 4"/>
-    <w:basedOn w:val="Standaard"/>
-    <w:next w:val="Standaard"/>
-    <w:link w:val="Kop4Char"/>
+    <w:basedOn w:val="Normal"/>
+    <w:next w:val="Normal"/>
+    <w:link w:val="Heading4Char"/>
     <w:uiPriority w:val="9"/>
     <w:semiHidden/>
     <w:unhideWhenUsed/>
@@ -1280,11 +2239,11 @@
       <w:color w:val="0F4761" w:themeColor="accent1" w:themeShade="BF"/>
     </w:rPr>
   </w:style>
-  <w:style w:type="paragraph" w:styleId="Kop5">
+  <w:style w:type="paragraph" w:styleId="Heading5">
     <w:name w:val="heading 5"/>
-    <w:basedOn w:val="Standaard"/>
-    <w:next w:val="Standaard"/>
-    <w:link w:val="Kop5Char"/>
+    <w:basedOn w:val="Normal"/>
+    <w:next w:val="Normal"/>
+    <w:link w:val="Heading5Char"/>
     <w:uiPriority w:val="9"/>
     <w:semiHidden/>
     <w:unhideWhenUsed/>
@@ -1301,11 +2260,11 @@
       <w:color w:val="0F4761" w:themeColor="accent1" w:themeShade="BF"/>
     </w:rPr>
   </w:style>
-  <w:style w:type="paragraph" w:styleId="Kop6">
+  <w:style w:type="paragraph" w:styleId="Heading6">
     <w:name w:val="heading 6"/>
-    <w:basedOn w:val="Standaard"/>
-    <w:next w:val="Standaard"/>
-    <w:link w:val="Kop6Char"/>
+    <w:basedOn w:val="Normal"/>
+    <w:next w:val="Normal"/>
+    <w:link w:val="Heading6Char"/>
     <w:uiPriority w:val="9"/>
     <w:semiHidden/>
     <w:unhideWhenUsed/>
@@ -1324,11 +2283,11 @@
       <w:color w:val="595959" w:themeColor="text1" w:themeTint="A6"/>
     </w:rPr>
   </w:style>
-  <w:style w:type="paragraph" w:styleId="Kop7">
+  <w:style w:type="paragraph" w:styleId="Heading7">
     <w:name w:val="heading 7"/>
-    <w:basedOn w:val="Standaard"/>
-    <w:next w:val="Standaard"/>
-    <w:link w:val="Kop7Char"/>
+    <w:basedOn w:val="Normal"/>
+    <w:next w:val="Normal"/>
+    <w:link w:val="Heading7Char"/>
     <w:uiPriority w:val="9"/>
     <w:semiHidden/>
     <w:unhideWhenUsed/>
@@ -1345,11 +2304,11 @@
       <w:color w:val="595959" w:themeColor="text1" w:themeTint="A6"/>
     </w:rPr>
   </w:style>
-  <w:style w:type="paragraph" w:styleId="Kop8">
+  <w:style w:type="paragraph" w:styleId="Heading8">
     <w:name w:val="heading 8"/>
-    <w:basedOn w:val="Standaard"/>
-    <w:next w:val="Standaard"/>
-    <w:link w:val="Kop8Char"/>
+    <w:basedOn w:val="Normal"/>
+    <w:next w:val="Normal"/>
+    <w:link w:val="Heading8Char"/>
     <w:uiPriority w:val="9"/>
     <w:semiHidden/>
     <w:unhideWhenUsed/>
@@ -1368,11 +2327,11 @@
       <w:color w:val="272727" w:themeColor="text1" w:themeTint="D8"/>
     </w:rPr>
   </w:style>
-  <w:style w:type="paragraph" w:styleId="Kop9">
+  <w:style w:type="paragraph" w:styleId="Heading9">
     <w:name w:val="heading 9"/>
-    <w:basedOn w:val="Standaard"/>
-    <w:next w:val="Standaard"/>
-    <w:link w:val="Kop9Char"/>
+    <w:basedOn w:val="Normal"/>
+    <w:next w:val="Normal"/>
+    <w:link w:val="Heading9Char"/>
     <w:uiPriority w:val="9"/>
     <w:semiHidden/>
     <w:unhideWhenUsed/>
@@ -1389,13 +2348,12 @@
       <w:color w:val="272727" w:themeColor="text1" w:themeTint="D8"/>
     </w:rPr>
   </w:style>
-  <w:style w:type="character" w:default="1" w:styleId="Standaardalinea-lettertype">
+  <w:style w:type="character" w:default="1" w:styleId="DefaultParagraphFont">
     <w:name w:val="Default Paragraph Font"/>
     <w:uiPriority w:val="1"/>
-    <w:semiHidden/>
     <w:unhideWhenUsed/>
   </w:style>
-  <w:style w:type="table" w:default="1" w:styleId="Standaardtabel">
+  <w:style w:type="table" w:default="1" w:styleId="TableNormal">
     <w:name w:val="Normal Table"/>
     <w:uiPriority w:val="99"/>
     <w:semiHidden/>
@@ -1410,16 +2368,16 @@
       </w:tblCellMar>
     </w:tblPr>
   </w:style>
-  <w:style w:type="numbering" w:default="1" w:styleId="Geenlijst">
+  <w:style w:type="numbering" w:default="1" w:styleId="NoList">
     <w:name w:val="No List"/>
     <w:uiPriority w:val="99"/>
     <w:semiHidden/>
     <w:unhideWhenUsed/>
   </w:style>
-  <w:style w:type="character" w:customStyle="1" w:styleId="Kop1Char">
-    <w:name w:val="Kop 1 Char"/>
-    <w:basedOn w:val="Standaardalinea-lettertype"/>
-    <w:link w:val="Kop1"/>
+  <w:style w:type="character" w:customStyle="1" w:styleId="Heading1Char">
+    <w:name w:val="Heading 1 Char"/>
+    <w:basedOn w:val="DefaultParagraphFont"/>
+    <w:link w:val="Heading1"/>
     <w:uiPriority w:val="9"/>
     <w:rsid w:val="005D05FF"/>
     <w:rPr>
@@ -1429,10 +2387,10 @@
       <w:szCs w:val="40"/>
     </w:rPr>
   </w:style>
-  <w:style w:type="character" w:customStyle="1" w:styleId="Kop2Char">
-    <w:name w:val="Kop 2 Char"/>
-    <w:basedOn w:val="Standaardalinea-lettertype"/>
-    <w:link w:val="Kop2"/>
+  <w:style w:type="character" w:customStyle="1" w:styleId="Heading2Char">
+    <w:name w:val="Heading 2 Char"/>
+    <w:basedOn w:val="DefaultParagraphFont"/>
+    <w:link w:val="Heading2"/>
     <w:uiPriority w:val="9"/>
     <w:semiHidden/>
     <w:rsid w:val="005D05FF"/>
@@ -1443,10 +2401,10 @@
       <w:szCs w:val="32"/>
     </w:rPr>
   </w:style>
-  <w:style w:type="character" w:customStyle="1" w:styleId="Kop3Char">
-    <w:name w:val="Kop 3 Char"/>
-    <w:basedOn w:val="Standaardalinea-lettertype"/>
-    <w:link w:val="Kop3"/>
+  <w:style w:type="character" w:customStyle="1" w:styleId="Heading3Char">
+    <w:name w:val="Heading 3 Char"/>
+    <w:basedOn w:val="DefaultParagraphFont"/>
+    <w:link w:val="Heading3"/>
     <w:uiPriority w:val="9"/>
     <w:semiHidden/>
     <w:rsid w:val="005D05FF"/>
@@ -1457,10 +2415,10 @@
       <w:szCs w:val="28"/>
     </w:rPr>
   </w:style>
-  <w:style w:type="character" w:customStyle="1" w:styleId="Kop4Char">
-    <w:name w:val="Kop 4 Char"/>
-    <w:basedOn w:val="Standaardalinea-lettertype"/>
-    <w:link w:val="Kop4"/>
+  <w:style w:type="character" w:customStyle="1" w:styleId="Heading4Char">
+    <w:name w:val="Heading 4 Char"/>
+    <w:basedOn w:val="DefaultParagraphFont"/>
+    <w:link w:val="Heading4"/>
     <w:uiPriority w:val="9"/>
     <w:semiHidden/>
     <w:rsid w:val="005D05FF"/>
@@ -1471,10 +2429,10 @@
       <w:color w:val="0F4761" w:themeColor="accent1" w:themeShade="BF"/>
     </w:rPr>
   </w:style>
-  <w:style w:type="character" w:customStyle="1" w:styleId="Kop5Char">
-    <w:name w:val="Kop 5 Char"/>
-    <w:basedOn w:val="Standaardalinea-lettertype"/>
-    <w:link w:val="Kop5"/>
+  <w:style w:type="character" w:customStyle="1" w:styleId="Heading5Char">
+    <w:name w:val="Heading 5 Char"/>
+    <w:basedOn w:val="DefaultParagraphFont"/>
+    <w:link w:val="Heading5"/>
     <w:uiPriority w:val="9"/>
     <w:semiHidden/>
     <w:rsid w:val="005D05FF"/>
@@ -1483,10 +2441,10 @@
       <w:color w:val="0F4761" w:themeColor="accent1" w:themeShade="BF"/>
     </w:rPr>
   </w:style>
-  <w:style w:type="character" w:customStyle="1" w:styleId="Kop6Char">
-    <w:name w:val="Kop 6 Char"/>
-    <w:basedOn w:val="Standaardalinea-lettertype"/>
-    <w:link w:val="Kop6"/>
+  <w:style w:type="character" w:customStyle="1" w:styleId="Heading6Char">
+    <w:name w:val="Heading 6 Char"/>
+    <w:basedOn w:val="DefaultParagraphFont"/>
+    <w:link w:val="Heading6"/>
     <w:uiPriority w:val="9"/>
     <w:semiHidden/>
     <w:rsid w:val="005D05FF"/>
@@ -1497,10 +2455,10 @@
       <w:color w:val="595959" w:themeColor="text1" w:themeTint="A6"/>
     </w:rPr>
   </w:style>
-  <w:style w:type="character" w:customStyle="1" w:styleId="Kop7Char">
-    <w:name w:val="Kop 7 Char"/>
-    <w:basedOn w:val="Standaardalinea-lettertype"/>
-    <w:link w:val="Kop7"/>
+  <w:style w:type="character" w:customStyle="1" w:styleId="Heading7Char">
+    <w:name w:val="Heading 7 Char"/>
+    <w:basedOn w:val="DefaultParagraphFont"/>
+    <w:link w:val="Heading7"/>
     <w:uiPriority w:val="9"/>
     <w:semiHidden/>
     <w:rsid w:val="005D05FF"/>
@@ -1509,10 +2467,10 @@
       <w:color w:val="595959" w:themeColor="text1" w:themeTint="A6"/>
     </w:rPr>
   </w:style>
-  <w:style w:type="character" w:customStyle="1" w:styleId="Kop8Char">
-    <w:name w:val="Kop 8 Char"/>
-    <w:basedOn w:val="Standaardalinea-lettertype"/>
-    <w:link w:val="Kop8"/>
+  <w:style w:type="character" w:customStyle="1" w:styleId="Heading8Char">
+    <w:name w:val="Heading 8 Char"/>
+    <w:basedOn w:val="DefaultParagraphFont"/>
+    <w:link w:val="Heading8"/>
     <w:uiPriority w:val="9"/>
     <w:semiHidden/>
     <w:rsid w:val="005D05FF"/>
@@ -1523,10 +2481,10 @@
       <w:color w:val="272727" w:themeColor="text1" w:themeTint="D8"/>
     </w:rPr>
   </w:style>
-  <w:style w:type="character" w:customStyle="1" w:styleId="Kop9Char">
-    <w:name w:val="Kop 9 Char"/>
-    <w:basedOn w:val="Standaardalinea-lettertype"/>
-    <w:link w:val="Kop9"/>
+  <w:style w:type="character" w:customStyle="1" w:styleId="Heading9Char">
+    <w:name w:val="Heading 9 Char"/>
+    <w:basedOn w:val="DefaultParagraphFont"/>
+    <w:link w:val="Heading9"/>
     <w:uiPriority w:val="9"/>
     <w:semiHidden/>
     <w:rsid w:val="005D05FF"/>
@@ -1535,11 +2493,11 @@
       <w:color w:val="272727" w:themeColor="text1" w:themeTint="D8"/>
     </w:rPr>
   </w:style>
-  <w:style w:type="paragraph" w:styleId="Titel">
+  <w:style w:type="paragraph" w:styleId="Title">
     <w:name w:val="Title"/>
-    <w:basedOn w:val="Standaard"/>
-    <w:next w:val="Standaard"/>
-    <w:link w:val="TitelChar"/>
+    <w:basedOn w:val="Normal"/>
+    <w:next w:val="Normal"/>
+    <w:link w:val="TitleChar"/>
     <w:uiPriority w:val="10"/>
     <w:qFormat/>
     <w:rsid w:val="005D05FF"/>
@@ -1555,10 +2513,10 @@
       <w:szCs w:val="56"/>
     </w:rPr>
   </w:style>
-  <w:style w:type="character" w:customStyle="1" w:styleId="TitelChar">
-    <w:name w:val="Titel Char"/>
-    <w:basedOn w:val="Standaardalinea-lettertype"/>
-    <w:link w:val="Titel"/>
+  <w:style w:type="character" w:customStyle="1" w:styleId="TitleChar">
+    <w:name w:val="Title Char"/>
+    <w:basedOn w:val="DefaultParagraphFont"/>
+    <w:link w:val="Title"/>
     <w:uiPriority w:val="10"/>
     <w:rsid w:val="005D05FF"/>
     <w:rPr>
@@ -1569,11 +2527,11 @@
       <w:szCs w:val="56"/>
     </w:rPr>
   </w:style>
-  <w:style w:type="paragraph" w:styleId="Ondertitel">
+  <w:style w:type="paragraph" w:styleId="Subtitle">
     <w:name w:val="Subtitle"/>
-    <w:basedOn w:val="Standaard"/>
-    <w:next w:val="Standaard"/>
-    <w:link w:val="OndertitelChar"/>
+    <w:basedOn w:val="Normal"/>
+    <w:next w:val="Normal"/>
+    <w:link w:val="SubtitleChar"/>
     <w:uiPriority w:val="11"/>
     <w:qFormat/>
     <w:rsid w:val="005D05FF"/>
@@ -1590,10 +2548,10 @@
       <w:szCs w:val="28"/>
     </w:rPr>
   </w:style>
-  <w:style w:type="character" w:customStyle="1" w:styleId="OndertitelChar">
-    <w:name w:val="Ondertitel Char"/>
-    <w:basedOn w:val="Standaardalinea-lettertype"/>
-    <w:link w:val="Ondertitel"/>
+  <w:style w:type="character" w:customStyle="1" w:styleId="SubtitleChar">
+    <w:name w:val="Subtitle Char"/>
+    <w:basedOn w:val="DefaultParagraphFont"/>
+    <w:link w:val="Subtitle"/>
     <w:uiPriority w:val="11"/>
     <w:rsid w:val="005D05FF"/>
     <w:rPr>
@@ -1604,11 +2562,11 @@
       <w:szCs w:val="28"/>
     </w:rPr>
   </w:style>
-  <w:style w:type="paragraph" w:styleId="Citaat">
+  <w:style w:type="paragraph" w:styleId="Quote">
     <w:name w:val="Quote"/>
-    <w:basedOn w:val="Standaard"/>
-    <w:next w:val="Standaard"/>
-    <w:link w:val="CitaatChar"/>
+    <w:basedOn w:val="Normal"/>
+    <w:next w:val="Normal"/>
+    <w:link w:val="QuoteChar"/>
     <w:uiPriority w:val="29"/>
     <w:qFormat/>
     <w:rsid w:val="005D05FF"/>
@@ -1622,10 +2580,10 @@
       <w:color w:val="404040" w:themeColor="text1" w:themeTint="BF"/>
     </w:rPr>
   </w:style>
-  <w:style w:type="character" w:customStyle="1" w:styleId="CitaatChar">
-    <w:name w:val="Citaat Char"/>
-    <w:basedOn w:val="Standaardalinea-lettertype"/>
-    <w:link w:val="Citaat"/>
+  <w:style w:type="character" w:customStyle="1" w:styleId="QuoteChar">
+    <w:name w:val="Quote Char"/>
+    <w:basedOn w:val="DefaultParagraphFont"/>
+    <w:link w:val="Quote"/>
     <w:uiPriority w:val="29"/>
     <w:rsid w:val="005D05FF"/>
     <w:rPr>
@@ -1634,9 +2592,9 @@
       <w:color w:val="404040" w:themeColor="text1" w:themeTint="BF"/>
     </w:rPr>
   </w:style>
-  <w:style w:type="paragraph" w:styleId="Lijstalinea">
+  <w:style w:type="paragraph" w:styleId="ListParagraph">
     <w:name w:val="List Paragraph"/>
-    <w:basedOn w:val="Standaard"/>
+    <w:basedOn w:val="Normal"/>
     <w:uiPriority w:val="34"/>
     <w:qFormat/>
     <w:rsid w:val="005D05FF"/>
@@ -1645,9 +2603,9 @@
       <w:contextualSpacing/>
     </w:pPr>
   </w:style>
-  <w:style w:type="character" w:styleId="Intensievebenadrukking">
+  <w:style w:type="character" w:styleId="IntenseEmphasis">
     <w:name w:val="Intense Emphasis"/>
-    <w:basedOn w:val="Standaardalinea-lettertype"/>
+    <w:basedOn w:val="DefaultParagraphFont"/>
     <w:uiPriority w:val="21"/>
     <w:qFormat/>
     <w:rsid w:val="005D05FF"/>
@@ -1657,11 +2615,11 @@
       <w:color w:val="0F4761" w:themeColor="accent1" w:themeShade="BF"/>
     </w:rPr>
   </w:style>
-  <w:style w:type="paragraph" w:styleId="Duidelijkcitaat">
+  <w:style w:type="paragraph" w:styleId="IntenseQuote">
     <w:name w:val="Intense Quote"/>
-    <w:basedOn w:val="Standaard"/>
-    <w:next w:val="Standaard"/>
-    <w:link w:val="DuidelijkcitaatChar"/>
+    <w:basedOn w:val="Normal"/>
+    <w:next w:val="Normal"/>
+    <w:link w:val="IntenseQuoteChar"/>
     <w:uiPriority w:val="30"/>
     <w:qFormat/>
     <w:rsid w:val="005D05FF"/>
@@ -1680,10 +2638,10 @@
       <w:color w:val="0F4761" w:themeColor="accent1" w:themeShade="BF"/>
     </w:rPr>
   </w:style>
-  <w:style w:type="character" w:customStyle="1" w:styleId="DuidelijkcitaatChar">
-    <w:name w:val="Duidelijk citaat Char"/>
-    <w:basedOn w:val="Standaardalinea-lettertype"/>
-    <w:link w:val="Duidelijkcitaat"/>
+  <w:style w:type="character" w:customStyle="1" w:styleId="IntenseQuoteChar">
+    <w:name w:val="Intense Quote Char"/>
+    <w:basedOn w:val="DefaultParagraphFont"/>
+    <w:link w:val="IntenseQuote"/>
     <w:uiPriority w:val="30"/>
     <w:rsid w:val="005D05FF"/>
     <w:rPr>
@@ -1692,9 +2650,9 @@
       <w:color w:val="0F4761" w:themeColor="accent1" w:themeShade="BF"/>
     </w:rPr>
   </w:style>
-  <w:style w:type="character" w:styleId="Intensieveverwijzing">
+  <w:style w:type="character" w:styleId="IntenseReference">
     <w:name w:val="Intense Reference"/>
-    <w:basedOn w:val="Standaardalinea-lettertype"/>
+    <w:basedOn w:val="DefaultParagraphFont"/>
     <w:uiPriority w:val="32"/>
     <w:qFormat/>
     <w:rsid w:val="005D05FF"/>
@@ -1706,9 +2664,9 @@
       <w:spacing w:val="5"/>
     </w:rPr>
   </w:style>
-  <w:style w:type="paragraph" w:styleId="Geenafstand">
+  <w:style w:type="paragraph" w:styleId="NoSpacing">
     <w:name w:val="No Spacing"/>
-    <w:link w:val="GeenafstandChar"/>
+    <w:link w:val="NoSpacingChar"/>
     <w:uiPriority w:val="1"/>
     <w:qFormat/>
     <w:rsid w:val="00116783"/>
@@ -1722,10 +2680,10 @@
       <w14:ligatures w14:val="none"/>
     </w:rPr>
   </w:style>
-  <w:style w:type="character" w:customStyle="1" w:styleId="GeenafstandChar">
-    <w:name w:val="Geen afstand Char"/>
-    <w:basedOn w:val="Standaardalinea-lettertype"/>
-    <w:link w:val="Geenafstand"/>
+  <w:style w:type="character" w:customStyle="1" w:styleId="NoSpacingChar">
+    <w:name w:val="No Spacing Char"/>
+    <w:basedOn w:val="DefaultParagraphFont"/>
+    <w:link w:val="NoSpacing"/>
     <w:uiPriority w:val="1"/>
     <w:rsid w:val="00116783"/>
     <w:rPr>
@@ -1733,6 +2691,56 @@
       <w:kern w:val="0"/>
       <w:lang w:eastAsia="nl-NL"/>
       <w14:ligatures w14:val="none"/>
+    </w:rPr>
+  </w:style>
+  <w:style w:type="paragraph" w:styleId="Header">
+    <w:name w:val="header"/>
+    <w:basedOn w:val="Normal"/>
+    <w:link w:val="HeaderChar"/>
+    <w:uiPriority w:val="99"/>
+    <w:unhideWhenUsed/>
+    <w:rsid w:val="0017276D"/>
+    <w:pPr>
+      <w:tabs>
+        <w:tab w:val="center" w:pos="4513"/>
+        <w:tab w:val="right" w:pos="9026"/>
+      </w:tabs>
+      <w:spacing w:after="0" w:line="240" w:lineRule="auto"/>
+    </w:pPr>
+  </w:style>
+  <w:style w:type="character" w:customStyle="1" w:styleId="HeaderChar">
+    <w:name w:val="Header Char"/>
+    <w:basedOn w:val="DefaultParagraphFont"/>
+    <w:link w:val="Header"/>
+    <w:uiPriority w:val="99"/>
+    <w:rsid w:val="0017276D"/>
+    <w:rPr>
+      <w:lang w:val="en-GB"/>
+    </w:rPr>
+  </w:style>
+  <w:style w:type="paragraph" w:styleId="Footer">
+    <w:name w:val="footer"/>
+    <w:basedOn w:val="Normal"/>
+    <w:link w:val="FooterChar"/>
+    <w:uiPriority w:val="99"/>
+    <w:unhideWhenUsed/>
+    <w:rsid w:val="0017276D"/>
+    <w:pPr>
+      <w:tabs>
+        <w:tab w:val="center" w:pos="4513"/>
+        <w:tab w:val="right" w:pos="9026"/>
+      </w:tabs>
+      <w:spacing w:after="0" w:line="240" w:lineRule="auto"/>
+    </w:pPr>
+  </w:style>
+  <w:style w:type="character" w:customStyle="1" w:styleId="FooterChar">
+    <w:name w:val="Footer Char"/>
+    <w:basedOn w:val="DefaultParagraphFont"/>
+    <w:link w:val="Footer"/>
+    <w:uiPriority w:val="99"/>
+    <w:rsid w:val="0017276D"/>
+    <w:rPr>
+      <w:lang w:val="en-GB"/>
     </w:rPr>
   </w:style>
 </w:styles>
@@ -2031,4 +3039,16 @@
     </a:ext>
   </a:extLst>
 </a:theme>
+</file>
+
+<file path=customXml/item1.xml><?xml version="1.0" encoding="utf-8"?>
+<b:Sources xmlns:b="http://schemas.openxmlformats.org/officeDocument/2006/bibliography" xmlns="http://schemas.openxmlformats.org/officeDocument/2006/bibliography" SelectedStyle="\APASixthEditionOfficeOnline.xsl" StyleName="APA" Version="6"/>
+</file>
+
+<file path=customXml/itemProps1.xml><?xml version="1.0" encoding="utf-8"?>
+<ds:datastoreItem xmlns:ds="http://schemas.openxmlformats.org/officeDocument/2006/customXml" ds:itemID="{1CD0B33E-FC38-405F-8EB5-549B47840E3B}">
+  <ds:schemaRefs>
+    <ds:schemaRef ds:uri="http://schemas.openxmlformats.org/officeDocument/2006/bibliography"/>
+  </ds:schemaRefs>
+</ds:datastoreItem>
 </file>
</xml_diff>

<commit_message>
verder aan onderzoek gewerkt
</commit_message>
<xml_diff>
--- a/Documentatie/Verslagen/onderzoek hannah.docx
+++ b/Documentatie/Verslagen/onderzoek hannah.docx
@@ -875,6 +875,15 @@
     <w:bookmarkEnd w:id="0" w:displacedByCustomXml="next"/>
     <w:sdt>
       <w:sdtPr>
+        <w:rPr>
+          <w:rFonts w:asciiTheme="minorHAnsi" w:eastAsiaTheme="minorHAnsi" w:hAnsiTheme="minorHAnsi" w:cstheme="minorBidi"/>
+          <w:color w:val="auto"/>
+          <w:kern w:val="2"/>
+          <w:sz w:val="22"/>
+          <w:szCs w:val="22"/>
+          <w:lang w:eastAsia="en-US"/>
+          <w14:ligatures w14:val="standardContextual"/>
+        </w:rPr>
         <w:id w:val="750314549"/>
         <w:docPartObj>
           <w:docPartGallery w:val="Table of Contents"/>
@@ -883,15 +892,8 @@
       </w:sdtPr>
       <w:sdtEndPr>
         <w:rPr>
-          <w:rFonts w:asciiTheme="minorHAnsi" w:eastAsiaTheme="minorHAnsi" w:hAnsiTheme="minorHAnsi" w:cstheme="minorBidi"/>
           <w:b/>
           <w:bCs/>
-          <w:color w:val="auto"/>
-          <w:kern w:val="2"/>
-          <w:sz w:val="22"/>
-          <w:szCs w:val="22"/>
-          <w:lang w:eastAsia="en-US"/>
-          <w14:ligatures w14:val="standardContextual"/>
         </w:rPr>
       </w:sdtEndPr>
       <w:sdtContent>
@@ -923,13 +925,13 @@
           <w:r>
             <w:fldChar w:fldCharType="separate"/>
           </w:r>
-          <w:hyperlink w:anchor="_Toc230691720" w:history="1">
+          <w:hyperlink w:anchor="_Toc231830374" w:history="1">
             <w:r>
               <w:rPr>
                 <w:rStyle w:val="Hyperlink"/>
                 <w:noProof/>
               </w:rPr>
-              <w:t>1.</w:t>
+              <w:t>1</w:t>
             </w:r>
             <w:r>
               <w:rPr>
@@ -946,7 +948,7 @@
                 <w:rStyle w:val="Hyperlink"/>
                 <w:noProof/>
               </w:rPr>
-              <w:t>Summery</w:t>
+              <w:t>Summary</w:t>
             </w:r>
             <w:r>
               <w:rPr>
@@ -967,7 +969,7 @@
                 <w:noProof/>
                 <w:webHidden/>
               </w:rPr>
-              <w:instrText xml:space="preserve"> PAGEREF _Toc230691720 \h </w:instrText>
+              <w:instrText xml:space="preserve"> PAGEREF _Toc231830374 \h </w:instrText>
             </w:r>
             <w:r>
               <w:rPr>
@@ -1009,13 +1011,13 @@
               <w:lang w:eastAsia="en-GB"/>
             </w:rPr>
           </w:pPr>
-          <w:hyperlink w:anchor="_Toc230691721" w:history="1">
+          <w:hyperlink w:anchor="_Toc231830375" w:history="1">
             <w:r>
               <w:rPr>
                 <w:rStyle w:val="Hyperlink"/>
                 <w:noProof/>
               </w:rPr>
-              <w:t>2.</w:t>
+              <w:t>2</w:t>
             </w:r>
             <w:r>
               <w:rPr>
@@ -1053,7 +1055,7 @@
                 <w:noProof/>
                 <w:webHidden/>
               </w:rPr>
-              <w:instrText xml:space="preserve"> PAGEREF _Toc230691721 \h </w:instrText>
+              <w:instrText xml:space="preserve"> PAGEREF _Toc231830375 \h </w:instrText>
             </w:r>
             <w:r>
               <w:rPr>
@@ -1073,7 +1075,7 @@
                 <w:noProof/>
                 <w:webHidden/>
               </w:rPr>
-              <w:t>2</w:t>
+              <w:t>3</w:t>
             </w:r>
             <w:r>
               <w:rPr>
@@ -1099,7 +1101,7 @@
               <w:lang w:eastAsia="en-GB"/>
             </w:rPr>
           </w:pPr>
-          <w:hyperlink w:anchor="_Toc230691722" w:history="1">
+          <w:hyperlink w:anchor="_Toc231830376" w:history="1">
             <w:r>
               <w:rPr>
                 <w:rStyle w:val="Hyperlink"/>
@@ -1143,7 +1145,7 @@
                 <w:noProof/>
                 <w:webHidden/>
               </w:rPr>
-              <w:instrText xml:space="preserve"> PAGEREF _Toc230691722 \h </w:instrText>
+              <w:instrText xml:space="preserve"> PAGEREF _Toc231830376 \h </w:instrText>
             </w:r>
             <w:r>
               <w:rPr>
@@ -1163,7 +1165,7 @@
                 <w:noProof/>
                 <w:webHidden/>
               </w:rPr>
-              <w:t>2</w:t>
+              <w:t>3</w:t>
             </w:r>
             <w:r>
               <w:rPr>
@@ -1189,7 +1191,7 @@
               <w:lang w:eastAsia="en-GB"/>
             </w:rPr>
           </w:pPr>
-          <w:hyperlink w:anchor="_Toc230691723" w:history="1">
+          <w:hyperlink w:anchor="_Toc231830377" w:history="1">
             <w:r>
               <w:rPr>
                 <w:rStyle w:val="Hyperlink"/>
@@ -1233,7 +1235,7 @@
                 <w:noProof/>
                 <w:webHidden/>
               </w:rPr>
-              <w:instrText xml:space="preserve"> PAGEREF _Toc230691723 \h </w:instrText>
+              <w:instrText xml:space="preserve"> PAGEREF _Toc231830377 \h </w:instrText>
             </w:r>
             <w:r>
               <w:rPr>
@@ -1253,7 +1255,7 @@
                 <w:noProof/>
                 <w:webHidden/>
               </w:rPr>
-              <w:t>2</w:t>
+              <w:t>3</w:t>
             </w:r>
             <w:r>
               <w:rPr>
@@ -1279,7 +1281,7 @@
               <w:lang w:eastAsia="en-GB"/>
             </w:rPr>
           </w:pPr>
-          <w:hyperlink w:anchor="_Toc230691724" w:history="1">
+          <w:hyperlink w:anchor="_Toc231830378" w:history="1">
             <w:r>
               <w:rPr>
                 <w:rStyle w:val="Hyperlink"/>
@@ -1323,7 +1325,7 @@
                 <w:noProof/>
                 <w:webHidden/>
               </w:rPr>
-              <w:instrText xml:space="preserve"> PAGEREF _Toc230691724 \h </w:instrText>
+              <w:instrText xml:space="preserve"> PAGEREF _Toc231830378 \h </w:instrText>
             </w:r>
             <w:r>
               <w:rPr>
@@ -1343,7 +1345,7 @@
                 <w:noProof/>
                 <w:webHidden/>
               </w:rPr>
-              <w:t>2</w:t>
+              <w:t>3</w:t>
             </w:r>
             <w:r>
               <w:rPr>
@@ -1365,12 +1367,29 @@
               <w:lang w:eastAsia="en-GB"/>
             </w:rPr>
           </w:pPr>
-          <w:hyperlink w:anchor="_Toc230691725" w:history="1">
+          <w:hyperlink w:anchor="_Toc231830379" w:history="1">
             <w:r>
               <w:rPr>
                 <w:rStyle w:val="Hyperlink"/>
                 <w:noProof/>
               </w:rPr>
+              <w:t>3</w:t>
+            </w:r>
+            <w:r>
+              <w:rPr>
+                <w:rFonts w:eastAsiaTheme="minorEastAsia"/>
+                <w:noProof/>
+                <w:sz w:val="24"/>
+                <w:szCs w:val="24"/>
+                <w:lang w:eastAsia="en-GB"/>
+              </w:rPr>
+              <w:tab/>
+            </w:r>
+            <w:r>
+              <w:rPr>
+                <w:rStyle w:val="Hyperlink"/>
+                <w:noProof/>
+              </w:rPr>
               <w:t>Method</w:t>
             </w:r>
             <w:r>
@@ -1392,7 +1411,7 @@
                 <w:noProof/>
                 <w:webHidden/>
               </w:rPr>
-              <w:instrText xml:space="preserve"> PAGEREF _Toc230691725 \h </w:instrText>
+              <w:instrText xml:space="preserve"> PAGEREF _Toc231830379 \h </w:instrText>
             </w:r>
             <w:r>
               <w:rPr>
@@ -1412,7 +1431,7 @@
                 <w:noProof/>
                 <w:webHidden/>
               </w:rPr>
-              <w:t>3</w:t>
+              <w:t>4</w:t>
             </w:r>
             <w:r>
               <w:rPr>
@@ -1434,23 +1453,40 @@
               <w:lang w:eastAsia="en-GB"/>
             </w:rPr>
           </w:pPr>
-          <w:hyperlink w:anchor="_Toc230691726" w:history="1">
+          <w:hyperlink w:anchor="_Toc231830380" w:history="1">
             <w:r>
               <w:rPr>
                 <w:rStyle w:val="Hyperlink"/>
                 <w:noProof/>
               </w:rPr>
-              <w:t>References</w:t>
-            </w:r>
-            <w:r>
-              <w:rPr>
-                <w:noProof/>
-                <w:webHidden/>
+              <w:t>4</w:t>
+            </w:r>
+            <w:r>
+              <w:rPr>
+                <w:rFonts w:eastAsiaTheme="minorEastAsia"/>
+                <w:noProof/>
+                <w:sz w:val="24"/>
+                <w:szCs w:val="24"/>
+                <w:lang w:eastAsia="en-GB"/>
               </w:rPr>
               <w:tab/>
             </w:r>
             <w:r>
               <w:rPr>
+                <w:rStyle w:val="Hyperlink"/>
+                <w:noProof/>
+              </w:rPr>
+              <w:t>Results</w:t>
+            </w:r>
+            <w:r>
+              <w:rPr>
+                <w:noProof/>
+                <w:webHidden/>
+              </w:rPr>
+              <w:tab/>
+            </w:r>
+            <w:r>
+              <w:rPr>
                 <w:noProof/>
                 <w:webHidden/>
               </w:rPr>
@@ -1461,7 +1497,7 @@
                 <w:noProof/>
                 <w:webHidden/>
               </w:rPr>
-              <w:instrText xml:space="preserve"> PAGEREF _Toc230691726 \h </w:instrText>
+              <w:instrText xml:space="preserve"> PAGEREF _Toc231830380 \h </w:instrText>
             </w:r>
             <w:r>
               <w:rPr>
@@ -1481,7 +1517,187 @@
                 <w:noProof/>
                 <w:webHidden/>
               </w:rPr>
-              <w:t>4</w:t>
+              <w:t>5</w:t>
+            </w:r>
+            <w:r>
+              <w:rPr>
+                <w:noProof/>
+                <w:webHidden/>
+              </w:rPr>
+              <w:fldChar w:fldCharType="end"/>
+            </w:r>
+          </w:hyperlink>
+        </w:p>
+        <w:p>
+          <w:pPr>
+            <w:pStyle w:val="TOC2"/>
+            <w:tabs>
+              <w:tab w:val="left" w:pos="960"/>
+              <w:tab w:val="right" w:leader="dot" w:pos="9062"/>
+            </w:tabs>
+            <w:rPr>
+              <w:rFonts w:eastAsiaTheme="minorEastAsia"/>
+              <w:noProof/>
+              <w:sz w:val="24"/>
+              <w:szCs w:val="24"/>
+              <w:lang w:eastAsia="en-GB"/>
+            </w:rPr>
+          </w:pPr>
+          <w:hyperlink w:anchor="_Toc231830381" w:history="1">
+            <w:r>
+              <w:rPr>
+                <w:rStyle w:val="Hyperlink"/>
+                <w:noProof/>
+              </w:rPr>
+              <w:t>4.1</w:t>
+            </w:r>
+            <w:r>
+              <w:rPr>
+                <w:rFonts w:eastAsiaTheme="minorEastAsia"/>
+                <w:noProof/>
+                <w:sz w:val="24"/>
+                <w:szCs w:val="24"/>
+                <w:lang w:eastAsia="en-GB"/>
+              </w:rPr>
+              <w:tab/>
+            </w:r>
+            <w:r>
+              <w:rPr>
+                <w:rStyle w:val="Hyperlink"/>
+                <w:noProof/>
+              </w:rPr>
+              <w:t>Literature results</w:t>
+            </w:r>
+            <w:r>
+              <w:rPr>
+                <w:noProof/>
+                <w:webHidden/>
+              </w:rPr>
+              <w:tab/>
+            </w:r>
+            <w:r>
+              <w:rPr>
+                <w:noProof/>
+                <w:webHidden/>
+              </w:rPr>
+              <w:fldChar w:fldCharType="begin"/>
+            </w:r>
+            <w:r>
+              <w:rPr>
+                <w:noProof/>
+                <w:webHidden/>
+              </w:rPr>
+              <w:instrText xml:space="preserve"> PAGEREF _Toc231830381 \h </w:instrText>
+            </w:r>
+            <w:r>
+              <w:rPr>
+                <w:noProof/>
+                <w:webHidden/>
+              </w:rPr>
+            </w:r>
+            <w:r>
+              <w:rPr>
+                <w:noProof/>
+                <w:webHidden/>
+              </w:rPr>
+              <w:fldChar w:fldCharType="separate"/>
+            </w:r>
+            <w:r>
+              <w:rPr>
+                <w:noProof/>
+                <w:webHidden/>
+              </w:rPr>
+              <w:t>5</w:t>
+            </w:r>
+            <w:r>
+              <w:rPr>
+                <w:noProof/>
+                <w:webHidden/>
+              </w:rPr>
+              <w:fldChar w:fldCharType="end"/>
+            </w:r>
+          </w:hyperlink>
+        </w:p>
+        <w:p>
+          <w:pPr>
+            <w:pStyle w:val="TOC2"/>
+            <w:tabs>
+              <w:tab w:val="left" w:pos="960"/>
+              <w:tab w:val="right" w:leader="dot" w:pos="9062"/>
+            </w:tabs>
+            <w:rPr>
+              <w:rFonts w:eastAsiaTheme="minorEastAsia"/>
+              <w:noProof/>
+              <w:sz w:val="24"/>
+              <w:szCs w:val="24"/>
+              <w:lang w:eastAsia="en-GB"/>
+            </w:rPr>
+          </w:pPr>
+          <w:hyperlink w:anchor="_Toc231830382" w:history="1">
+            <w:r>
+              <w:rPr>
+                <w:rStyle w:val="Hyperlink"/>
+                <w:noProof/>
+              </w:rPr>
+              <w:t>4.2</w:t>
+            </w:r>
+            <w:r>
+              <w:rPr>
+                <w:rFonts w:eastAsiaTheme="minorEastAsia"/>
+                <w:noProof/>
+                <w:sz w:val="24"/>
+                <w:szCs w:val="24"/>
+                <w:lang w:eastAsia="en-GB"/>
+              </w:rPr>
+              <w:tab/>
+            </w:r>
+            <w:r>
+              <w:rPr>
+                <w:rStyle w:val="Hyperlink"/>
+                <w:noProof/>
+              </w:rPr>
+              <w:t>Experimental results</w:t>
+            </w:r>
+            <w:r>
+              <w:rPr>
+                <w:noProof/>
+                <w:webHidden/>
+              </w:rPr>
+              <w:tab/>
+            </w:r>
+            <w:r>
+              <w:rPr>
+                <w:noProof/>
+                <w:webHidden/>
+              </w:rPr>
+              <w:fldChar w:fldCharType="begin"/>
+            </w:r>
+            <w:r>
+              <w:rPr>
+                <w:noProof/>
+                <w:webHidden/>
+              </w:rPr>
+              <w:instrText xml:space="preserve"> PAGEREF _Toc231830382 \h </w:instrText>
+            </w:r>
+            <w:r>
+              <w:rPr>
+                <w:noProof/>
+                <w:webHidden/>
+              </w:rPr>
+            </w:r>
+            <w:r>
+              <w:rPr>
+                <w:noProof/>
+                <w:webHidden/>
+              </w:rPr>
+              <w:fldChar w:fldCharType="separate"/>
+            </w:r>
+            <w:r>
+              <w:rPr>
+                <w:noProof/>
+                <w:webHidden/>
+              </w:rPr>
+              <w:t>6</w:t>
             </w:r>
             <w:r>
               <w:rPr>
@@ -1503,23 +1719,40 @@
               <w:lang w:eastAsia="en-GB"/>
             </w:rPr>
           </w:pPr>
-          <w:hyperlink w:anchor="_Toc230691727" w:history="1">
+          <w:hyperlink w:anchor="_Toc231830383" w:history="1">
             <w:r>
               <w:rPr>
                 <w:rStyle w:val="Hyperlink"/>
                 <w:noProof/>
               </w:rPr>
-              <w:t>Glossary of terms/ list of symbols (only if functional)</w:t>
-            </w:r>
-            <w:r>
-              <w:rPr>
-                <w:noProof/>
-                <w:webHidden/>
+              <w:t>5</w:t>
+            </w:r>
+            <w:r>
+              <w:rPr>
+                <w:rFonts w:eastAsiaTheme="minorEastAsia"/>
+                <w:noProof/>
+                <w:sz w:val="24"/>
+                <w:szCs w:val="24"/>
+                <w:lang w:eastAsia="en-GB"/>
               </w:rPr>
               <w:tab/>
             </w:r>
             <w:r>
               <w:rPr>
+                <w:rStyle w:val="Hyperlink"/>
+                <w:noProof/>
+              </w:rPr>
+              <w:t>Conclusion</w:t>
+            </w:r>
+            <w:r>
+              <w:rPr>
+                <w:noProof/>
+                <w:webHidden/>
+              </w:rPr>
+              <w:tab/>
+            </w:r>
+            <w:r>
+              <w:rPr>
                 <w:noProof/>
                 <w:webHidden/>
               </w:rPr>
@@ -1530,7 +1763,7 @@
                 <w:noProof/>
                 <w:webHidden/>
               </w:rPr>
-              <w:instrText xml:space="preserve"> PAGEREF _Toc230691727 \h </w:instrText>
+              <w:instrText xml:space="preserve"> PAGEREF _Toc231830383 \h </w:instrText>
             </w:r>
             <w:r>
               <w:rPr>
@@ -1550,7 +1783,7 @@
                 <w:noProof/>
                 <w:webHidden/>
               </w:rPr>
-              <w:t>4</w:t>
+              <w:t>8</w:t>
             </w:r>
             <w:r>
               <w:rPr>
@@ -1572,23 +1805,40 @@
               <w:lang w:eastAsia="en-GB"/>
             </w:rPr>
           </w:pPr>
-          <w:hyperlink w:anchor="_Toc230691728" w:history="1">
+          <w:hyperlink w:anchor="_Toc231830384" w:history="1">
             <w:r>
               <w:rPr>
                 <w:rStyle w:val="Hyperlink"/>
                 <w:noProof/>
               </w:rPr>
-              <w:t>Attachments</w:t>
-            </w:r>
-            <w:r>
-              <w:rPr>
-                <w:noProof/>
-                <w:webHidden/>
+              <w:t>6</w:t>
+            </w:r>
+            <w:r>
+              <w:rPr>
+                <w:rFonts w:eastAsiaTheme="minorEastAsia"/>
+                <w:noProof/>
+                <w:sz w:val="24"/>
+                <w:szCs w:val="24"/>
+                <w:lang w:eastAsia="en-GB"/>
               </w:rPr>
               <w:tab/>
             </w:r>
             <w:r>
               <w:rPr>
+                <w:rStyle w:val="Hyperlink"/>
+                <w:noProof/>
+              </w:rPr>
+              <w:t>References</w:t>
+            </w:r>
+            <w:r>
+              <w:rPr>
+                <w:noProof/>
+                <w:webHidden/>
+              </w:rPr>
+              <w:tab/>
+            </w:r>
+            <w:r>
+              <w:rPr>
                 <w:noProof/>
                 <w:webHidden/>
               </w:rPr>
@@ -1599,7 +1849,7 @@
                 <w:noProof/>
                 <w:webHidden/>
               </w:rPr>
-              <w:instrText xml:space="preserve"> PAGEREF _Toc230691728 \h </w:instrText>
+              <w:instrText xml:space="preserve"> PAGEREF _Toc231830384 \h </w:instrText>
             </w:r>
             <w:r>
               <w:rPr>
@@ -1619,7 +1869,93 @@
                 <w:noProof/>
                 <w:webHidden/>
               </w:rPr>
-              <w:t>4</w:t>
+              <w:t>8</w:t>
+            </w:r>
+            <w:r>
+              <w:rPr>
+                <w:noProof/>
+                <w:webHidden/>
+              </w:rPr>
+              <w:fldChar w:fldCharType="end"/>
+            </w:r>
+          </w:hyperlink>
+        </w:p>
+        <w:p>
+          <w:pPr>
+            <w:pStyle w:val="TOC1"/>
+            <w:rPr>
+              <w:rFonts w:eastAsiaTheme="minorEastAsia"/>
+              <w:noProof/>
+              <w:sz w:val="24"/>
+              <w:szCs w:val="24"/>
+              <w:lang w:eastAsia="en-GB"/>
+            </w:rPr>
+          </w:pPr>
+          <w:hyperlink w:anchor="_Toc231830385" w:history="1">
+            <w:r>
+              <w:rPr>
+                <w:rStyle w:val="Hyperlink"/>
+                <w:noProof/>
+              </w:rPr>
+              <w:t>7</w:t>
+            </w:r>
+            <w:r>
+              <w:rPr>
+                <w:rFonts w:eastAsiaTheme="minorEastAsia"/>
+                <w:noProof/>
+                <w:sz w:val="24"/>
+                <w:szCs w:val="24"/>
+                <w:lang w:eastAsia="en-GB"/>
+              </w:rPr>
+              <w:tab/>
+            </w:r>
+            <w:r>
+              <w:rPr>
+                <w:rStyle w:val="Hyperlink"/>
+                <w:noProof/>
+              </w:rPr>
+              <w:t>Glossary</w:t>
+            </w:r>
+            <w:r>
+              <w:rPr>
+                <w:noProof/>
+                <w:webHidden/>
+              </w:rPr>
+              <w:tab/>
+            </w:r>
+            <w:r>
+              <w:rPr>
+                <w:noProof/>
+                <w:webHidden/>
+              </w:rPr>
+              <w:fldChar w:fldCharType="begin"/>
+            </w:r>
+            <w:r>
+              <w:rPr>
+                <w:noProof/>
+                <w:webHidden/>
+              </w:rPr>
+              <w:instrText xml:space="preserve"> PAGEREF _Toc231830385 \h </w:instrText>
+            </w:r>
+            <w:r>
+              <w:rPr>
+                <w:noProof/>
+                <w:webHidden/>
+              </w:rPr>
+            </w:r>
+            <w:r>
+              <w:rPr>
+                <w:noProof/>
+                <w:webHidden/>
+              </w:rPr>
+              <w:fldChar w:fldCharType="separate"/>
+            </w:r>
+            <w:r>
+              <w:rPr>
+                <w:noProof/>
+                <w:webHidden/>
+              </w:rPr>
+              <w:t>8</w:t>
             </w:r>
             <w:r>
               <w:rPr>
@@ -1662,7 +1998,7 @@
           <w:numId w:val="12"/>
         </w:numPr>
       </w:pPr>
-      <w:bookmarkStart w:id="1" w:name="_Toc230691720"/>
+      <w:bookmarkStart w:id="1" w:name="_Toc231830374"/>
       <w:r>
         <w:lastRenderedPageBreak/>
         <w:t>Summ</w:t>
@@ -1691,6 +2027,19 @@
       </w:pPr>
       <w:r>
         <w:t>• Very briefly state the main conclusion(s) of your report.</w:t>
+      </w:r>
+    </w:p>
+    <w:p>
+      <w:pPr>
+        <w:rPr>
+          <w:rFonts w:asciiTheme="majorHAnsi" w:eastAsiaTheme="majorEastAsia" w:hAnsiTheme="majorHAnsi" w:cstheme="majorBidi"/>
+          <w:color w:val="0F4761" w:themeColor="accent1" w:themeShade="BF"/>
+          <w:sz w:val="40"/>
+          <w:szCs w:val="40"/>
+        </w:rPr>
+      </w:pPr>
+      <w:r>
+        <w:br w:type="page"/>
       </w:r>
     </w:p>
     <w:p>
@@ -1701,8 +2050,9 @@
           <w:numId w:val="11"/>
         </w:numPr>
       </w:pPr>
-      <w:bookmarkStart w:id="2" w:name="_Toc230691721"/>
-      <w:r>
+      <w:bookmarkStart w:id="2" w:name="_Toc231830375"/>
+      <w:r>
+        <w:lastRenderedPageBreak/>
         <w:t>Introduction</w:t>
       </w:r>
       <w:bookmarkEnd w:id="2"/>
@@ -1739,22 +2089,16 @@
         <w:t>)</w:t>
       </w:r>
       <w:r>
-        <w:t xml:space="preserve"> Self-Driving Challenge. It is a challenge setup by the Dutch vehicle authority to gain more knowledge about autonomous driving cars</w:t>
-      </w:r>
-      <w:r>
-        <w:t xml:space="preserve"> </w:t>
-      </w:r>
-      <w:r>
-        <w:t xml:space="preserve">and allow for them to judge </w:t>
-      </w:r>
-      <w:r>
-        <w:t>if</w:t>
-      </w:r>
-      <w:r>
-        <w:t xml:space="preserve"> autonomous driving cars will be allowed to drive on Dutch roads sometime in the future</w:t>
-      </w:r>
-      <w:r>
-        <w:t>.</w:t>
+        <w:t xml:space="preserve"> Self-Driving Challenge. It is a challenge setup by the </w:t>
+      </w:r>
+      <w:r>
+        <w:t>RDW</w:t>
+      </w:r>
+      <w:r>
+        <w:t xml:space="preserve"> to gain more knowledge about autonomous driving cars</w:t>
+      </w:r>
+      <w:r>
+        <w:t xml:space="preserve"> and allow for them to judge if autonomous driving cars will be allowed to drive on Dutch roads sometime in the future.</w:t>
       </w:r>
       <w:r>
         <w:t xml:space="preserve"> </w:t>
@@ -1878,10 +2222,7 @@
         <w:t>aim of this challenge is</w:t>
       </w:r>
       <w:r>
-        <w:t xml:space="preserve"> to n</w:t>
-      </w:r>
-      <w:r>
-        <w:t>avigate a track that simulates realistic traffic scenarios, including pedestrian crossings, traffic lights, overtaking, sign recognition, and other common road situations.</w:t>
+        <w:t xml:space="preserve"> to navigate a track that simulates realistic traffic scenarios, including pedestrian crossings, traffic lights, overtaking, sign recognition, and other common road situations.</w:t>
       </w:r>
     </w:p>
     <w:p>
@@ -1909,7 +2250,7 @@
           <w:szCs w:val="32"/>
         </w:rPr>
       </w:pPr>
-      <w:bookmarkStart w:id="3" w:name="_Toc230691722"/>
+      <w:bookmarkStart w:id="3" w:name="_Toc231830376"/>
       <w:r>
         <w:rPr>
           <w:rStyle w:val="Heading2Char"/>
@@ -1987,7 +2328,7 @@
           <w:numId w:val="11"/>
         </w:numPr>
       </w:pPr>
-      <w:bookmarkStart w:id="4" w:name="_Toc230691723"/>
+      <w:bookmarkStart w:id="4" w:name="_Toc231830377"/>
       <w:r>
         <w:rPr>
           <w:rStyle w:val="Heading2Char"/>
@@ -1998,49 +2339,7 @@
     </w:p>
     <w:p>
       <w:r>
-        <w:t xml:space="preserve">The </w:t>
-      </w:r>
-      <w:r>
-        <w:t>objective</w:t>
-      </w:r>
-      <w:r>
-        <w:t xml:space="preserve"> </w:t>
-      </w:r>
-      <w:r>
-        <w:t>of</w:t>
-      </w:r>
-      <w:r>
-        <w:t xml:space="preserve"> this research is to research what options there are available for</w:t>
-      </w:r>
-      <w:r>
-        <w:t xml:space="preserve"> enabling the kart to</w:t>
-      </w:r>
-      <w:r>
-        <w:t xml:space="preserve"> navigat</w:t>
-      </w:r>
-      <w:r>
-        <w:t>e</w:t>
-      </w:r>
-      <w:r>
-        <w:t xml:space="preserve"> </w:t>
-      </w:r>
-      <w:r>
-        <w:t xml:space="preserve">a predetermined route </w:t>
-      </w:r>
-      <w:r>
-        <w:t xml:space="preserve">autonomously with the hardware limitations that </w:t>
-      </w:r>
-      <w:r>
-        <w:t>it</w:t>
-      </w:r>
-      <w:r>
-        <w:t xml:space="preserve"> has and determine </w:t>
-      </w:r>
-      <w:r>
-        <w:t>which</w:t>
-      </w:r>
-      <w:r>
-        <w:t xml:space="preserve"> option is best.</w:t>
+        <w:t>The objective of this research is to research what options there are available for enabling the kart to navigate a predetermined route autonomously with the hardware limitations that it has and determine which option is best.</w:t>
       </w:r>
     </w:p>
     <w:p>
@@ -2051,7 +2350,7 @@
           <w:numId w:val="11"/>
         </w:numPr>
       </w:pPr>
-      <w:bookmarkStart w:id="5" w:name="_Toc230691724"/>
+      <w:bookmarkStart w:id="5" w:name="_Toc231830378"/>
       <w:r>
         <w:t xml:space="preserve">The </w:t>
       </w:r>
@@ -2080,11 +2379,10 @@
         </w:numPr>
       </w:pPr>
       <w:r>
-        <w:lastRenderedPageBreak/>
         <w:t xml:space="preserve">What </w:t>
       </w:r>
       <w:r>
-        <w:t>software’s</w:t>
+        <w:t>programs</w:t>
       </w:r>
       <w:r>
         <w:t xml:space="preserve"> can be used for navigation?</w:t>
@@ -2099,7 +2397,16 @@
         </w:numPr>
       </w:pPr>
       <w:r>
-        <w:t>What software works within the parameters set by the limitations that the kart has?</w:t>
+        <w:t xml:space="preserve">What </w:t>
+      </w:r>
+      <w:r>
+        <w:t xml:space="preserve">programs </w:t>
+      </w:r>
+      <w:r>
+        <w:t xml:space="preserve">could </w:t>
+      </w:r>
+      <w:r>
+        <w:t>work within the parameters set by the limitations that the kart has?</w:t>
       </w:r>
     </w:p>
     <w:p>
@@ -2111,62 +2418,13 @@
         </w:numPr>
       </w:pPr>
       <w:r>
-        <w:t>Which software is the best option for the given parameters?</w:t>
-      </w:r>
-    </w:p>
-    <w:p/>
-    <w:p/>
-    <w:p>
-      <w:pPr>
-        <w:pStyle w:val="ListParagraph"/>
-        <w:numPr>
-          <w:ilvl w:val="0"/>
-          <w:numId w:val="11"/>
-        </w:numPr>
-        <w:rPr>
-          <w:rFonts w:asciiTheme="majorHAnsi" w:eastAsiaTheme="majorEastAsia" w:hAnsiTheme="majorHAnsi" w:cstheme="majorBidi"/>
-          <w:color w:val="0F4761" w:themeColor="accent1" w:themeShade="BF"/>
-          <w:sz w:val="40"/>
-          <w:szCs w:val="40"/>
-        </w:rPr>
-      </w:pPr>
-      <w:r>
-        <w:rPr>
-          <w:rFonts w:asciiTheme="majorHAnsi" w:eastAsiaTheme="majorEastAsia" w:hAnsiTheme="majorHAnsi" w:cstheme="majorBidi"/>
-          <w:color w:val="0F4761" w:themeColor="accent1" w:themeShade="BF"/>
-          <w:sz w:val="40"/>
-          <w:szCs w:val="40"/>
-        </w:rPr>
-        <w:t xml:space="preserve">Theoretical framework </w:t>
-      </w:r>
-    </w:p>
-    <w:p>
-      <w:r>
-        <w:t>Theoretical framework</w:t>
-      </w:r>
-      <w:r>
-        <w:br/>
-        <w:t>• Is it a new problem or has it existed for a long time?</w:t>
-      </w:r>
-      <w:r>
-        <w:br/>
-        <w:t>• Does the problem occur in other organisations in the sector? Has a solution been found there?</w:t>
-      </w:r>
-      <w:r>
-        <w:br/>
-        <w:t>• What similar problems can you find in the literature and how have they been solved?</w:t>
-      </w:r>
-      <w:r>
-        <w:br/>
-        <w:t>• Which existing solutions are already on the market and why are they not sufficient for this problem?</w:t>
-      </w:r>
-      <w:r>
-        <w:br/>
-        <w:t>• Concept clarification; remove any confusion about terms (for example, who do you mean by ‘elderly’; what do you mean by an ‘aqua drone’)</w:t>
-      </w:r>
-      <w:r>
-        <w:br/>
-        <w:t>Note! If you choose “literature research” as a method, the Theoretical framework may be omitted, as the information will be included under Results.</w:t>
+        <w:t xml:space="preserve">Which </w:t>
+      </w:r>
+      <w:r>
+        <w:t xml:space="preserve">programs </w:t>
+      </w:r>
+      <w:r>
+        <w:t>is the best option for the given parameters?</w:t>
       </w:r>
     </w:p>
     <w:p>
@@ -2177,8 +2435,9 @@
           <w:numId w:val="11"/>
         </w:numPr>
       </w:pPr>
-      <w:bookmarkStart w:id="6" w:name="_Toc230691725"/>
-      <w:r>
+      <w:bookmarkStart w:id="6" w:name="_Toc231830379"/>
+      <w:r>
+        <w:lastRenderedPageBreak/>
         <w:t>Method</w:t>
       </w:r>
       <w:bookmarkEnd w:id="6"/>
@@ -2211,10 +2470,7 @@
         </w:numPr>
       </w:pPr>
       <w:r>
-        <w:t>It d</w:t>
-      </w:r>
-      <w:r>
-        <w:t>oes not require the use of a GPS</w:t>
+        <w:t>Doesn’t require a GPS</w:t>
       </w:r>
     </w:p>
     <w:p>
@@ -2226,7 +2482,10 @@
         </w:numPr>
       </w:pPr>
       <w:r>
-        <w:t xml:space="preserve">Isn’t GPU heavy </w:t>
+        <w:t>Isn’t GPU heavy</w:t>
+      </w:r>
+      <w:r>
+        <w:t xml:space="preserve"> or GPU reliant</w:t>
       </w:r>
     </w:p>
     <w:p>
@@ -2236,36 +2495,57 @@
     </w:p>
     <w:p>
       <w:r>
-        <w:t>After determining which software programs to test the experimental research will begin. The literature research does not give enough insight to determine if the software program will work as wished</w:t>
-      </w:r>
-      <w:r>
-        <w:t>. This is why experimental research is needed. By installing and testing the different programs it will show what is or isn’t possible that documentation alone won’t show.</w:t>
-      </w:r>
-    </w:p>
-    <w:p/>
-    <w:p>
-      <w:pPr>
-        <w:pStyle w:val="ListParagraph"/>
+        <w:t xml:space="preserve">After determining which software programs to test the experimental research will begin. The literature research </w:t>
+      </w:r>
+      <w:r>
+        <w:t>might</w:t>
+      </w:r>
+      <w:r>
+        <w:t xml:space="preserve"> not give enough insight to determine if the software program will work as wished</w:t>
+      </w:r>
+      <w:r>
+        <w:t xml:space="preserve">. This is why experimental research </w:t>
+      </w:r>
+      <w:r>
+        <w:t>will be</w:t>
+      </w:r>
+      <w:r>
+        <w:t xml:space="preserve"> needed. By installing and testing the different programs it will show what is or isn’t possible that documentation alone won’t show.</w:t>
+      </w:r>
+    </w:p>
+    <w:p>
+      <w:pPr>
+        <w:rPr>
+          <w:rFonts w:asciiTheme="majorHAnsi" w:hAnsiTheme="majorHAnsi" w:cstheme="majorBidi"/>
+          <w:color w:val="0F4761" w:themeColor="accent1" w:themeShade="BF"/>
+          <w:sz w:val="40"/>
+          <w:szCs w:val="40"/>
+        </w:rPr>
+      </w:pPr>
+      <w:r>
+        <w:br w:type="page"/>
+      </w:r>
+    </w:p>
+    <w:p>
+      <w:pPr>
+        <w:pStyle w:val="Heading1"/>
         <w:numPr>
           <w:ilvl w:val="0"/>
           <w:numId w:val="11"/>
         </w:numPr>
         <w:rPr>
-          <w:rFonts w:asciiTheme="majorHAnsi" w:eastAsiaTheme="majorEastAsia" w:hAnsiTheme="majorHAnsi" w:cstheme="majorBidi"/>
-          <w:color w:val="0F4761" w:themeColor="accent1" w:themeShade="BF"/>
-          <w:sz w:val="40"/>
-          <w:szCs w:val="40"/>
-        </w:rPr>
-      </w:pPr>
-      <w:r>
-        <w:rPr>
-          <w:rFonts w:asciiTheme="majorHAnsi" w:eastAsiaTheme="majorEastAsia" w:hAnsiTheme="majorHAnsi" w:cstheme="majorBidi"/>
-          <w:color w:val="0F4761" w:themeColor="accent1" w:themeShade="BF"/>
-          <w:sz w:val="40"/>
-          <w:szCs w:val="40"/>
-        </w:rPr>
-        <w:t xml:space="preserve">Results </w:t>
-      </w:r>
+          <w:rFonts w:eastAsiaTheme="minorHAnsi"/>
+        </w:rPr>
+      </w:pPr>
+      <w:bookmarkStart w:id="7" w:name="_Toc231830380"/>
+      <w:r>
+        <w:rPr>
+          <w:rFonts w:eastAsiaTheme="minorHAnsi"/>
+        </w:rPr>
+        <w:lastRenderedPageBreak/>
+        <w:t>Results</w:t>
+      </w:r>
+      <w:bookmarkEnd w:id="7"/>
     </w:p>
     <w:p>
       <w:r>
@@ -2277,11 +2557,7 @@
       </w:r>
       <w:r>
         <w:br/>
-        <w:t xml:space="preserve">• Think of measurement data, graphs, survey results, information from datasheets, or other </w:t>
-      </w:r>
-      <w:r>
-        <w:lastRenderedPageBreak/>
-        <w:t>literature. Large files are added as an appendix, and all appendices are referenced in the text.</w:t>
+        <w:t>• Think of measurement data, graphs, survey results, information from datasheets, or other literature. Large files are added as an appendix, and all appendices are referenced in the text.</w:t>
       </w:r>
       <w:r>
         <w:br/>
@@ -2296,34 +2572,227 @@
           <w:numId w:val="11"/>
         </w:numPr>
       </w:pPr>
+      <w:bookmarkStart w:id="8" w:name="_Toc231830381"/>
       <w:r>
         <w:t>Literature results</w:t>
       </w:r>
-    </w:p>
-    <w:p/>
-    <w:p>
+      <w:bookmarkEnd w:id="8"/>
+    </w:p>
+    <w:p>
+      <w:r>
+        <w:t>Researching the possibility of navigating by way of a map the following options were found:</w:t>
+      </w:r>
+    </w:p>
+    <w:p>
+      <w:pPr>
+        <w:pStyle w:val="Heading4"/>
+      </w:pPr>
       <w:r>
         <w:t>ROS2</w:t>
       </w:r>
+      <w:r>
+        <w:t xml:space="preserve"> jazzy</w:t>
+      </w:r>
     </w:p>
     <w:p>
       <w:r>
         <w:t>ROS stands for Robot Operating System. It is an Open-Source</w:t>
       </w:r>
-    </w:p>
-    <w:p>
+      <w:r>
+        <w:t xml:space="preserve"> and has a set of tools and software libraries for building robot applications. </w:t>
+      </w:r>
+      <w:r>
+        <w:fldChar w:fldCharType="begin"/>
+      </w:r>
+      <w:r>
+        <w:instrText xml:space="preserve"> ADDIN ZOTERO_ITEM CSL_CITATION {"citationID":"nNT2QdtT","properties":{"formattedCitation":"[1]","plainCitation":"[1]","noteIndex":0},"citationItems":[{"id":74,"uris":["http://zotero.org/users/15129247/items/8JE7ASTL"],"itemData":{"id":74,"type":"webpage","title":"ROS 2 Documentation — ROS 2 Documentation: Jazzy documentation","URL":"https://docs.ros.org/en/jazzy/index.html","accessed":{"date-parts":[["2026",6,8]]}}}],"schema":"https://github.com/citation-style-language/schema/raw/master/csl-citation.json"} </w:instrText>
+      </w:r>
+      <w:r>
+        <w:fldChar w:fldCharType="separate"/>
+      </w:r>
+      <w:r>
+        <w:rPr>
+          <w:rFonts w:ascii="Aptos" w:hAnsi="Aptos"/>
+        </w:rPr>
+        <w:t>[1]</w:t>
+      </w:r>
+      <w:r>
+        <w:fldChar w:fldCharType="end"/>
+      </w:r>
+      <w:r>
+        <w:t xml:space="preserve"> </w:t>
+      </w:r>
+      <w:r>
+        <w:t>After doing some searching for help guides as we had no knowledge of  ROS a guide was found</w:t>
+      </w:r>
+      <w:r>
+        <w:t xml:space="preserve"> about using a ROS2 library for navigation called Nav2</w:t>
+      </w:r>
+      <w:r>
+        <w:t>.</w:t>
+      </w:r>
+      <w:r>
+        <w:t xml:space="preserve"> </w:t>
+      </w:r>
+      <w:r>
+        <w:fldChar w:fldCharType="begin"/>
+      </w:r>
+      <w:r>
+        <w:instrText xml:space="preserve"> ADDIN ZOTERO_ITEM CSL_CITATION {"citationID":"qng8VRGe","properties":{"formattedCitation":"[2]","plainCitation":"[2]","noteIndex":0},"citationItems":[{"id":80,"uris":["http://zotero.org/users/15129247/items/ALZIMIU2"],"itemData":{"id":80,"type":"post-weblog","language":"en-US","title":"How to Install ROS 2 Navigation (Nav2) – ROS 2 Jazzy","URL":"https://automaticaddison.com/how-to-install-ros-2-navigation-nav2-ros-2-jazzy/","author":[{"literal":"automaticaddison"}],"accessed":{"date-parts":[["2026",6,8]]},"issued":{"date-parts":[["2024",11,27]]}}}],"schema":"https://github.com/citation-style-language/schema/raw/master/csl-citation.json"} </w:instrText>
+      </w:r>
+      <w:r>
+        <w:fldChar w:fldCharType="separate"/>
+      </w:r>
+      <w:r>
+        <w:rPr>
+          <w:rFonts w:ascii="Aptos" w:hAnsi="Aptos"/>
+        </w:rPr>
+        <w:t>[2]</w:t>
+      </w:r>
+      <w:r>
+        <w:fldChar w:fldCharType="end"/>
+      </w:r>
+      <w:r>
+        <w:t xml:space="preserve"> </w:t>
+      </w:r>
+      <w:r>
+        <w:t>After reading through the instruction guide on how to install and use ROS Nav2 for Ros2 jazzy it was decided to attempt to use this program</w:t>
+      </w:r>
+      <w:r>
+        <w:t xml:space="preserve"> as it has several guides tied to each other to eventually be able to create a way of navigation</w:t>
+      </w:r>
+      <w:r>
+        <w:t xml:space="preserve">. The </w:t>
+      </w:r>
+      <w:r>
+        <w:t xml:space="preserve">Nav 2 </w:t>
+      </w:r>
+      <w:r>
+        <w:t xml:space="preserve">library included two programs. One being Gazebo, a robot simulation environment and another being Rviz, a 3d visualizer. </w:t>
+      </w:r>
+      <w:r>
+        <w:fldChar w:fldCharType="begin"/>
+      </w:r>
+      <w:r>
+        <w:instrText xml:space="preserve"> ADDIN ZOTERO_ITEM CSL_CITATION {"citationID":"FKto397k","properties":{"formattedCitation":"[3], [4]","plainCitation":"[3], [4]","noteIndex":0},"citationItems":[{"id":78,"uris":["http://zotero.org/users/15129247/items/LYDDBK23"],"itemData":{"id":78,"type":"webpage","title":"Setting up a robot simulation (Gazebo) — ROS 2 Documentation: Jazzy documentation","URL":"https://docs.ros.org/en/jazzy/Tutorials/Advanced/Simulators/Gazebo/Gazebo.html#prerequisites","accessed":{"date-parts":[["2026",6,8]]}}},{"id":76,"uris":["http://zotero.org/users/15129247/items/JEXHQKTA"],"itemData":{"id":76,"type":"webpage","title":"RViz — ROS 2 Documentation: Jazzy documentation","URL":"https://docs.ros.org/en/jazzy/Tutorials/Intermediate/RViz/RViz-Main.html","accessed":{"date-parts":[["2026",6,8]]}}}],"schema":"https://github.com/citation-style-language/schema/raw/master/csl-citation.json"} </w:instrText>
+      </w:r>
+      <w:r>
+        <w:fldChar w:fldCharType="separate"/>
+      </w:r>
+      <w:r>
+        <w:rPr>
+          <w:rFonts w:ascii="Aptos" w:hAnsi="Aptos"/>
+        </w:rPr>
+        <w:t>[3], [4]</w:t>
+      </w:r>
+      <w:r>
+        <w:fldChar w:fldCharType="end"/>
+      </w:r>
+    </w:p>
+    <w:p>
+      <w:pPr>
+        <w:pStyle w:val="Heading4"/>
+      </w:pPr>
+      <w:r>
+        <w:t>C</w:t>
+      </w:r>
+      <w:r>
+        <w:t>OLMAP</w:t>
+      </w:r>
+    </w:p>
+    <w:p>
+      <w:r>
+        <w:t>Whilst doing research on navigating</w:t>
+      </w:r>
+      <w:r>
+        <w:t xml:space="preserve"> a pre-made map</w:t>
+      </w:r>
+      <w:r>
+        <w:t xml:space="preserve"> without a GPS </w:t>
+      </w:r>
+      <w:r>
+        <w:t xml:space="preserve">for Nav2 to use, </w:t>
+      </w:r>
+      <w:r>
+        <w:t>the possibility of using camera’s as a way of navigation was discovered. One of the options for this was COLMAP. COLMAP is a general-purpose pipeline for Structure-from-Motion (</w:t>
+      </w:r>
       <w:proofErr w:type="spellStart"/>
       <w:r>
-        <w:t>Colmap</w:t>
+        <w:t>SfM</w:t>
       </w:r>
       <w:proofErr w:type="spellEnd"/>
-    </w:p>
-    <w:p>
+      <w:r>
+        <w:t xml:space="preserve">) and Multi-View Stereo (MVS) with a graphical and command-line interface. One of its key features is the ability to create a </w:t>
+      </w:r>
+      <w:r>
+        <w:t xml:space="preserve">3d </w:t>
+      </w:r>
+      <w:r>
+        <w:t>reconstruction</w:t>
+      </w:r>
+      <w:r>
+        <w:t xml:space="preserve"> based of off images. As well as the possibility to create an offline map and not active mapping. If this works it could mean that the map could be created using a computer with a GPU and then adding it onto the NUC to use without having to worry about the GPU. We decided to give this a try to see what results it could give us.</w:t>
+      </w:r>
+      <w:r>
+        <w:t xml:space="preserve">  </w:t>
+      </w:r>
+      <w:r>
+        <w:fldChar w:fldCharType="begin"/>
+      </w:r>
+      <w:r>
+        <w:instrText xml:space="preserve"> ADDIN ZOTERO_ITEM CSL_CITATION {"citationID":"IyiYnjQO","properties":{"formattedCitation":"[5]","plainCitation":"[5]","noteIndex":0},"citationItems":[{"id":84,"uris":["http://zotero.org/users/15129247/items/8GMR78KI"],"itemData":{"id":84,"type":"webpage","title":"COLMAP — COLMAP 4.1.0.dev0 | 43dd3bb2 (2026-03-16) documentation","URL":"https://colmap.github.io/","accessed":{"date-parts":[["2026",6,8]]}}}],"schema":"https://github.com/citation-style-language/schema/raw/master/csl-citation.json"} </w:instrText>
+      </w:r>
+      <w:r>
+        <w:fldChar w:fldCharType="separate"/>
+      </w:r>
+      <w:r>
+        <w:rPr>
+          <w:rFonts w:ascii="Aptos" w:hAnsi="Aptos"/>
+        </w:rPr>
+        <w:t>[5]</w:t>
+      </w:r>
+      <w:r>
+        <w:fldChar w:fldCharType="end"/>
+      </w:r>
+    </w:p>
+    <w:p>
+      <w:pPr>
+        <w:pStyle w:val="Heading4"/>
+      </w:pPr>
       <w:r>
         <w:t>SLAM</w:t>
       </w:r>
     </w:p>
     <w:p>
+      <w:r>
+        <w:t xml:space="preserve">Whilst looking through more of what Nav2 had to offer we stumbled across Navigating while Mapping also known as SLAM (Simultaneous localization and Mapping). </w:t>
+      </w:r>
+      <w:r>
+        <w:fldChar w:fldCharType="begin"/>
+      </w:r>
+      <w:r>
+        <w:instrText xml:space="preserve"> ADDIN ZOTERO_ITEM CSL_CITATION {"citationID":"G5tb9GDj","properties":{"formattedCitation":"[6]","plainCitation":"[6]","noteIndex":0},"citationItems":[{"id":86,"uris":["http://zotero.org/users/15129247/items/H53JMP52"],"itemData":{"id":86,"type":"webpage","title":"Navigating while Mapping (SLAM) — Nav2 1.0.0 documentation","URL":"https://docs.nav2.org/tutorials/docs/navigation2_with_slam.html","accessed":{"date-parts":[["2026",6,8]]}}}],"schema":"https://github.com/citation-style-language/schema/raw/master/csl-citation.json"} </w:instrText>
+      </w:r>
+      <w:r>
+        <w:fldChar w:fldCharType="separate"/>
+      </w:r>
+      <w:r>
+        <w:rPr>
+          <w:rFonts w:ascii="Aptos" w:hAnsi="Aptos"/>
+        </w:rPr>
+        <w:t>[6]</w:t>
+      </w:r>
+      <w:r>
+        <w:fldChar w:fldCharType="end"/>
+      </w:r>
+      <w:r>
+        <w:t xml:space="preserve"> As it was decided to not continue with ROS2 SLAM gave insight into other programs which use SLAM. After researching this further the following programs were found and tested:</w:t>
+      </w:r>
+    </w:p>
+    <w:p>
+      <w:pPr>
+        <w:pStyle w:val="Heading4"/>
+      </w:pPr>
       <w:proofErr w:type="spellStart"/>
       <w:r>
         <w:t>PySLAM</w:t>
@@ -2332,7 +2801,94 @@
     </w:p>
     <w:p>
       <w:r>
-        <w:t>RTABMAP</w:t>
+        <w:t xml:space="preserve">When reading the </w:t>
+      </w:r>
+      <w:proofErr w:type="spellStart"/>
+      <w:r>
+        <w:t>Github</w:t>
+      </w:r>
+      <w:proofErr w:type="spellEnd"/>
+      <w:r>
+        <w:t xml:space="preserve"> several options to use SLAM where discovered. The program runs on Python which a plus as the line detection also runs on python which reduces the chance of compatibility issues. After reading through the different options it was decided to give this a try. </w:t>
+      </w:r>
+      <w:r>
+        <w:fldChar w:fldCharType="begin"/>
+      </w:r>
+      <w:r>
+        <w:instrText xml:space="preserve"> ADDIN ZOTERO_ITEM CSL_CITATION {"citationID":"sEWRxmRN","properties":{"formattedCitation":"[7]","plainCitation":"[7]","noteIndex":0},"citationItems":[{"id":88,"uris":["http://zotero.org/users/15129247/items/GSDL7K2R"],"itemData":{"id":88,"type":"software","abstract":"pySLAM is a hybrid Python/C++ Visual SLAM pipeline supporting monocular, stereo, and RGB-D cameras. It provides a broad set of modern local and global feature extractors, multiple loop-closure strategies, a volumetric reconstruction module, integrated depth-prediction models, and semantic segmentation capabilities for enhanced scene understanding.","genre":"Python","license":"GPL-3.0","note":"original-date: 2019-04-06T16:32:09Z","source":"GitHub","title":"luigifreda/pyslam","URL":"https://github.com/luigifreda/pyslam","author":[{"family":"Freda","given":"Luigi"}],"accessed":{"date-parts":[["2026",6,8]]},"issued":{"date-parts":[["2026",6,8]]}}}],"schema":"https://github.com/citation-style-language/schema/raw/master/csl-citation.json"} </w:instrText>
+      </w:r>
+      <w:r>
+        <w:fldChar w:fldCharType="separate"/>
+      </w:r>
+      <w:r>
+        <w:rPr>
+          <w:rFonts w:ascii="Aptos" w:hAnsi="Aptos"/>
+        </w:rPr>
+        <w:t>[7]</w:t>
+      </w:r>
+      <w:r>
+        <w:fldChar w:fldCharType="end"/>
+      </w:r>
+    </w:p>
+    <w:p>
+      <w:pPr>
+        <w:pStyle w:val="Heading4"/>
+      </w:pPr>
+      <w:r>
+        <w:t>RTAB</w:t>
+      </w:r>
+      <w:r>
+        <w:t>-</w:t>
+      </w:r>
+      <w:r>
+        <w:t>M</w:t>
+      </w:r>
+      <w:r>
+        <w:t>ap</w:t>
+      </w:r>
+    </w:p>
+    <w:p>
+      <w:r>
+        <w:t xml:space="preserve">After the attempt of using </w:t>
+      </w:r>
+      <w:proofErr w:type="spellStart"/>
+      <w:r>
+        <w:t>PySlam</w:t>
+      </w:r>
+      <w:proofErr w:type="spellEnd"/>
+      <w:r>
+        <w:t xml:space="preserve"> failed</w:t>
+      </w:r>
+      <w:r>
+        <w:t xml:space="preserve"> we decided to try our final option. RTBA-Map also known as </w:t>
+      </w:r>
+      <w:r>
+        <w:t>Real-Time Appearance-Based Mapping</w:t>
+      </w:r>
+      <w:r>
+        <w:t xml:space="preserve">. We came across RTBA-Map by contacting an expert </w:t>
+      </w:r>
+      <w:r>
+        <w:lastRenderedPageBreak/>
+        <w:t xml:space="preserve">at the robotics department of the Technical University Delft, TU Delft for short. He advised trying this program to see if this is what we needed. After looking into the program we decided to give it a go. As it used a camera to create a map which then allowed it to use said map to locate itself.  </w:t>
+      </w:r>
+      <w:r>
+        <w:fldChar w:fldCharType="begin"/>
+      </w:r>
+      <w:r>
+        <w:instrText xml:space="preserve"> ADDIN ZOTERO_ITEM CSL_CITATION {"citationID":"dnWwr5q3","properties":{"formattedCitation":"[8]","plainCitation":"[8]","noteIndex":0},"citationItems":[{"id":89,"uris":["http://zotero.org/users/15129247/items/SFX3EAHP"],"itemData":{"id":89,"type":"webpage","abstract":"Real-Time Appearance-Based Mapping","container-title":"RTAB-Map","language":"en-US","title":"RTAB-Map","URL":"http://introlab.github.io/rtabmap/","accessed":{"date-parts":[["2026",6,8]]}}}],"schema":"https://github.com/citation-style-language/schema/raw/master/csl-citation.json"} </w:instrText>
+      </w:r>
+      <w:r>
+        <w:fldChar w:fldCharType="separate"/>
+      </w:r>
+      <w:r>
+        <w:rPr>
+          <w:rFonts w:ascii="Aptos" w:hAnsi="Aptos"/>
+        </w:rPr>
+        <w:t>[8]</w:t>
+      </w:r>
+      <w:r>
+        <w:fldChar w:fldCharType="end"/>
       </w:r>
     </w:p>
     <w:p/>
@@ -2344,18 +2900,463 @@
           <w:numId w:val="11"/>
         </w:numPr>
       </w:pPr>
+      <w:bookmarkStart w:id="9" w:name="_Toc231830382"/>
       <w:r>
         <w:t>Experimental results</w:t>
       </w:r>
+      <w:bookmarkEnd w:id="9"/>
+    </w:p>
+    <w:p>
+      <w:pPr>
+        <w:pStyle w:val="Heading4"/>
+      </w:pPr>
+      <w:r>
+        <w:t>ROS2 Jazzy</w:t>
+      </w:r>
+    </w:p>
+    <w:p>
+      <w:r>
+        <w:t>As it was being attempted</w:t>
+      </w:r>
+      <w:r>
+        <w:t xml:space="preserve"> to apply the guides to our needs</w:t>
+      </w:r>
+      <w:r>
+        <w:t xml:space="preserve">, it was </w:t>
+      </w:r>
+      <w:r>
+        <w:t xml:space="preserve">first </w:t>
+      </w:r>
+      <w:r>
+        <w:t>discovered how difficult using Gazebo was</w:t>
+      </w:r>
+      <w:r>
+        <w:t xml:space="preserve"> without in depth knowledge of ROS itself</w:t>
+      </w:r>
+      <w:r>
+        <w:t xml:space="preserve">. </w:t>
+      </w:r>
+      <w:r>
+        <w:t>After further</w:t>
+      </w:r>
+      <w:r>
+        <w:t xml:space="preserve"> experimentation is was realised that altering the guides instructions to what the project needed was difficult with the limited amount of </w:t>
+      </w:r>
+      <w:r>
+        <w:t>knowledge</w:t>
+      </w:r>
+      <w:r>
+        <w:t xml:space="preserve"> and time that was available.</w:t>
+      </w:r>
+      <w:r>
+        <w:t xml:space="preserve"> As the project simply didn’t understand ROS2 enough to be able to apply the changes needed for a successful recreation of the course for navigational purposes. </w:t>
+      </w:r>
+    </w:p>
+    <w:p>
+      <w:pPr>
+        <w:pStyle w:val="Heading4"/>
+      </w:pPr>
+      <w:r>
+        <w:t>COLMAP</w:t>
+      </w:r>
+    </w:p>
+    <w:p>
+      <w:r>
+        <w:t xml:space="preserve">Experimenting with COLMAP made it clear the running this on a computer with a GPU was mandatory as the first reconstruction took over 1 day, 11 hours, 19 minutes and 16 seconds. </w:t>
+      </w:r>
+    </w:p>
+    <w:p>
+      <w:r>
+        <w:t xml:space="preserve">To be able to reconstruct a 3d model in was necessary to cut the video into separate images. </w:t>
+      </w:r>
+    </w:p>
+    <w:p>
+      <w:r>
+        <w:t xml:space="preserve">The first attempt used all 3 camera’s, images cut from the video at 30 frames per second to as well as exhaustive matching </w:t>
+      </w:r>
+      <w:r>
+        <w:t xml:space="preserve">reconstruct </w:t>
+      </w:r>
+      <w:r>
+        <w:t xml:space="preserve">only </w:t>
+      </w:r>
+      <w:r>
+        <w:t>a part of the track</w:t>
+      </w:r>
+      <w:r>
+        <w:t>.</w:t>
+      </w:r>
+    </w:p>
+    <w:p>
+      <w:r>
+        <w:t xml:space="preserve">The </w:t>
+      </w:r>
+      <w:r>
+        <w:t xml:space="preserve">lefthand </w:t>
+      </w:r>
+      <w:r>
+        <w:t xml:space="preserve">image shows the </w:t>
+      </w:r>
+      <w:r>
+        <w:t xml:space="preserve">results of the </w:t>
+      </w:r>
+      <w:r>
+        <w:t>first attempt of reconstruction.</w:t>
+      </w:r>
+    </w:p>
+    <w:p>
+      <w:r>
+        <w:t xml:space="preserve">A second attempt with the same settings </w:t>
+      </w:r>
+      <w:r>
+        <w:t>but instead being the full track. E</w:t>
+      </w:r>
+      <w:r>
+        <w:t>nded up being stopped due to the large amount of diskspace used for the database as it reached a size of 250 GB and wasn</w:t>
+      </w:r>
+      <w:r>
+        <w:t>’t even completed.</w:t>
+      </w:r>
+    </w:p>
+    <w:p>
+      <w:r>
+        <w:rPr>
+          <w:noProof/>
+        </w:rPr>
+        <w:drawing>
+          <wp:anchor distT="0" distB="0" distL="114300" distR="114300" simplePos="0" relativeHeight="251662336" behindDoc="1" locked="0" layoutInCell="1" allowOverlap="1" wp14:anchorId="5A66F88E" wp14:editId="708C7436">
+            <wp:simplePos x="0" y="0"/>
+            <wp:positionH relativeFrom="column">
+              <wp:posOffset>2983230</wp:posOffset>
+            </wp:positionH>
+            <wp:positionV relativeFrom="paragraph">
+              <wp:posOffset>428699</wp:posOffset>
+            </wp:positionV>
+            <wp:extent cx="3154045" cy="2689225"/>
+            <wp:effectExtent l="0" t="0" r="8255" b="0"/>
+            <wp:wrapTight wrapText="bothSides">
+              <wp:wrapPolygon edited="0">
+                <wp:start x="0" y="0"/>
+                <wp:lineTo x="0" y="21421"/>
+                <wp:lineTo x="21526" y="21421"/>
+                <wp:lineTo x="21526" y="0"/>
+                <wp:lineTo x="0" y="0"/>
+              </wp:wrapPolygon>
+            </wp:wrapTight>
+            <wp:docPr id="1655132053" name="Picture 3"/>
+            <wp:cNvGraphicFramePr>
+              <a:graphicFrameLocks xmlns:a="http://schemas.openxmlformats.org/drawingml/2006/main" noChangeAspect="1"/>
+            </wp:cNvGraphicFramePr>
+            <a:graphic xmlns:a="http://schemas.openxmlformats.org/drawingml/2006/main">
+              <a:graphicData uri="http://schemas.openxmlformats.org/drawingml/2006/picture">
+                <pic:pic xmlns:pic="http://schemas.openxmlformats.org/drawingml/2006/picture">
+                  <pic:nvPicPr>
+                    <pic:cNvPr id="0" name="Picture 3"/>
+                    <pic:cNvPicPr>
+                      <a:picLocks noChangeAspect="1" noChangeArrowheads="1"/>
+                    </pic:cNvPicPr>
+                  </pic:nvPicPr>
+                  <pic:blipFill>
+                    <a:blip r:embed="rId8" cstate="print">
+                      <a:extLst>
+                        <a:ext uri="{28A0092B-C50C-407E-A947-70E740481C1C}">
+                          <a14:useLocalDpi xmlns:a14="http://schemas.microsoft.com/office/drawing/2010/main" val="0"/>
+                        </a:ext>
+                      </a:extLst>
+                    </a:blip>
+                    <a:srcRect/>
+                    <a:stretch>
+                      <a:fillRect/>
+                    </a:stretch>
+                  </pic:blipFill>
+                  <pic:spPr bwMode="auto">
+                    <a:xfrm>
+                      <a:off x="0" y="0"/>
+                      <a:ext cx="3154045" cy="2689225"/>
+                    </a:xfrm>
+                    <a:prstGeom prst="rect">
+                      <a:avLst/>
+                    </a:prstGeom>
+                    <a:noFill/>
+                  </pic:spPr>
+                </pic:pic>
+              </a:graphicData>
+            </a:graphic>
+            <wp14:sizeRelH relativeFrom="margin">
+              <wp14:pctWidth>0</wp14:pctWidth>
+            </wp14:sizeRelH>
+            <wp14:sizeRelV relativeFrom="margin">
+              <wp14:pctHeight>0</wp14:pctHeight>
+            </wp14:sizeRelV>
+          </wp:anchor>
+        </w:drawing>
+      </w:r>
+      <w:r>
+        <w:rPr>
+          <w:noProof/>
+        </w:rPr>
+        <w:drawing>
+          <wp:anchor distT="0" distB="0" distL="114300" distR="114300" simplePos="0" relativeHeight="251661312" behindDoc="0" locked="0" layoutInCell="1" allowOverlap="1" wp14:anchorId="5405550D" wp14:editId="76F6AE5F">
+            <wp:simplePos x="0" y="0"/>
+            <wp:positionH relativeFrom="column">
+              <wp:posOffset>-27305</wp:posOffset>
+            </wp:positionH>
+            <wp:positionV relativeFrom="paragraph">
+              <wp:posOffset>428699</wp:posOffset>
+            </wp:positionV>
+            <wp:extent cx="2582545" cy="2689225"/>
+            <wp:effectExtent l="0" t="0" r="8255" b="0"/>
+            <wp:wrapSquare wrapText="bothSides"/>
+            <wp:docPr id="246990841" name="Picture 2"/>
+            <wp:cNvGraphicFramePr>
+              <a:graphicFrameLocks xmlns:a="http://schemas.openxmlformats.org/drawingml/2006/main" noChangeAspect="1"/>
+            </wp:cNvGraphicFramePr>
+            <a:graphic xmlns:a="http://schemas.openxmlformats.org/drawingml/2006/main">
+              <a:graphicData uri="http://schemas.openxmlformats.org/drawingml/2006/picture">
+                <pic:pic xmlns:pic="http://schemas.openxmlformats.org/drawingml/2006/picture">
+                  <pic:nvPicPr>
+                    <pic:cNvPr id="0" name="Picture 2"/>
+                    <pic:cNvPicPr>
+                      <a:picLocks noChangeAspect="1" noChangeArrowheads="1"/>
+                    </pic:cNvPicPr>
+                  </pic:nvPicPr>
+                  <pic:blipFill>
+                    <a:blip r:embed="rId9" cstate="print">
+                      <a:extLst>
+                        <a:ext uri="{28A0092B-C50C-407E-A947-70E740481C1C}">
+                          <a14:useLocalDpi xmlns:a14="http://schemas.microsoft.com/office/drawing/2010/main" val="0"/>
+                        </a:ext>
+                      </a:extLst>
+                    </a:blip>
+                    <a:srcRect/>
+                    <a:stretch>
+                      <a:fillRect/>
+                    </a:stretch>
+                  </pic:blipFill>
+                  <pic:spPr bwMode="auto">
+                    <a:xfrm>
+                      <a:off x="0" y="0"/>
+                      <a:ext cx="2582545" cy="2689225"/>
+                    </a:xfrm>
+                    <a:prstGeom prst="rect">
+                      <a:avLst/>
+                    </a:prstGeom>
+                    <a:noFill/>
+                  </pic:spPr>
+                </pic:pic>
+              </a:graphicData>
+            </a:graphic>
+            <wp14:sizeRelV relativeFrom="margin">
+              <wp14:pctHeight>0</wp14:pctHeight>
+            </wp14:sizeRelV>
+          </wp:anchor>
+        </w:drawing>
+      </w:r>
+      <w:r>
+        <w:t>A third attempt using a single camera, 5 frames per second and sequential matching went much faster and resulted in the righthand image.</w:t>
+      </w:r>
+    </w:p>
+    <w:p>
+      <w:pPr>
+        <w:jc w:val="center"/>
+        <w:rPr>
+          <w:sz w:val="18"/>
+          <w:szCs w:val="18"/>
+        </w:rPr>
+      </w:pPr>
+      <w:r>
+        <w:rPr>
+          <w:sz w:val="18"/>
+          <w:szCs w:val="18"/>
+        </w:rPr>
+        <w:t>Left image: first attempt &amp; right image: third attempt</w:t>
+      </w:r>
+    </w:p>
+    <w:p>
+      <w:r>
+        <w:lastRenderedPageBreak/>
+        <w:t xml:space="preserve">It was however discovered that </w:t>
+      </w:r>
+      <w:r>
+        <w:t xml:space="preserve">the data COLMAP returns unusable is as when it was attempted to use the map generated by COLMAP in Gazebo and Rviz it was discovered that the 3d image created was being displayed incorrectly. </w:t>
+      </w:r>
+    </w:p>
+    <w:p>
+      <w:pPr>
+        <w:pStyle w:val="Heading4"/>
+      </w:pPr>
+      <w:proofErr w:type="spellStart"/>
+      <w:r>
+        <w:t>PySLAM</w:t>
+      </w:r>
+      <w:proofErr w:type="spellEnd"/>
+    </w:p>
+    <w:p>
+      <w:r>
+        <w:t xml:space="preserve">After </w:t>
+      </w:r>
+      <w:proofErr w:type="spellStart"/>
+      <w:r>
+        <w:t>PySlam</w:t>
+      </w:r>
+      <w:proofErr w:type="spellEnd"/>
+      <w:r>
+        <w:t xml:space="preserve"> was installed </w:t>
+      </w:r>
+      <w:r>
+        <w:t xml:space="preserve">it was decided to try out its </w:t>
+      </w:r>
+      <w:r>
+        <w:t>Visual odometry</w:t>
+      </w:r>
+      <w:r>
+        <w:t xml:space="preserve"> feature. It seemed to show what this project needed with the demo setup however when attempts were made to apply it to our video</w:t>
+      </w:r>
+      <w:r>
+        <w:t>,</w:t>
+      </w:r>
+      <w:r>
+        <w:t xml:space="preserve"> it was discovered that we were unable to acquire data values that were needed for </w:t>
+      </w:r>
+      <w:r>
+        <w:t xml:space="preserve">the </w:t>
+      </w:r>
+      <w:proofErr w:type="spellStart"/>
+      <w:r>
+        <w:t>groundtruth</w:t>
+      </w:r>
+      <w:proofErr w:type="spellEnd"/>
+      <w:r>
+        <w:t xml:space="preserve"> dataset which was needed to run the program correctly. Although several attempts were made to acquire said data values none where successful.</w:t>
+      </w:r>
+      <w:r>
+        <w:t xml:space="preserve"> </w:t>
+      </w:r>
+    </w:p>
+    <w:p>
+      <w:pPr>
+        <w:pStyle w:val="Heading4"/>
+      </w:pPr>
+      <w:r>
+        <w:t>RTBA</w:t>
+      </w:r>
+      <w:r>
+        <w:t>-</w:t>
+      </w:r>
+      <w:r>
+        <w:t>M</w:t>
+      </w:r>
+      <w:r>
+        <w:t>ap</w:t>
+      </w:r>
+    </w:p>
+    <w:p>
+      <w:r>
+        <w:t xml:space="preserve">Using RTBA-Map did require the installation of ROS2 however this was only needed as its backend as the program itself had its own graphical interface. Using RTBA-Map was relatively simple as it had all the installation instructions and tutorials on how to use it that were needed. </w:t>
+      </w:r>
+      <w:r>
+        <w:fldChar w:fldCharType="begin"/>
+      </w:r>
+      <w:r>
+        <w:instrText xml:space="preserve"> ADDIN ZOTERO_ITEM CSL_CITATION {"citationID":"RciZdpmN","properties":{"formattedCitation":"[9]","plainCitation":"[9]","noteIndex":0},"citationItems":[{"id":91,"uris":["http://zotero.org/users/15129247/items/6RKAGXF7"],"itemData":{"id":91,"type":"webpage","abstract":"RTAB-Map library and standalone application. Contribute to introlab/rtabmap development by creating an account on GitHub.","container-title":"GitHub","language":"en","title":"Home","URL":"https://github.com/introlab/rtabmap/wiki/Home","accessed":{"date-parts":[["2026",6,8]]}}}],"schema":"https://github.com/citation-style-language/schema/raw/master/csl-citation.json"} </w:instrText>
+      </w:r>
+      <w:r>
+        <w:fldChar w:fldCharType="separate"/>
+      </w:r>
+      <w:r>
+        <w:rPr>
+          <w:rFonts w:ascii="Aptos" w:hAnsi="Aptos"/>
+        </w:rPr>
+        <w:t>[9]</w:t>
+      </w:r>
+      <w:r>
+        <w:fldChar w:fldCharType="end"/>
+      </w:r>
+      <w:r>
+        <w:t xml:space="preserve"> </w:t>
+      </w:r>
+      <w:r>
+        <w:t xml:space="preserve">After adjusting the values to suit our video an attempt was made to run the program. </w:t>
+      </w:r>
+    </w:p>
+    <w:p>
+      <w:r>
+        <w:rPr>
+          <w:noProof/>
+        </w:rPr>
+        <w:drawing>
+          <wp:anchor distT="0" distB="0" distL="114300" distR="114300" simplePos="0" relativeHeight="251663360" behindDoc="1" locked="0" layoutInCell="1" allowOverlap="1" wp14:anchorId="1FC45034" wp14:editId="6CDB15A6">
+            <wp:simplePos x="0" y="0"/>
+            <wp:positionH relativeFrom="column">
+              <wp:posOffset>1142365</wp:posOffset>
+            </wp:positionH>
+            <wp:positionV relativeFrom="paragraph">
+              <wp:posOffset>635</wp:posOffset>
+            </wp:positionV>
+            <wp:extent cx="2938780" cy="1786890"/>
+            <wp:effectExtent l="0" t="0" r="0" b="3810"/>
+            <wp:wrapSquare wrapText="bothSides"/>
+            <wp:docPr id="783455361" name="Picture 4" descr="A computer with a screen on&#10;&#10;AI-generated content may be incorrect."/>
+            <wp:cNvGraphicFramePr>
+              <a:graphicFrameLocks xmlns:a="http://schemas.openxmlformats.org/drawingml/2006/main" noChangeAspect="1"/>
+            </wp:cNvGraphicFramePr>
+            <a:graphic xmlns:a="http://schemas.openxmlformats.org/drawingml/2006/main">
+              <a:graphicData uri="http://schemas.openxmlformats.org/drawingml/2006/picture">
+                <pic:pic xmlns:pic="http://schemas.openxmlformats.org/drawingml/2006/picture">
+                  <pic:nvPicPr>
+                    <pic:cNvPr id="783455361" name="Picture 4" descr="A computer with a screen on&#10;&#10;AI-generated content may be incorrect."/>
+                    <pic:cNvPicPr>
+                      <a:picLocks noChangeAspect="1" noChangeArrowheads="1"/>
+                    </pic:cNvPicPr>
+                  </pic:nvPicPr>
+                  <pic:blipFill rotWithShape="1">
+                    <a:blip r:embed="rId10" cstate="print">
+                      <a:extLst>
+                        <a:ext uri="{28A0092B-C50C-407E-A947-70E740481C1C}">
+                          <a14:useLocalDpi xmlns:a14="http://schemas.microsoft.com/office/drawing/2010/main" val="0"/>
+                        </a:ext>
+                      </a:extLst>
+                    </a:blip>
+                    <a:srcRect t="18251" b="33858"/>
+                    <a:stretch>
+                      <a:fillRect/>
+                    </a:stretch>
+                  </pic:blipFill>
+                  <pic:spPr bwMode="auto">
+                    <a:xfrm flipH="1">
+                      <a:off x="0" y="0"/>
+                      <a:ext cx="2938780" cy="1786890"/>
+                    </a:xfrm>
+                    <a:prstGeom prst="rect">
+                      <a:avLst/>
+                    </a:prstGeom>
+                    <a:noFill/>
+                    <a:ln>
+                      <a:noFill/>
+                    </a:ln>
+                    <a:extLst>
+                      <a:ext uri="{53640926-AAD7-44D8-BBD7-CCE9431645EC}">
+                        <a14:shadowObscured xmlns:a14="http://schemas.microsoft.com/office/drawing/2010/main"/>
+                      </a:ext>
+                    </a:extLst>
+                  </pic:spPr>
+                </pic:pic>
+              </a:graphicData>
+            </a:graphic>
+            <wp14:sizeRelH relativeFrom="margin">
+              <wp14:pctWidth>0</wp14:pctWidth>
+            </wp14:sizeRelH>
+            <wp14:sizeRelV relativeFrom="margin">
+              <wp14:pctHeight>0</wp14:pctHeight>
+            </wp14:sizeRelV>
+          </wp:anchor>
+        </w:drawing>
+      </w:r>
     </w:p>
     <w:p/>
-    <w:p>
-      <w:pPr>
-        <w:pStyle w:val="ListParagraph"/>
-        <w:numPr>
-          <w:ilvl w:val="0"/>
-          <w:numId w:val="11"/>
-        </w:numPr>
+    <w:p/>
+    <w:p>
+      <w:pPr>
         <w:rPr>
           <w:rFonts w:asciiTheme="majorHAnsi" w:eastAsiaTheme="majorEastAsia" w:hAnsiTheme="majorHAnsi" w:cstheme="majorBidi"/>
           <w:color w:val="0F4761" w:themeColor="accent1" w:themeShade="BF"/>
@@ -2363,33 +3364,43 @@
           <w:szCs w:val="40"/>
         </w:rPr>
       </w:pPr>
-      <w:r>
-        <w:rPr>
-          <w:rFonts w:asciiTheme="majorHAnsi" w:eastAsiaTheme="majorEastAsia" w:hAnsiTheme="majorHAnsi" w:cstheme="majorBidi"/>
-          <w:color w:val="0F4761" w:themeColor="accent1" w:themeShade="BF"/>
-          <w:sz w:val="40"/>
-          <w:szCs w:val="40"/>
-        </w:rPr>
-        <w:t xml:space="preserve">Conclusion/advice </w:t>
-      </w:r>
-    </w:p>
-    <w:p>
-      <w:bookmarkStart w:id="7" w:name="_Hlk224037135"/>
-      <w:r>
-        <w:t>Conclusion/advice</w:t>
-      </w:r>
-      <w:bookmarkEnd w:id="7"/>
-      <w:r>
-        <w:br/>
-        <w:t>• Start your conclusion with a brief summary and your research question.</w:t>
-      </w:r>
-      <w:r>
-        <w:br/>
-        <w:t>• Here you interpret the results and reach a judgement. Draw a conclusion for each part and of course an overall conclusion (what is the answer to your research question?)</w:t>
-      </w:r>
-      <w:r>
-        <w:br/>
-        <w:t>• Your conclusions are written in the form of advice.</w:t>
+    </w:p>
+    <w:p/>
+    <w:p/>
+    <w:p>
+      <w:r>
+        <w:t xml:space="preserve">As seen in the image above the program ran successfully. Later on however when attempting to turn the processed video into a map the entire program crashed. After </w:t>
+      </w:r>
+      <w:r>
+        <w:t>several</w:t>
+      </w:r>
+      <w:r>
+        <w:t xml:space="preserve"> attempts </w:t>
+      </w:r>
+      <w:r>
+        <w:t>were</w:t>
+      </w:r>
+      <w:r>
+        <w:t xml:space="preserve"> made to fix this it was discovered that using monocular mapping in this program wasn’t feasible as it needs to be able to determine distance</w:t>
+      </w:r>
+      <w:r>
+        <w:t xml:space="preserve"> made. This is possible</w:t>
+      </w:r>
+      <w:r>
+        <w:t xml:space="preserve"> using </w:t>
+      </w:r>
+      <w:r>
+        <w:t>a stereo camera setup which in other words means that is program is also not an option</w:t>
+      </w:r>
+      <w:r>
+        <w:t>.</w:t>
+      </w:r>
+    </w:p>
+    <w:p/>
+    <w:p/>
+    <w:p>
+      <w:r>
+        <w:br w:type="page"/>
       </w:r>
     </w:p>
     <w:p>
@@ -2400,27 +3411,33 @@
           <w:numId w:val="11"/>
         </w:numPr>
       </w:pPr>
-      <w:bookmarkStart w:id="8" w:name="_Toc230691726"/>
-      <w:r>
-        <w:t>References</w:t>
-      </w:r>
-      <w:bookmarkEnd w:id="8"/>
-    </w:p>
-    <w:p>
-      <w:r>
-        <w:t>References</w:t>
-      </w:r>
-      <w:r>
-        <w:br/>
-        <w:t>• According to APA or IEEE.</w:t>
-      </w:r>
-      <w:r>
-        <w:br/>
-        <w:t>• Includes all sources you have used and cited in your report.</w:t>
-      </w:r>
-      <w:r>
-        <w:br/>
-        <w:t>• Relevant and reliable sources.</w:t>
+      <w:bookmarkStart w:id="10" w:name="_Toc231830383"/>
+      <w:r>
+        <w:lastRenderedPageBreak/>
+        <w:t>Conclusion</w:t>
+      </w:r>
+      <w:bookmarkEnd w:id="10"/>
+    </w:p>
+    <w:p>
+      <w:r>
+        <w:t xml:space="preserve">In conclusion based upon the results and current setup of the kart the answer to question: “How to navigate a route using a self-driving kart without the use of a GPS and a GPU?” is inconclusive as the tested programs weren’t able to give a functioning result.  </w:t>
+      </w:r>
+    </w:p>
+    <w:p>
+      <w:r>
+        <w:t xml:space="preserve">Based </w:t>
+      </w:r>
+      <w:r>
+        <w:t>on</w:t>
+      </w:r>
+      <w:r>
+        <w:t xml:space="preserve"> the results from the different programs there are a few </w:t>
+      </w:r>
+      <w:r>
+        <w:t>mayor issues that resulted in the inconclusiveness of this research paper</w:t>
+      </w:r>
+      <w:r>
+        <w:t>. Such as understanding of a program, missing datasets or incompatible setup. Outside of these issues the results of the research does show that it could be possible to navigate a route if the RDW makes changes to the setup. An example of these changes would be a stereo camera setup or a GPS.</w:t>
       </w:r>
     </w:p>
     <w:p>
@@ -2431,45 +3448,501 @@
           <w:numId w:val="11"/>
         </w:numPr>
       </w:pPr>
-      <w:bookmarkStart w:id="9" w:name="_Toc230691727"/>
-      <w:r>
-        <w:t>Glossary of terms</w:t>
-      </w:r>
-      <w:r>
-        <w:t xml:space="preserve">/ </w:t>
-      </w:r>
-      <w:r>
-        <w:t>list of symbols</w:t>
-      </w:r>
-      <w:r>
-        <w:t xml:space="preserve"> (</w:t>
-      </w:r>
-      <w:r>
-        <w:t>only if functional</w:t>
-      </w:r>
-      <w:r>
-        <w:t>)</w:t>
-      </w:r>
-      <w:bookmarkEnd w:id="9"/>
-    </w:p>
-    <w:p>
-      <w:r>
-        <w:t xml:space="preserve">Glossary of terms/ list of symbols (only if functional) </w:t>
-      </w:r>
-    </w:p>
-    <w:p>
-      <w:r>
-        <w:t xml:space="preserve">• Specialist terms (in alphabetical order) </w:t>
-      </w:r>
-    </w:p>
-    <w:p>
-      <w:r>
-        <w:t xml:space="preserve">• Symbols if the report contains multiple symbols that are used more than once. </w:t>
-      </w:r>
-    </w:p>
-    <w:p>
-      <w:r>
-        <w:t>Note! Both specialist terms and symbols must be explained the first time they are used in the text.</w:t>
+      <w:bookmarkStart w:id="11" w:name="_Toc231830384"/>
+      <w:r>
+        <w:t>References</w:t>
+      </w:r>
+      <w:bookmarkEnd w:id="11"/>
+    </w:p>
+    <w:p>
+      <w:pPr>
+        <w:pStyle w:val="Bibliography"/>
+        <w:rPr>
+          <w:rFonts w:ascii="Aptos" w:hAnsi="Aptos"/>
+          <w:lang w:val="nl-NL"/>
+        </w:rPr>
+      </w:pPr>
+      <w:r>
+        <w:fldChar w:fldCharType="begin"/>
+      </w:r>
+      <w:r>
+        <w:rPr>
+          <w:lang w:val="nl-NL"/>
+        </w:rPr>
+        <w:instrText xml:space="preserve"> ADDIN ZOTERO_BIBL {"uncited":[],"omitted":[],"custom":[]} CSL_BIBLIOGRAPHY </w:instrText>
+      </w:r>
+      <w:r>
+        <w:fldChar w:fldCharType="separate"/>
+      </w:r>
+      <w:r>
+        <w:rPr>
+          <w:rFonts w:ascii="Aptos" w:hAnsi="Aptos"/>
+          <w:lang w:val="nl-NL"/>
+        </w:rPr>
+        <w:t>[1]</w:t>
+      </w:r>
+      <w:r>
+        <w:rPr>
+          <w:rFonts w:ascii="Aptos" w:hAnsi="Aptos"/>
+          <w:lang w:val="nl-NL"/>
+        </w:rPr>
+        <w:tab/>
+        <w:t xml:space="preserve">‘ROS 2 </w:t>
+      </w:r>
+      <w:proofErr w:type="spellStart"/>
+      <w:r>
+        <w:rPr>
+          <w:rFonts w:ascii="Aptos" w:hAnsi="Aptos"/>
+          <w:lang w:val="nl-NL"/>
+        </w:rPr>
+        <w:t>Documentation</w:t>
+      </w:r>
+      <w:proofErr w:type="spellEnd"/>
+      <w:r>
+        <w:rPr>
+          <w:rFonts w:ascii="Aptos" w:hAnsi="Aptos"/>
+          <w:lang w:val="nl-NL"/>
+        </w:rPr>
+        <w:t xml:space="preserve"> — ROS 2 </w:t>
+      </w:r>
+      <w:proofErr w:type="spellStart"/>
+      <w:r>
+        <w:rPr>
+          <w:rFonts w:ascii="Aptos" w:hAnsi="Aptos"/>
+          <w:lang w:val="nl-NL"/>
+        </w:rPr>
+        <w:t>Documentation</w:t>
+      </w:r>
+      <w:proofErr w:type="spellEnd"/>
+      <w:r>
+        <w:rPr>
+          <w:rFonts w:ascii="Aptos" w:hAnsi="Aptos"/>
+          <w:lang w:val="nl-NL"/>
+        </w:rPr>
+        <w:t xml:space="preserve">: Jazzy </w:t>
+      </w:r>
+      <w:proofErr w:type="spellStart"/>
+      <w:r>
+        <w:rPr>
+          <w:rFonts w:ascii="Aptos" w:hAnsi="Aptos"/>
+          <w:lang w:val="nl-NL"/>
+        </w:rPr>
+        <w:t>documentation</w:t>
+      </w:r>
+      <w:proofErr w:type="spellEnd"/>
+      <w:r>
+        <w:rPr>
+          <w:rFonts w:ascii="Aptos" w:hAnsi="Aptos"/>
+          <w:lang w:val="nl-NL"/>
+        </w:rPr>
+        <w:t>’. Geraadpleegd: 8 juni 2026. [Online]. Beschikbaar op: https://docs.ros.org/en/jazzy/index.html</w:t>
+      </w:r>
+    </w:p>
+    <w:p>
+      <w:pPr>
+        <w:pStyle w:val="Bibliography"/>
+        <w:rPr>
+          <w:rFonts w:ascii="Aptos" w:hAnsi="Aptos"/>
+          <w:lang w:val="nl-NL"/>
+        </w:rPr>
+      </w:pPr>
+      <w:r>
+        <w:rPr>
+          <w:rFonts w:ascii="Aptos" w:hAnsi="Aptos"/>
+        </w:rPr>
+        <w:t>[2]</w:t>
+      </w:r>
+      <w:r>
+        <w:rPr>
+          <w:rFonts w:ascii="Aptos" w:hAnsi="Aptos"/>
+        </w:rPr>
+        <w:tab/>
+      </w:r>
+      <w:proofErr w:type="spellStart"/>
+      <w:r>
+        <w:rPr>
+          <w:rFonts w:ascii="Aptos" w:hAnsi="Aptos"/>
+        </w:rPr>
+        <w:t>automaticaddison</w:t>
+      </w:r>
+      <w:proofErr w:type="spellEnd"/>
+      <w:r>
+        <w:rPr>
+          <w:rFonts w:ascii="Aptos" w:hAnsi="Aptos"/>
+        </w:rPr>
+        <w:t xml:space="preserve">, ‘How to Install ROS 2 Navigation (Nav2) – ROS 2 Jazzy’. </w:t>
+      </w:r>
+      <w:r>
+        <w:rPr>
+          <w:rFonts w:ascii="Aptos" w:hAnsi="Aptos"/>
+          <w:lang w:val="nl-NL"/>
+        </w:rPr>
+        <w:t>Geraadpleegd: 8 juni 2026. [Online]. Beschikbaar op: https://automaticaddison.com/how-to-install-ros-2-navigation-nav2-ros-2-jazzy/</w:t>
+      </w:r>
+    </w:p>
+    <w:p>
+      <w:pPr>
+        <w:pStyle w:val="Bibliography"/>
+        <w:rPr>
+          <w:rFonts w:ascii="Aptos" w:hAnsi="Aptos"/>
+          <w:lang w:val="nl-NL"/>
+        </w:rPr>
+      </w:pPr>
+      <w:r>
+        <w:rPr>
+          <w:rFonts w:ascii="Aptos" w:hAnsi="Aptos"/>
+        </w:rPr>
+        <w:t>[3]</w:t>
+      </w:r>
+      <w:r>
+        <w:rPr>
+          <w:rFonts w:ascii="Aptos" w:hAnsi="Aptos"/>
+        </w:rPr>
+        <w:tab/>
+        <w:t xml:space="preserve">‘Setting up a robot simulation (Gazebo) — ROS 2 Documentation: Jazzy documentation’. </w:t>
+      </w:r>
+      <w:r>
+        <w:rPr>
+          <w:rFonts w:ascii="Aptos" w:hAnsi="Aptos"/>
+          <w:lang w:val="nl-NL"/>
+        </w:rPr>
+        <w:t>Geraadpleegd: 8 juni 2026. [Online]. Beschikbaar op: https://docs.ros.org/en/jazzy/Tutorials/Advanced/Simulators/Gazebo/Gazebo.html#prerequisites</w:t>
+      </w:r>
+    </w:p>
+    <w:p>
+      <w:pPr>
+        <w:pStyle w:val="Bibliography"/>
+        <w:rPr>
+          <w:rFonts w:ascii="Aptos" w:hAnsi="Aptos"/>
+          <w:lang w:val="nl-NL"/>
+        </w:rPr>
+      </w:pPr>
+      <w:r>
+        <w:rPr>
+          <w:rFonts w:ascii="Aptos" w:hAnsi="Aptos"/>
+          <w:lang w:val="nl-NL"/>
+        </w:rPr>
+        <w:t>[4]</w:t>
+      </w:r>
+      <w:r>
+        <w:rPr>
+          <w:rFonts w:ascii="Aptos" w:hAnsi="Aptos"/>
+          <w:lang w:val="nl-NL"/>
+        </w:rPr>
+        <w:tab/>
+        <w:t>‘</w:t>
+      </w:r>
+      <w:proofErr w:type="spellStart"/>
+      <w:r>
+        <w:rPr>
+          <w:rFonts w:ascii="Aptos" w:hAnsi="Aptos"/>
+          <w:lang w:val="nl-NL"/>
+        </w:rPr>
+        <w:t>RViz</w:t>
+      </w:r>
+      <w:proofErr w:type="spellEnd"/>
+      <w:r>
+        <w:rPr>
+          <w:rFonts w:ascii="Aptos" w:hAnsi="Aptos"/>
+          <w:lang w:val="nl-NL"/>
+        </w:rPr>
+        <w:t xml:space="preserve"> — ROS 2 </w:t>
+      </w:r>
+      <w:proofErr w:type="spellStart"/>
+      <w:r>
+        <w:rPr>
+          <w:rFonts w:ascii="Aptos" w:hAnsi="Aptos"/>
+          <w:lang w:val="nl-NL"/>
+        </w:rPr>
+        <w:t>Documentation</w:t>
+      </w:r>
+      <w:proofErr w:type="spellEnd"/>
+      <w:r>
+        <w:rPr>
+          <w:rFonts w:ascii="Aptos" w:hAnsi="Aptos"/>
+          <w:lang w:val="nl-NL"/>
+        </w:rPr>
+        <w:t xml:space="preserve">: Jazzy </w:t>
+      </w:r>
+      <w:proofErr w:type="spellStart"/>
+      <w:r>
+        <w:rPr>
+          <w:rFonts w:ascii="Aptos" w:hAnsi="Aptos"/>
+          <w:lang w:val="nl-NL"/>
+        </w:rPr>
+        <w:t>documentation</w:t>
+      </w:r>
+      <w:proofErr w:type="spellEnd"/>
+      <w:r>
+        <w:rPr>
+          <w:rFonts w:ascii="Aptos" w:hAnsi="Aptos"/>
+          <w:lang w:val="nl-NL"/>
+        </w:rPr>
+        <w:t>’. Geraadpleegd: 8 juni 2026. [Online]. Beschikbaar op: https://docs.ros.org/en/jazzy/Tutorials/Intermediate/RViz/RViz-Main.html</w:t>
+      </w:r>
+    </w:p>
+    <w:p>
+      <w:pPr>
+        <w:pStyle w:val="Bibliography"/>
+        <w:rPr>
+          <w:rFonts w:ascii="Aptos" w:hAnsi="Aptos"/>
+          <w:lang w:val="nl-NL"/>
+        </w:rPr>
+      </w:pPr>
+      <w:r>
+        <w:rPr>
+          <w:rFonts w:ascii="Aptos" w:hAnsi="Aptos"/>
+          <w:lang w:val="nl-NL"/>
+        </w:rPr>
+        <w:t>[5]</w:t>
+      </w:r>
+      <w:r>
+        <w:rPr>
+          <w:rFonts w:ascii="Aptos" w:hAnsi="Aptos"/>
+          <w:lang w:val="nl-NL"/>
+        </w:rPr>
+        <w:tab/>
+        <w:t xml:space="preserve">‘COLMAP — COLMAP 4.1.0.dev0 | 43dd3bb2 (2026-03-16) </w:t>
+      </w:r>
+      <w:proofErr w:type="spellStart"/>
+      <w:r>
+        <w:rPr>
+          <w:rFonts w:ascii="Aptos" w:hAnsi="Aptos"/>
+          <w:lang w:val="nl-NL"/>
+        </w:rPr>
+        <w:t>documentation</w:t>
+      </w:r>
+      <w:proofErr w:type="spellEnd"/>
+      <w:r>
+        <w:rPr>
+          <w:rFonts w:ascii="Aptos" w:hAnsi="Aptos"/>
+          <w:lang w:val="nl-NL"/>
+        </w:rPr>
+        <w:t>’. Geraadpleegd: 8 juni 2026. [Online]. Beschikbaar op: https://colmap.github.io/</w:t>
+      </w:r>
+    </w:p>
+    <w:p>
+      <w:pPr>
+        <w:pStyle w:val="Bibliography"/>
+        <w:rPr>
+          <w:rFonts w:ascii="Aptos" w:hAnsi="Aptos"/>
+          <w:lang w:val="nl-NL"/>
+        </w:rPr>
+      </w:pPr>
+      <w:r>
+        <w:rPr>
+          <w:rFonts w:ascii="Aptos" w:hAnsi="Aptos"/>
+          <w:lang w:val="nl-NL"/>
+        </w:rPr>
+        <w:t>[6]</w:t>
+      </w:r>
+      <w:r>
+        <w:rPr>
+          <w:rFonts w:ascii="Aptos" w:hAnsi="Aptos"/>
+          <w:lang w:val="nl-NL"/>
+        </w:rPr>
+        <w:tab/>
+        <w:t>‘</w:t>
+      </w:r>
+      <w:proofErr w:type="spellStart"/>
+      <w:r>
+        <w:rPr>
+          <w:rFonts w:ascii="Aptos" w:hAnsi="Aptos"/>
+          <w:lang w:val="nl-NL"/>
+        </w:rPr>
+        <w:t>Navigating</w:t>
+      </w:r>
+      <w:proofErr w:type="spellEnd"/>
+      <w:r>
+        <w:rPr>
+          <w:rFonts w:ascii="Aptos" w:hAnsi="Aptos"/>
+          <w:lang w:val="nl-NL"/>
+        </w:rPr>
+        <w:t xml:space="preserve"> </w:t>
+      </w:r>
+      <w:proofErr w:type="spellStart"/>
+      <w:r>
+        <w:rPr>
+          <w:rFonts w:ascii="Aptos" w:hAnsi="Aptos"/>
+          <w:lang w:val="nl-NL"/>
+        </w:rPr>
+        <w:t>while</w:t>
+      </w:r>
+      <w:proofErr w:type="spellEnd"/>
+      <w:r>
+        <w:rPr>
+          <w:rFonts w:ascii="Aptos" w:hAnsi="Aptos"/>
+          <w:lang w:val="nl-NL"/>
+        </w:rPr>
+        <w:t xml:space="preserve"> </w:t>
+      </w:r>
+      <w:proofErr w:type="spellStart"/>
+      <w:r>
+        <w:rPr>
+          <w:rFonts w:ascii="Aptos" w:hAnsi="Aptos"/>
+          <w:lang w:val="nl-NL"/>
+        </w:rPr>
+        <w:t>Mapping</w:t>
+      </w:r>
+      <w:proofErr w:type="spellEnd"/>
+      <w:r>
+        <w:rPr>
+          <w:rFonts w:ascii="Aptos" w:hAnsi="Aptos"/>
+          <w:lang w:val="nl-NL"/>
+        </w:rPr>
+        <w:t xml:space="preserve"> (SLAM) — Nav2 1.0.0 </w:t>
+      </w:r>
+      <w:proofErr w:type="spellStart"/>
+      <w:r>
+        <w:rPr>
+          <w:rFonts w:ascii="Aptos" w:hAnsi="Aptos"/>
+          <w:lang w:val="nl-NL"/>
+        </w:rPr>
+        <w:t>documentation</w:t>
+      </w:r>
+      <w:proofErr w:type="spellEnd"/>
+      <w:r>
+        <w:rPr>
+          <w:rFonts w:ascii="Aptos" w:hAnsi="Aptos"/>
+          <w:lang w:val="nl-NL"/>
+        </w:rPr>
+        <w:t>’. Geraadpleegd: 8 juni 2026. [Online]. Beschikbaar op: https://docs.nav2.org/tutorials/docs/navigation2_with_slam.html</w:t>
+      </w:r>
+    </w:p>
+    <w:p>
+      <w:pPr>
+        <w:pStyle w:val="Bibliography"/>
+        <w:rPr>
+          <w:rFonts w:ascii="Aptos" w:hAnsi="Aptos"/>
+          <w:lang w:val="nl-NL"/>
+        </w:rPr>
+      </w:pPr>
+      <w:r>
+        <w:rPr>
+          <w:rFonts w:ascii="Aptos" w:hAnsi="Aptos"/>
+          <w:lang w:val="nl-NL"/>
+        </w:rPr>
+        <w:t>[7]</w:t>
+      </w:r>
+      <w:r>
+        <w:rPr>
+          <w:rFonts w:ascii="Aptos" w:hAnsi="Aptos"/>
+          <w:lang w:val="nl-NL"/>
+        </w:rPr>
+        <w:tab/>
+        <w:t xml:space="preserve">L. </w:t>
+      </w:r>
+      <w:proofErr w:type="spellStart"/>
+      <w:r>
+        <w:rPr>
+          <w:rFonts w:ascii="Aptos" w:hAnsi="Aptos"/>
+          <w:lang w:val="nl-NL"/>
+        </w:rPr>
+        <w:t>Freda</w:t>
+      </w:r>
+      <w:proofErr w:type="spellEnd"/>
+      <w:r>
+        <w:rPr>
+          <w:rFonts w:ascii="Aptos" w:hAnsi="Aptos"/>
+          <w:lang w:val="nl-NL"/>
+        </w:rPr>
+        <w:t xml:space="preserve">, </w:t>
+      </w:r>
+      <w:proofErr w:type="spellStart"/>
+      <w:r>
+        <w:rPr>
+          <w:rFonts w:ascii="Aptos" w:hAnsi="Aptos"/>
+          <w:i/>
+          <w:iCs/>
+          <w:lang w:val="nl-NL"/>
+        </w:rPr>
+        <w:t>luigifreda</w:t>
+      </w:r>
+      <w:proofErr w:type="spellEnd"/>
+      <w:r>
+        <w:rPr>
+          <w:rFonts w:ascii="Aptos" w:hAnsi="Aptos"/>
+          <w:i/>
+          <w:iCs/>
+          <w:lang w:val="nl-NL"/>
+        </w:rPr>
+        <w:t>/</w:t>
+      </w:r>
+      <w:proofErr w:type="spellStart"/>
+      <w:r>
+        <w:rPr>
+          <w:rFonts w:ascii="Aptos" w:hAnsi="Aptos"/>
+          <w:i/>
+          <w:iCs/>
+          <w:lang w:val="nl-NL"/>
+        </w:rPr>
+        <w:t>pyslam</w:t>
+      </w:r>
+      <w:proofErr w:type="spellEnd"/>
+      <w:r>
+        <w:rPr>
+          <w:rFonts w:ascii="Aptos" w:hAnsi="Aptos"/>
+          <w:lang w:val="nl-NL"/>
+        </w:rPr>
+        <w:t>. (8 juni 2026). Python. Geraadpleegd: 8 juni 2026. [Online]. Beschikbaar op: https://github.com/luigifreda/pyslam</w:t>
+      </w:r>
+    </w:p>
+    <w:p>
+      <w:pPr>
+        <w:pStyle w:val="Bibliography"/>
+        <w:rPr>
+          <w:rFonts w:ascii="Aptos" w:hAnsi="Aptos"/>
+          <w:lang w:val="nl-NL"/>
+        </w:rPr>
+      </w:pPr>
+      <w:r>
+        <w:rPr>
+          <w:rFonts w:ascii="Aptos" w:hAnsi="Aptos"/>
+          <w:lang w:val="nl-NL"/>
+        </w:rPr>
+        <w:t>[8]</w:t>
+      </w:r>
+      <w:r>
+        <w:rPr>
+          <w:rFonts w:ascii="Aptos" w:hAnsi="Aptos"/>
+          <w:lang w:val="nl-NL"/>
+        </w:rPr>
+        <w:tab/>
+        <w:t>‘RTAB-Map’, RTAB-Map. Geraadpleegd: 8 juni 2026. [Online]. Beschikbaar op: http://introlab.github.io/rtabmap/</w:t>
+      </w:r>
+    </w:p>
+    <w:p>
+      <w:pPr>
+        <w:pStyle w:val="Bibliography"/>
+        <w:rPr>
+          <w:rFonts w:ascii="Aptos" w:hAnsi="Aptos"/>
+          <w:lang w:val="nl-NL"/>
+        </w:rPr>
+      </w:pPr>
+      <w:r>
+        <w:rPr>
+          <w:rFonts w:ascii="Aptos" w:hAnsi="Aptos"/>
+          <w:lang w:val="nl-NL"/>
+        </w:rPr>
+        <w:t>[9]</w:t>
+      </w:r>
+      <w:r>
+        <w:rPr>
+          <w:rFonts w:ascii="Aptos" w:hAnsi="Aptos"/>
+          <w:lang w:val="nl-NL"/>
+        </w:rPr>
+        <w:tab/>
+        <w:t>‘Home’, GitHub. Geraadpleegd: 8 juni 2026. [Online]. Beschikbaar op: https://github.com/introlab/rtabmap/wiki/Home</w:t>
+      </w:r>
+    </w:p>
+    <w:p>
+      <w:pPr>
+        <w:rPr>
+          <w:lang w:val="nl-NL"/>
+        </w:rPr>
+      </w:pPr>
+      <w:r>
+        <w:fldChar w:fldCharType="end"/>
       </w:r>
     </w:p>
     <w:p>
@@ -2480,174 +3953,196 @@
           <w:numId w:val="11"/>
         </w:numPr>
       </w:pPr>
-      <w:bookmarkStart w:id="10" w:name="_Toc230691728"/>
+      <w:bookmarkStart w:id="12" w:name="_Toc231830385"/>
+      <w:r>
+        <w:t>Glossary</w:t>
+      </w:r>
+      <w:bookmarkEnd w:id="12"/>
+    </w:p>
+    <w:p>
+      <w:r>
+        <w:rPr>
+          <w:lang w:val="nl-NL"/>
+        </w:rPr>
+        <w:t xml:space="preserve">RDW – </w:t>
+      </w:r>
+      <w:r>
+        <w:rPr>
+          <w:lang w:val="nl-NL"/>
+        </w:rPr>
+        <w:t xml:space="preserve">Rijksdienst voor het Wegverkeer. </w:t>
+      </w:r>
+      <w:r>
+        <w:t>This is the</w:t>
+      </w:r>
+      <w:r>
+        <w:t xml:space="preserve"> </w:t>
+      </w:r>
+      <w:r>
+        <w:t>Dutch</w:t>
+      </w:r>
+      <w:r>
+        <w:t xml:space="preserve"> Vehicle Authority responsible for</w:t>
+      </w:r>
+      <w:r>
+        <w:t xml:space="preserve"> </w:t>
+      </w:r>
+      <w:r>
+        <w:t>vehicle registration</w:t>
+      </w:r>
+      <w:r>
+        <w:t xml:space="preserve">, determine road worthiness of vehicles and </w:t>
+      </w:r>
+      <w:r>
+        <w:t>road safety</w:t>
+      </w:r>
+      <w:r>
+        <w:t>.</w:t>
+      </w:r>
+    </w:p>
+    <w:p>
+      <w:r>
+        <w:t>Intel NUC</w:t>
+      </w:r>
+      <w:r>
+        <w:t xml:space="preserve"> – </w:t>
+      </w:r>
+      <w:r>
+        <w:t xml:space="preserve">A small form-factor computer developed by Intel, used in this project to process </w:t>
+      </w:r>
+      <w:r>
+        <w:t xml:space="preserve"> </w:t>
+      </w:r>
+      <w:r>
+        <w:t>sensor data and control the autonomous kart.</w:t>
+      </w:r>
+    </w:p>
+    <w:p>
+      <w:r>
+        <w:t>Gazebo</w:t>
+      </w:r>
+      <w:r>
+        <w:t xml:space="preserve"> – </w:t>
+      </w:r>
+      <w:r>
+        <w:t>an open-source 3D robotics simulator. Can be used to design, test and visualize robots in a virtual environment.</w:t>
+      </w:r>
+    </w:p>
+    <w:p>
+      <w:r>
+        <w:t xml:space="preserve">Rviz – is a Visualization tool for ROS which allows users to </w:t>
+      </w:r>
+      <w:r>
+        <w:t>visualize robot states, sensor data, and environments in real time.</w:t>
+      </w:r>
+    </w:p>
+    <w:p>
       <w:r>
         <w:lastRenderedPageBreak/>
-        <w:t>Attachments</w:t>
-      </w:r>
-      <w:bookmarkEnd w:id="10"/>
-    </w:p>
-    <w:p>
-      <w:r>
-        <w:t xml:space="preserve">Attachments </w:t>
-      </w:r>
-    </w:p>
-    <w:p>
-      <w:r>
-        <w:t xml:space="preserve">• Attachments such as pieces of code, an advisory report, a manual, test results, etc. </w:t>
-      </w:r>
-    </w:p>
-    <w:p>
-      <w:r>
-        <w:t>Note! All attachments are referred to in the text</w:t>
-      </w:r>
-    </w:p>
-    <w:p/>
-    <w:p>
-      <w:hyperlink r:id="rId8" w:history="1">
-        <w:r>
-          <w:rPr>
-            <w:rStyle w:val="Hyperlink"/>
-          </w:rPr>
-          <w:t>Building a Map of the Environment Using SLAM – ROS 2 Jazzy</w:t>
-        </w:r>
-      </w:hyperlink>
-    </w:p>
-    <w:p>
-      <w:hyperlink r:id="rId9" w:history="1">
-        <w:r>
-          <w:rPr>
-            <w:rStyle w:val="Hyperlink"/>
-          </w:rPr>
-          <w:t>How to Install ROS 2 Navigation (Nav2) – ROS 2 Jazzy</w:t>
-        </w:r>
-      </w:hyperlink>
-    </w:p>
-    <w:p>
-      <w:hyperlink r:id="rId10" w:history="1">
-        <w:r>
-          <w:rPr>
-            <w:rStyle w:val="Hyperlink"/>
-          </w:rPr>
-          <w:t>How to Simulate a Mobile Robot in Gazebo – ROS 2 Jazzy</w:t>
-        </w:r>
-      </w:hyperlink>
-    </w:p>
-    <w:p>
-      <w:hyperlink r:id="rId11" w:history="1">
-        <w:r>
-          <w:rPr>
-            <w:rStyle w:val="Hyperlink"/>
-          </w:rPr>
-          <w:t>Sensor Fusion and Robot Localization Using ROS 2 Jazzy</w:t>
-        </w:r>
-      </w:hyperlink>
-    </w:p>
-    <w:p>
-      <w:hyperlink r:id="rId12" w:history="1">
-        <w:r>
-          <w:rPr>
-            <w:rStyle w:val="Hyperlink"/>
-          </w:rPr>
-          <w:t>Create and Visualize a Mobile Robot with URDF – ROS 2 Jazzy</w:t>
-        </w:r>
-      </w:hyperlink>
-    </w:p>
-    <w:p>
-      <w:hyperlink r:id="rId13" w:history="1">
-        <w:r>
-          <w:rPr>
-            <w:rStyle w:val="Hyperlink"/>
-          </w:rPr>
-          <w:t>ROS2 SLAM Tutorial: Master Simultaneous Localization and Mapping for A – ThinkRobotics.com</w:t>
-        </w:r>
-      </w:hyperlink>
-    </w:p>
-    <w:p>
-      <w:hyperlink r:id="rId14" w:history="1">
-        <w:r>
-          <w:rPr>
-            <w:rStyle w:val="Hyperlink"/>
-          </w:rPr>
-          <w:t>Setting Up the ROS Navigation Stack for a Simulated Robot</w:t>
-        </w:r>
-      </w:hyperlink>
-    </w:p>
-    <w:p>
-      <w:hyperlink r:id="rId15" w:history="1">
-        <w:r>
-          <w:rPr>
-            <w:rStyle w:val="Hyperlink"/>
-          </w:rPr>
-          <w:t>Getting Started With Gazebo in ROS Noetic</w:t>
-        </w:r>
-      </w:hyperlink>
-    </w:p>
-    <w:p>
-      <w:hyperlink r:id="rId16" w:history="1">
-        <w:r>
-          <w:rPr>
-            <w:rStyle w:val="Hyperlink"/>
-          </w:rPr>
-          <w:t>ROS Navigation — RISC-Docs 0.1 documentation</w:t>
-        </w:r>
-      </w:hyperlink>
-    </w:p>
-    <w:p>
-      <w:hyperlink r:id="rId17" w:history="1">
-        <w:r>
-          <w:rPr>
-            <w:rStyle w:val="Hyperlink"/>
-          </w:rPr>
-          <w:t xml:space="preserve">ROS2 Navigation Stack Tutorial: A Complete Beginner's Guide to </w:t>
-        </w:r>
-        <w:proofErr w:type="spellStart"/>
-        <w:r>
-          <w:rPr>
-            <w:rStyle w:val="Hyperlink"/>
-          </w:rPr>
-          <w:t>Autonom</w:t>
-        </w:r>
-        <w:proofErr w:type="spellEnd"/>
-        <w:r>
-          <w:rPr>
-            <w:rStyle w:val="Hyperlink"/>
-          </w:rPr>
-          <w:t xml:space="preserve"> – ThinkRobotics.com</w:t>
-        </w:r>
-      </w:hyperlink>
-    </w:p>
-    <w:p>
-      <w:hyperlink r:id="rId18" w:history="1">
-        <w:r>
-          <w:rPr>
-            <w:rStyle w:val="Hyperlink"/>
-          </w:rPr>
-          <w:t>Master ROS2 Nav2: Essential Path Planning for Robots</w:t>
-        </w:r>
-      </w:hyperlink>
-    </w:p>
-    <w:p>
-      <w:hyperlink r:id="rId19" w:history="1">
-        <w:r>
-          <w:rPr>
-            <w:rStyle w:val="Hyperlink"/>
-          </w:rPr>
-          <w:t xml:space="preserve">The Complete Beginner’s Guide to Docker for ROS 2 Deployment (2025) | </w:t>
-        </w:r>
-        <w:proofErr w:type="spellStart"/>
-        <w:r>
-          <w:rPr>
-            <w:rStyle w:val="Hyperlink"/>
-          </w:rPr>
-          <w:t>Robotair</w:t>
-        </w:r>
-        <w:proofErr w:type="spellEnd"/>
-      </w:hyperlink>
-    </w:p>
-    <w:p/>
+        <w:t>Structure-from-Motion</w:t>
+      </w:r>
+      <w:r>
+        <w:t xml:space="preserve"> – </w:t>
+      </w:r>
+      <w:r>
+        <w:t>is the process of reconstructing 3D structure from its projections into a series of images</w:t>
+      </w:r>
+      <w:r>
+        <w:t xml:space="preserve">. </w:t>
+      </w:r>
+      <w:r>
+        <w:t xml:space="preserve">The </w:t>
+      </w:r>
+      <w:r>
+        <w:t>result</w:t>
+      </w:r>
+      <w:r>
+        <w:t xml:space="preserve"> is a 3-D reconstruction of the object, and the reconstructed intrinsic and extrinsic camera parameters of all images.</w:t>
+      </w:r>
+    </w:p>
+    <w:p>
+      <w:r>
+        <w:t>Multi-View Stereo</w:t>
+      </w:r>
+      <w:r>
+        <w:t xml:space="preserve"> – is a </w:t>
+      </w:r>
+      <w:r>
+        <w:t>computer vision technique used to reconstruct dense 3D models of a scene from multiple 2D images taken from different viewpoints</w:t>
+      </w:r>
+      <w:r>
+        <w:t>.</w:t>
+      </w:r>
+    </w:p>
+    <w:p>
+      <w:r>
+        <w:t>O</w:t>
+      </w:r>
+      <w:r>
+        <w:t>dometry</w:t>
+      </w:r>
+      <w:r>
+        <w:t xml:space="preserve"> - </w:t>
+      </w:r>
+      <w:r>
+        <w:t>a technique used to estimate the change in position of a robot over time by utilizing data from motion sensors</w:t>
+      </w:r>
+      <w:r>
+        <w:t>.</w:t>
+      </w:r>
+    </w:p>
+    <w:p>
+      <w:proofErr w:type="spellStart"/>
+      <w:r>
+        <w:t>Groundtruth</w:t>
+      </w:r>
+      <w:proofErr w:type="spellEnd"/>
+      <w:r>
+        <w:t xml:space="preserve"> - </w:t>
+      </w:r>
+      <w:r>
+        <w:t xml:space="preserve">information known to be true or real, obtained through direct observation or measurement, often used as a reference standard in data validation and </w:t>
+      </w:r>
+      <w:r>
+        <w:t xml:space="preserve">modelling. </w:t>
+      </w:r>
+    </w:p>
+    <w:p>
+      <w:r>
+        <w:t>M</w:t>
+      </w:r>
+      <w:r>
+        <w:t>onocular</w:t>
+      </w:r>
+      <w:r>
+        <w:t xml:space="preserve"> mapping – utilizes a single camera to create a 3D representation of a space.</w:t>
+      </w:r>
+    </w:p>
+    <w:p>
+      <w:r>
+        <w:t>S</w:t>
+      </w:r>
+      <w:r>
+        <w:t>tereo camera</w:t>
+      </w:r>
+      <w:r>
+        <w:t xml:space="preserve"> – </w:t>
+      </w:r>
+      <w:r>
+        <w:t>is a camera system with two or more lenses that captures images from slightly different angles</w:t>
+      </w:r>
+      <w:r>
+        <w:t>, that still overlap,</w:t>
+      </w:r>
+      <w:r>
+        <w:t xml:space="preserve"> to create three-dimensional (3D) images and depth perception</w:t>
+      </w:r>
+      <w:r>
+        <w:t>.</w:t>
+      </w:r>
+    </w:p>
     <w:sectPr>
-      <w:footerReference w:type="default" r:id="rId20"/>
+      <w:footerReference w:type="default" r:id="rId11"/>
       <w:pgSz w:w="11906" w:h="16838"/>
       <w:pgMar w:top="1417" w:right="1417" w:bottom="1417" w:left="1417" w:header="708" w:footer="708" w:gutter="0"/>
       <w:pgNumType w:start="0"/>
@@ -3495,6 +4990,95 @@
     </w:lvl>
   </w:abstractNum>
   <w:abstractNum w:abstractNumId="7" w15:restartNumberingAfterBreak="0">
+    <w:nsid w:val="37C547B6"/>
+    <w:multiLevelType w:val="hybridMultilevel"/>
+    <w:tmpl w:val="282C7B66"/>
+    <w:lvl w:ilvl="0" w:tplc="E392E34A">
+      <w:start w:val="6"/>
+      <w:numFmt w:val="decimal"/>
+      <w:lvlText w:val="%1"/>
+      <w:lvlJc w:val="left"/>
+      <w:pPr>
+        <w:ind w:left="360" w:hanging="360"/>
+      </w:pPr>
+      <w:rPr>
+        <w:rFonts w:hint="default"/>
+      </w:rPr>
+    </w:lvl>
+    <w:lvl w:ilvl="1" w:tplc="08090019" w:tentative="1">
+      <w:start w:val="1"/>
+      <w:numFmt w:val="lowerLetter"/>
+      <w:lvlText w:val="%2."/>
+      <w:lvlJc w:val="left"/>
+      <w:pPr>
+        <w:ind w:left="1080" w:hanging="360"/>
+      </w:pPr>
+    </w:lvl>
+    <w:lvl w:ilvl="2" w:tplc="0809001B" w:tentative="1">
+      <w:start w:val="1"/>
+      <w:numFmt w:val="lowerRoman"/>
+      <w:lvlText w:val="%3."/>
+      <w:lvlJc w:val="right"/>
+      <w:pPr>
+        <w:ind w:left="1800" w:hanging="180"/>
+      </w:pPr>
+    </w:lvl>
+    <w:lvl w:ilvl="3" w:tplc="0809000F" w:tentative="1">
+      <w:start w:val="1"/>
+      <w:numFmt w:val="decimal"/>
+      <w:lvlText w:val="%4."/>
+      <w:lvlJc w:val="left"/>
+      <w:pPr>
+        <w:ind w:left="2520" w:hanging="360"/>
+      </w:pPr>
+    </w:lvl>
+    <w:lvl w:ilvl="4" w:tplc="08090019" w:tentative="1">
+      <w:start w:val="1"/>
+      <w:numFmt w:val="lowerLetter"/>
+      <w:lvlText w:val="%5."/>
+      <w:lvlJc w:val="left"/>
+      <w:pPr>
+        <w:ind w:left="3240" w:hanging="360"/>
+      </w:pPr>
+    </w:lvl>
+    <w:lvl w:ilvl="5" w:tplc="0809001B" w:tentative="1">
+      <w:start w:val="1"/>
+      <w:numFmt w:val="lowerRoman"/>
+      <w:lvlText w:val="%6."/>
+      <w:lvlJc w:val="right"/>
+      <w:pPr>
+        <w:ind w:left="3960" w:hanging="180"/>
+      </w:pPr>
+    </w:lvl>
+    <w:lvl w:ilvl="6" w:tplc="0809000F" w:tentative="1">
+      <w:start w:val="1"/>
+      <w:numFmt w:val="decimal"/>
+      <w:lvlText w:val="%7."/>
+      <w:lvlJc w:val="left"/>
+      <w:pPr>
+        <w:ind w:left="4680" w:hanging="360"/>
+      </w:pPr>
+    </w:lvl>
+    <w:lvl w:ilvl="7" w:tplc="08090019" w:tentative="1">
+      <w:start w:val="1"/>
+      <w:numFmt w:val="lowerLetter"/>
+      <w:lvlText w:val="%8."/>
+      <w:lvlJc w:val="left"/>
+      <w:pPr>
+        <w:ind w:left="5400" w:hanging="360"/>
+      </w:pPr>
+    </w:lvl>
+    <w:lvl w:ilvl="8" w:tplc="0809001B" w:tentative="1">
+      <w:start w:val="1"/>
+      <w:numFmt w:val="lowerRoman"/>
+      <w:lvlText w:val="%9."/>
+      <w:lvlJc w:val="right"/>
+      <w:pPr>
+        <w:ind w:left="6120" w:hanging="180"/>
+      </w:pPr>
+    </w:lvl>
+  </w:abstractNum>
+  <w:abstractNum w:abstractNumId="8" w15:restartNumberingAfterBreak="0">
     <w:nsid w:val="39396E41"/>
     <w:multiLevelType w:val="hybridMultilevel"/>
     <w:tmpl w:val="F6CA6BD4"/>
@@ -3607,7 +5191,7 @@
       </w:rPr>
     </w:lvl>
   </w:abstractNum>
-  <w:abstractNum w:abstractNumId="8" w15:restartNumberingAfterBreak="0">
+  <w:abstractNum w:abstractNumId="9" w15:restartNumberingAfterBreak="0">
     <w:nsid w:val="42905FFE"/>
     <w:multiLevelType w:val="multilevel"/>
     <w:tmpl w:val="2000001F"/>
@@ -3693,7 +5277,7 @@
       </w:pPr>
     </w:lvl>
   </w:abstractNum>
-  <w:abstractNum w:abstractNumId="9" w15:restartNumberingAfterBreak="0">
+  <w:abstractNum w:abstractNumId="10" w15:restartNumberingAfterBreak="0">
     <w:nsid w:val="4DC954C7"/>
     <w:multiLevelType w:val="multilevel"/>
     <w:tmpl w:val="2000001F"/>
@@ -3779,7 +5363,7 @@
       </w:pPr>
     </w:lvl>
   </w:abstractNum>
-  <w:abstractNum w:abstractNumId="10" w15:restartNumberingAfterBreak="0">
+  <w:abstractNum w:abstractNumId="11" w15:restartNumberingAfterBreak="0">
     <w:nsid w:val="4E100F67"/>
     <w:multiLevelType w:val="multilevel"/>
     <w:tmpl w:val="22E62BB0"/>
@@ -3892,7 +5476,7 @@
       </w:rPr>
     </w:lvl>
   </w:abstractNum>
-  <w:abstractNum w:abstractNumId="11" w15:restartNumberingAfterBreak="0">
+  <w:abstractNum w:abstractNumId="12" w15:restartNumberingAfterBreak="0">
     <w:nsid w:val="4FD27B9C"/>
     <w:multiLevelType w:val="multilevel"/>
     <w:tmpl w:val="22E62BB0"/>
@@ -4005,7 +5589,7 @@
       </w:rPr>
     </w:lvl>
   </w:abstractNum>
-  <w:abstractNum w:abstractNumId="12" w15:restartNumberingAfterBreak="0">
+  <w:abstractNum w:abstractNumId="13" w15:restartNumberingAfterBreak="0">
     <w:nsid w:val="5A204BFE"/>
     <w:multiLevelType w:val="hybridMultilevel"/>
     <w:tmpl w:val="F514CB20"/>
@@ -4094,7 +5678,7 @@
       </w:pPr>
     </w:lvl>
   </w:abstractNum>
-  <w:abstractNum w:abstractNumId="13" w15:restartNumberingAfterBreak="0">
+  <w:abstractNum w:abstractNumId="14" w15:restartNumberingAfterBreak="0">
     <w:nsid w:val="775F5B72"/>
     <w:multiLevelType w:val="hybridMultilevel"/>
     <w:tmpl w:val="2D522C50"/>
@@ -4207,28 +5791,28 @@
     </w:lvl>
   </w:abstractNum>
   <w:num w:numId="1" w16cid:durableId="1457092870">
-    <w:abstractNumId w:val="7"/>
+    <w:abstractNumId w:val="8"/>
   </w:num>
   <w:num w:numId="2" w16cid:durableId="1027096720">
     <w:abstractNumId w:val="3"/>
   </w:num>
   <w:num w:numId="3" w16cid:durableId="863058726">
-    <w:abstractNumId w:val="13"/>
+    <w:abstractNumId w:val="14"/>
   </w:num>
   <w:num w:numId="4" w16cid:durableId="10106412">
     <w:abstractNumId w:val="6"/>
   </w:num>
   <w:num w:numId="5" w16cid:durableId="1723869775">
-    <w:abstractNumId w:val="9"/>
+    <w:abstractNumId w:val="10"/>
   </w:num>
   <w:num w:numId="6" w16cid:durableId="759521961">
-    <w:abstractNumId w:val="8"/>
+    <w:abstractNumId w:val="9"/>
   </w:num>
   <w:num w:numId="7" w16cid:durableId="630405093">
     <w:abstractNumId w:val="0"/>
   </w:num>
   <w:num w:numId="8" w16cid:durableId="441802152">
-    <w:abstractNumId w:val="11"/>
+    <w:abstractNumId w:val="12"/>
   </w:num>
   <w:num w:numId="9" w16cid:durableId="736322139">
     <w:abstractNumId w:val="1"/>
@@ -4240,13 +5824,16 @@
     <w:abstractNumId w:val="4"/>
   </w:num>
   <w:num w:numId="12" w16cid:durableId="170875065">
-    <w:abstractNumId w:val="12"/>
+    <w:abstractNumId w:val="13"/>
   </w:num>
   <w:num w:numId="13" w16cid:durableId="873470130">
     <w:abstractNumId w:val="5"/>
   </w:num>
   <w:num w:numId="14" w16cid:durableId="328294795">
-    <w:abstractNumId w:val="10"/>
+    <w:abstractNumId w:val="11"/>
+  </w:num>
+  <w:num w:numId="15" w16cid:durableId="1197506341">
+    <w:abstractNumId w:val="7"/>
   </w:num>
 </w:numbering>
 </file>
@@ -4705,7 +6292,6 @@
     <w:next w:val="Normal"/>
     <w:link w:val="Heading3Char"/>
     <w:uiPriority w:val="9"/>
-    <w:semiHidden/>
     <w:unhideWhenUsed/>
     <w:qFormat/>
     <w:rsid w:val="005D05FF"/>
@@ -4728,7 +6314,6 @@
     <w:next w:val="Normal"/>
     <w:link w:val="Heading4Char"/>
     <w:uiPriority w:val="9"/>
-    <w:semiHidden/>
     <w:unhideWhenUsed/>
     <w:qFormat/>
     <w:rsid w:val="005D05FF"/>
@@ -4857,7 +6442,6 @@
   <w:style w:type="character" w:default="1" w:styleId="DefaultParagraphFont">
     <w:name w:val="Default Paragraph Font"/>
     <w:uiPriority w:val="1"/>
-    <w:semiHidden/>
     <w:unhideWhenUsed/>
   </w:style>
   <w:style w:type="table" w:default="1" w:styleId="TableNormal">
@@ -4912,7 +6496,6 @@
     <w:basedOn w:val="DefaultParagraphFont"/>
     <w:link w:val="Heading3"/>
     <w:uiPriority w:val="9"/>
-    <w:semiHidden/>
     <w:rsid w:val="005D05FF"/>
     <w:rPr>
       <w:rFonts w:eastAsiaTheme="majorEastAsia" w:cstheme="majorBidi"/>
@@ -4926,7 +6509,6 @@
     <w:basedOn w:val="DefaultParagraphFont"/>
     <w:link w:val="Heading4"/>
     <w:uiPriority w:val="9"/>
-    <w:semiHidden/>
     <w:rsid w:val="005D05FF"/>
     <w:rPr>
       <w:rFonts w:eastAsiaTheme="majorEastAsia" w:cstheme="majorBidi"/>
@@ -5389,6 +6971,56 @@
       <w:ind w:left="220"/>
     </w:pPr>
   </w:style>
+  <w:style w:type="character" w:styleId="FollowedHyperlink">
+    <w:name w:val="FollowedHyperlink"/>
+    <w:basedOn w:val="DefaultParagraphFont"/>
+    <w:uiPriority w:val="99"/>
+    <w:semiHidden/>
+    <w:unhideWhenUsed/>
+    <w:rsid w:val="00CF7D5E"/>
+    <w:rPr>
+      <w:color w:val="96607D" w:themeColor="followedHyperlink"/>
+      <w:u w:val="single"/>
+    </w:rPr>
+  </w:style>
+  <w:style w:type="character" w:styleId="SubtleEmphasis">
+    <w:name w:val="Subtle Emphasis"/>
+    <w:basedOn w:val="DefaultParagraphFont"/>
+    <w:uiPriority w:val="19"/>
+    <w:qFormat/>
+    <w:rsid w:val="004564E1"/>
+    <w:rPr>
+      <w:i/>
+      <w:iCs/>
+      <w:color w:val="404040" w:themeColor="text1" w:themeTint="BF"/>
+    </w:rPr>
+  </w:style>
+  <w:style w:type="character" w:styleId="SubtleReference">
+    <w:name w:val="Subtle Reference"/>
+    <w:basedOn w:val="DefaultParagraphFont"/>
+    <w:uiPriority w:val="31"/>
+    <w:qFormat/>
+    <w:rsid w:val="004564E1"/>
+    <w:rPr>
+      <w:smallCaps/>
+      <w:color w:val="5A5A5A" w:themeColor="text1" w:themeTint="A5"/>
+    </w:rPr>
+  </w:style>
+  <w:style w:type="paragraph" w:styleId="Bibliography">
+    <w:name w:val="Bibliography"/>
+    <w:basedOn w:val="Normal"/>
+    <w:next w:val="Normal"/>
+    <w:uiPriority w:val="37"/>
+    <w:unhideWhenUsed/>
+    <w:rsid w:val="00D60CFE"/>
+    <w:pPr>
+      <w:tabs>
+        <w:tab w:val="left" w:pos="384"/>
+      </w:tabs>
+      <w:spacing w:after="0" w:line="240" w:lineRule="auto"/>
+      <w:ind w:left="384" w:hanging="384"/>
+    </w:pPr>
+  </w:style>
 </w:styles>
 </file>
 

</xml_diff>